<commit_message>
Acilis sozleri: 69 duzenlenmis cumle, 5 sn, tekrar onleyen rotasyon
Word'deki 74 cumle duzenlendi (yazim/noktalama duzeltildi, uzunlar bolundu, tekrar/anlamsizlar ayiklandi, oz korundu) -> 69 temiz cumle. Word de guncellendi (otomatik okuma duzeni korunur). Splash 15sn->5sn, son 15 cumleyi tekrarlamayan rotasyon. v102.

Co-Authored-By: Claude Opus 4.8 <noreply@anthropic.com>
</commit_message>
<xml_diff>
--- a/Açılış cümlelerim/Açılış cümleleri.docx
+++ b/Açılış cümlelerim/Açılış cümleleri.docx
@@ -1,385 +1,469 @@
 
-<file path=word/document.xml><?xml version="1.0" encoding="utf-8"?>
-<w:document xmlns:wpc="http://schemas.microsoft.com/office/word/2010/wordprocessingCanvas" xmlns:cx="http://schemas.microsoft.com/office/drawing/2014/chartex" xmlns:cx1="http://schemas.microsoft.com/office/drawing/2015/9/8/chartex" xmlns:cx2="http://schemas.microsoft.com/office/drawing/2015/10/21/chartex" xmlns:cx3="http://schemas.microsoft.com/office/drawing/2016/5/9/chartex" xmlns:cx4="http://schemas.microsoft.com/office/drawing/2016/5/10/chartex" xmlns:cx5="http://schemas.microsoft.com/office/drawing/2016/5/11/chartex" xmlns:cx6="http://schemas.microsoft.com/office/drawing/2016/5/12/chartex" xmlns:cx7="http://schemas.microsoft.com/office/drawing/2016/5/13/chartex" xmlns:cx8="http://schemas.microsoft.com/office/drawing/2016/5/14/chartex" xmlns:mc="http://schemas.openxmlformats.org/markup-compatibility/2006" xmlns:aink="http://schemas.microsoft.com/office/drawing/2016/ink" xmlns:am3d="http://schemas.microsoft.com/office/drawing/2017/model3d" xmlns:o="urn:schemas-microsoft-com:office:office" xmlns:oel="http://schemas.microsoft.com/office/2019/extlst" xmlns:r="http://schemas.openxmlformats.org/officeDocument/2006/relationships" xmlns:m="http://schemas.openxmlformats.org/officeDocument/2006/math" xmlns:v="urn:schemas-microsoft-com:vml" xmlns:wp14="http://schemas.microsoft.com/office/word/2010/wordprocessingDrawing" xmlns:wp="http://schemas.openxmlformats.org/drawingml/2006/wordprocessingDrawing" xmlns:w10="urn:schemas-microsoft-com:office:word" xmlns:w="http://schemas.openxmlformats.org/wordprocessingml/2006/main" xmlns:w14="http://schemas.microsoft.com/office/word/2010/wordml" xmlns:w15="http://schemas.microsoft.com/office/word/2012/wordml" xmlns:w16cex="http://schemas.microsoft.com/office/word/2018/wordml/cex" xmlns:w16cid="http://schemas.microsoft.com/office/word/2016/wordml/cid" xmlns:w16="http://schemas.microsoft.com/office/word/2018/wordml" xmlns:w16du="http://schemas.microsoft.com/office/word/2023/wordml/word16du" xmlns:w16sdtdh="http://schemas.microsoft.com/office/word/2020/wordml/sdtdatahash" xmlns:w16sdtfl="http://schemas.microsoft.com/office/word/2024/wordml/sdtformatlock" xmlns:w16se="http://schemas.microsoft.com/office/word/2015/wordml/symex" xmlns:wpg="http://schemas.microsoft.com/office/word/2010/wordprocessingGroup" xmlns:wpi="http://schemas.microsoft.com/office/word/2010/wordprocessingInk" xmlns:wne="http://schemas.microsoft.com/office/word/2006/wordml" xmlns:wps="http://schemas.microsoft.com/office/word/2010/wordprocessingShape" mc:Ignorable="w14 w15 w16se w16cid w16 w16cex w16sdtdh w16sdtfl w16du wp14">
+<file path=docProps\app.xml><?xml version="1.0" encoding="utf-8"?>
+<Properties xmlns="http://schemas.openxmlformats.org/officeDocument/2006/extended-properties" xmlns:vt="http://schemas.openxmlformats.org/officeDocument/2006/docPropsVTypes">
+  <Template>Normal</Template>
+  <TotalTime>42</TotalTime>
+  <Pages>4</Pages>
+  <Words>1094</Words>
+  <Characters>6238</Characters>
+  <Application>Microsoft Office Word</Application>
+  <DocSecurity>0</DocSecurity>
+  <Lines>51</Lines>
+  <Paragraphs>14</Paragraphs>
+  <ScaleCrop>false</ScaleCrop>
+  <HeadingPairs>
+    <vt:vector size="2" baseType="variant">
+      <vt:variant>
+        <vt:lpstr>Konu Başlığı</vt:lpstr>
+      </vt:variant>
+      <vt:variant>
+        <vt:i4>1</vt:i4>
+      </vt:variant>
+    </vt:vector>
+  </HeadingPairs>
+  <TitlesOfParts>
+    <vt:vector size="1" baseType="lpstr">
+      <vt:lpstr/>
+    </vt:vector>
+  </TitlesOfParts>
+  <Company/>
+  <LinksUpToDate>false</LinksUpToDate>
+  <CharactersWithSpaces>7318</CharactersWithSpaces>
+  <SharedDoc>false</SharedDoc>
+  <HyperlinksChanged>false</HyperlinksChanged>
+  <AppVersion>16.0000</AppVersion>
+</Properties>
+</file>
+
+<file path=docProps\core.xml><?xml version="1.0" encoding="utf-8"?>
+<cp:coreProperties xmlns:cp="http://schemas.openxmlformats.org/package/2006/metadata/core-properties" xmlns:dc="http://purl.org/dc/elements/1.1/" xmlns:dcterms="http://purl.org/dc/terms/" xmlns:dcmitype="http://purl.org/dc/dcmitype/" xmlns:xsi="http://www.w3.org/2001/XMLSchema-instance">
+  <dc:title/>
+  <dc:subject/>
+  <dc:creator>Hulya Durgut</dc:creator>
+  <cp:keywords/>
+  <dc:description/>
+  <cp:lastModifiedBy>Hulya Durgut</cp:lastModifiedBy>
+  <cp:revision>7</cp:revision>
+  <dcterms:created xsi:type="dcterms:W3CDTF">2026-06-06T03:56:00Z</dcterms:created>
+  <dcterms:modified xsi:type="dcterms:W3CDTF">2026-06-12T08:48:00Z</dcterms:modified>
+</cp:coreProperties>
+</file>
+
+<file path=word\document.xml><?xml version="1.0" encoding="utf-8"?>
+<w:document xmlns:w="http://schemas.openxmlformats.org/wordprocessingml/2006/main">
   <w:body>
     <w:p>
       <w:r>
-        <w:t>"Dışa bakan rüya görür, içe bakan uyanır."</w:t>
-      </w:r>
-    </w:p>
-    <w:p>
-      <w:r>
-        <w:t>"Bilinçaltınızı bilince dönüştürene kadar, o sizin hayatınızı yönlendirir ve siz buna kader dersiniz."</w:t>
-      </w:r>
-    </w:p>
-    <w:p>
-      <w:r>
-        <w:t xml:space="preserve"> "Kendiniz olmak, dünyadaki en büyük ve en cesurca eylemdir."</w:t>
-      </w:r>
-    </w:p>
-    <w:p>
-      <w:r>
-        <w:t>"Başıma gelen şeylerin toplamı değilim; ben olmayı seçtiğim kişiyim."</w:t>
-      </w:r>
-    </w:p>
-    <w:p>
-      <w:r>
-        <w:t>"Kabul etmediğimiz hiçbir şeyi değiştiremeyiz; reddetmek özgürleştirmez, zincirler."</w:t>
-      </w:r>
-    </w:p>
-    <w:p>
-      <w:r>
-        <w:t>"Işığı hayal ederek değil, karanlığın farkına vararak aydınlanabiliriz."</w:t>
-      </w:r>
-    </w:p>
-    <w:p>
-      <w:r>
-        <w:t>"En büyük trajediler, yaşanmamış bir hayatın ağırlığı altında ezilmektir."</w:t>
-      </w:r>
-    </w:p>
-    <w:p>
-      <w:r>
-        <w:t>"Kendinizle yüzleşmek, başkalarıyla yüzleşmekten çok daha zordur ama tek gerçek özgürlük budur."</w:t>
-      </w:r>
-    </w:p>
-    <w:p>
-      <w:r>
-        <w:t>"Dünya, senin kendin olmana izin vermeyen bir kalabalıkla doludur; orada dik durmak en büyük zaferdir."</w:t>
-      </w:r>
-    </w:p>
-    <w:p>
-      <w:r>
-        <w:t>"Görünüşünüz, ancak kalbinizin içine bakabildiğinizde berraklaşır."</w:t>
-      </w:r>
-    </w:p>
-    <w:p>
-      <w:r>
-        <w:t>"Kendine dürüst olmak, bir insanın atabileceği en sancılı ama en özgürleştirici adımdır."</w:t>
-      </w:r>
-    </w:p>
-    <w:p>
-      <w:pPr>
-        <w:pStyle w:val="z1qcye"/>
-        <w:spacing w:before="0" w:beforeAutospacing="0" w:after="0" w:afterAutospacing="0"/>
-        <w:rPr>
-          <w:rFonts w:ascii="Arial" w:hAnsi="Arial" w:cs="Arial"/>
-        </w:rPr>
-      </w:pPr>
-      <w:r>
-        <w:rPr>
-          <w:rStyle w:val="t286pc"/>
-          <w:rFonts w:ascii="Arial" w:eastAsiaTheme="majorEastAsia" w:hAnsi="Arial" w:cs="Arial"/>
-        </w:rPr>
-        <w:t>"Başkalarında bizi rahatsız eden her şey, kendimizi tanımamıza yol açar."</w:t>
-      </w:r>
-    </w:p>
-    <w:p>
-      <w:pPr>
-        <w:pStyle w:val="z1qcye"/>
-        <w:spacing w:before="0" w:beforeAutospacing="0" w:after="0" w:afterAutospacing="0"/>
-        <w:rPr>
-          <w:rFonts w:ascii="Arial" w:hAnsi="Arial" w:cs="Arial"/>
-        </w:rPr>
-      </w:pPr>
-      <w:r>
-        <w:rPr>
-          <w:rStyle w:val="t286pc"/>
-          <w:rFonts w:ascii="Arial" w:eastAsiaTheme="majorEastAsia" w:hAnsi="Arial" w:cs="Arial"/>
-        </w:rPr>
-        <w:t>"İki kişiliğin karşılaşması, iki kimyasal maddenin temasına benzer; bir reaksiyon varsa ikisi de dönüşür."</w:t>
-      </w:r>
-    </w:p>
-    <w:p>
-      <w:pPr>
-        <w:pStyle w:val="z1qcye"/>
-        <w:spacing w:before="0" w:beforeAutospacing="0" w:after="0" w:afterAutospacing="0"/>
-        <w:rPr>
-          <w:rFonts w:ascii="Arial" w:hAnsi="Arial" w:cs="Arial"/>
-        </w:rPr>
-      </w:pPr>
-      <w:r>
-        <w:rPr>
-          <w:rStyle w:val="t286pc"/>
-          <w:rFonts w:ascii="Arial" w:eastAsiaTheme="majorEastAsia" w:hAnsi="Arial" w:cs="Arial"/>
-        </w:rPr>
-        <w:t>"Kendi içinizdeki çatışmayı çözmediğinizde, dünya bunu size dışsal bir savaş olarak sunar."</w:t>
-      </w:r>
-    </w:p>
-    <w:p>
-      <w:pPr>
-        <w:spacing w:after="0" w:line="240" w:lineRule="auto"/>
-        <w:rPr>
-          <w:rFonts w:ascii="Times New Roman" w:eastAsia="Times New Roman" w:hAnsi="Times New Roman" w:cs="Times New Roman"/>
-          <w:kern w:val="0"/>
-          <w:lang w:eastAsia="tr-TR"/>
-          <w14:ligatures w14:val="none"/>
-        </w:rPr>
-      </w:pPr>
-      <w:r>
-        <w:rPr>
-          <w:rFonts w:ascii="Arial" w:eastAsia="Times New Roman" w:hAnsi="Arial" w:cs="Arial"/>
-          <w:kern w:val="0"/>
-          <w:lang w:eastAsia="tr-TR"/>
-          <w14:ligatures w14:val="none"/>
-        </w:rPr>
-        <w:t>"Hayatın her dönemi, kendi benzersiz gerçeğini ve bilgeliğini içinde barındırır."</w:t>
-      </w:r>
-    </w:p>
-    <w:p>
-      <w:pPr>
-        <w:spacing w:after="0" w:line="240" w:lineRule="auto"/>
-        <w:rPr>
-          <w:rFonts w:ascii="Times New Roman" w:eastAsia="Times New Roman" w:hAnsi="Times New Roman" w:cs="Times New Roman"/>
-          <w:kern w:val="0"/>
-          <w:lang w:eastAsia="tr-TR"/>
-          <w14:ligatures w14:val="none"/>
-        </w:rPr>
-      </w:pPr>
-      <w:r>
-        <w:rPr>
-          <w:rFonts w:ascii="Arial" w:eastAsia="Times New Roman" w:hAnsi="Arial" w:cs="Arial"/>
-          <w:kern w:val="0"/>
-          <w:lang w:eastAsia="tr-TR"/>
-          <w14:ligatures w14:val="none"/>
-        </w:rPr>
-        <w:t>"Acı, bilincin uyanması için ödenen zorunlu bir bedeldir."</w:t>
-      </w:r>
-    </w:p>
-    <w:p>
-      <w:pPr>
-        <w:rPr>
-          <w:rFonts w:ascii="Arial" w:eastAsia="Times New Roman" w:hAnsi="Arial" w:cs="Arial"/>
-          <w:kern w:val="0"/>
-          <w:lang w:eastAsia="tr-TR"/>
-          <w14:ligatures w14:val="none"/>
-        </w:rPr>
-      </w:pPr>
-      <w:r>
-        <w:rPr>
-          <w:rFonts w:ascii="Arial" w:eastAsia="Times New Roman" w:hAnsi="Arial" w:cs="Arial"/>
-          <w:kern w:val="0"/>
-          <w:lang w:eastAsia="tr-TR"/>
-          <w14:ligatures w14:val="none"/>
-        </w:rPr>
-        <w:t>"Zihninizdeki fırtınayı durduramazsınız; yapabileceğiniz tek şey onun içinden geçecek cesareti bulmaktır."</w:t>
-      </w:r>
-    </w:p>
-    <w:p>
-      <w:r>
-        <w:t>"Direnç gösterdiğin şey, varlığını sürdürmeye devam eder."</w:t>
-      </w:r>
-    </w:p>
-    <w:p>
-      <w:r>
-        <w:t>"Depresyon siyahlar giymiş bir kadın gibidir; onu kapıdan kovmak yerine içeri davet edin ve ne söylemek istediğini dinleyin."</w:t>
-      </w:r>
-    </w:p>
-    <w:p>
-      <w:r>
-        <w:t>"Kendi karanlığınızı tanımak, başkalarının karanlığıyla baş etmenin en iyi yoludur."</w:t>
-      </w:r>
-    </w:p>
-    <w:p>
-      <w:pPr>
-        <w:pStyle w:val="z1qcye"/>
-        <w:spacing w:before="0" w:beforeAutospacing="0" w:after="0" w:afterAutospacing="0"/>
-        <w:rPr>
-          <w:rFonts w:ascii="Arial" w:hAnsi="Arial" w:cs="Arial"/>
-        </w:rPr>
-      </w:pPr>
-      <w:r>
-        <w:rPr>
-          <w:rStyle w:val="t286pc"/>
-          <w:rFonts w:ascii="Arial" w:eastAsiaTheme="majorEastAsia" w:hAnsi="Arial" w:cs="Arial"/>
-        </w:rPr>
-        <w:t>"Ellerin yaratıcılığı, zihnin çözemediği düğümleri çoğu zaman çözer."</w:t>
-      </w:r>
-    </w:p>
-    <w:p>
-      <w:pPr>
-        <w:pStyle w:val="z1qcye"/>
-        <w:spacing w:before="0" w:beforeAutospacing="0" w:after="0" w:afterAutospacing="0"/>
-        <w:rPr>
-          <w:rFonts w:ascii="Arial" w:hAnsi="Arial" w:cs="Arial"/>
-        </w:rPr>
-      </w:pPr>
-      <w:r>
-        <w:rPr>
-          <w:rStyle w:val="t286pc"/>
-          <w:rFonts w:ascii="Arial" w:eastAsiaTheme="majorEastAsia" w:hAnsi="Arial" w:cs="Arial"/>
-        </w:rPr>
-        <w:t>"Sadece entelektüel olarak anlamak yetmez; bir gerçeği ancak tüm varlığınızla hissettiğinizde yaşayabilirsiniz."</w:t>
-      </w:r>
-    </w:p>
-    <w:p>
-      <w:pPr>
-        <w:pStyle w:val="z1qcye"/>
-        <w:spacing w:before="0" w:beforeAutospacing="0" w:after="0" w:afterAutospacing="0"/>
-        <w:rPr>
-          <w:rFonts w:ascii="Arial" w:hAnsi="Arial" w:cs="Arial"/>
-        </w:rPr>
-      </w:pPr>
-      <w:r>
-        <w:rPr>
-          <w:rStyle w:val="t286pc"/>
-          <w:rFonts w:ascii="Arial" w:eastAsiaTheme="majorEastAsia" w:hAnsi="Arial" w:cs="Arial"/>
-        </w:rPr>
-        <w:t>"Hayat anlamlı olmalıdır, aksi takdirde sadece katlanılan bir yük haline gelir."</w:t>
-      </w:r>
-    </w:p>
-    <w:p>
-      <w:pPr>
-        <w:spacing w:after="0" w:line="240" w:lineRule="auto"/>
-        <w:rPr>
-          <w:rFonts w:ascii="Arial" w:eastAsia="Times New Roman" w:hAnsi="Arial" w:cs="Arial"/>
-          <w:kern w:val="0"/>
-          <w:lang w:eastAsia="tr-TR"/>
-          <w14:ligatures w14:val="none"/>
-        </w:rPr>
-      </w:pPr>
-      <w:r>
-        <w:rPr>
-          <w:rFonts w:ascii="Arial" w:eastAsia="Times New Roman" w:hAnsi="Arial" w:cs="Arial"/>
-          <w:kern w:val="0"/>
-          <w:lang w:eastAsia="tr-TR"/>
-          <w14:ligatures w14:val="none"/>
-        </w:rPr>
-        <w:t>"Bilgi sadece kelimelerden ibaret değildir; gerçek bilgi deneyimin kendisidir."</w:t>
-      </w:r>
-    </w:p>
-    <w:p>
-      <w:pPr>
-        <w:spacing w:after="0" w:line="240" w:lineRule="auto"/>
-        <w:rPr>
-          <w:rFonts w:ascii="Arial" w:eastAsia="Times New Roman" w:hAnsi="Arial" w:cs="Arial"/>
-          <w:kern w:val="0"/>
-          <w:lang w:eastAsia="tr-TR"/>
-          <w14:ligatures w14:val="none"/>
-        </w:rPr>
-      </w:pPr>
-      <w:r>
-        <w:rPr>
-          <w:rFonts w:ascii="Arial" w:eastAsia="Times New Roman" w:hAnsi="Arial" w:cs="Arial"/>
-          <w:kern w:val="0"/>
-          <w:lang w:eastAsia="tr-TR"/>
-          <w14:ligatures w14:val="none"/>
-        </w:rPr>
-        <w:t>"Kendi hikayesini tamamlamayan insan, başkalarının yazdığı senaryolarda figüran olur."</w:t>
-      </w:r>
-    </w:p>
-    <w:p>
-      <w:pPr>
-        <w:spacing w:after="0" w:line="240" w:lineRule="auto"/>
-        <w:rPr>
-          <w:rFonts w:ascii="Arial" w:eastAsia="Times New Roman" w:hAnsi="Arial" w:cs="Arial"/>
-          <w:kern w:val="0"/>
-          <w:lang w:eastAsia="tr-TR"/>
-          <w14:ligatures w14:val="none"/>
-        </w:rPr>
-      </w:pPr>
-      <w:r>
-        <w:rPr>
-          <w:rFonts w:ascii="Arial" w:eastAsia="Times New Roman" w:hAnsi="Arial" w:cs="Arial"/>
-          <w:kern w:val="0"/>
-          <w:lang w:eastAsia="tr-TR"/>
-          <w14:ligatures w14:val="none"/>
-        </w:rPr>
-        <w:t>"Sarkaç, doğru ile yanlış arasında değil; anlam ile anlamsızlık arasında salınır."</w:t>
-      </w:r>
-    </w:p>
-    <w:p>
-      <w:r>
-        <w:t>"Dünyayı değiştirmek istiyorsan, işe önce kendi algını kökten değiştirerek başlamalısın."</w:t>
-      </w:r>
-    </w:p>
-    <w:p>
-      <w:r>
-        <w:lastRenderedPageBreak/>
-        <w:t>"Başkalarının sizin hakkındaki düşünceleri, onların kendi iç dünyalarının yansımasıdır; sizinle ilgisi yoktur."</w:t>
-      </w:r>
-    </w:p>
-    <w:p>
-      <w:r>
-        <w:t>"Takip edecek hazır bir yol bulamadıysan, bu senin kendi özgün yolunu inşa etmen gerektiği anlamına gelir."</w:t>
-      </w:r>
-    </w:p>
-    <w:p>
-      <w:pPr>
-        <w:spacing w:after="0" w:line="240" w:lineRule="auto"/>
-        <w:rPr>
-          <w:rFonts w:ascii="Times New Roman" w:eastAsia="Times New Roman" w:hAnsi="Times New Roman" w:cs="Times New Roman"/>
-          <w:kern w:val="0"/>
-          <w:lang w:eastAsia="tr-TR"/>
-          <w14:ligatures w14:val="none"/>
-        </w:rPr>
-      </w:pPr>
-      <w:r>
-        <w:rPr>
-          <w:rFonts w:ascii="Arial" w:eastAsia="Times New Roman" w:hAnsi="Arial" w:cs="Arial"/>
-          <w:kern w:val="0"/>
-          <w:lang w:eastAsia="tr-TR"/>
-          <w14:ligatures w14:val="none"/>
-        </w:rPr>
-        <w:t>"Kendi yalnızlığını sevemeyen insan, kalabalıkların içinde kaybolmaya mahkumdur."</w:t>
-      </w:r>
-    </w:p>
-    <w:p>
-      <w:pPr>
-        <w:spacing w:after="0" w:line="240" w:lineRule="auto"/>
-        <w:rPr>
-          <w:rFonts w:ascii="Times New Roman" w:eastAsia="Times New Roman" w:hAnsi="Times New Roman" w:cs="Times New Roman"/>
-          <w:kern w:val="0"/>
-          <w:lang w:eastAsia="tr-TR"/>
-          <w14:ligatures w14:val="none"/>
-        </w:rPr>
-      </w:pPr>
-      <w:r>
-        <w:rPr>
-          <w:rFonts w:ascii="Arial" w:eastAsia="Times New Roman" w:hAnsi="Arial" w:cs="Arial"/>
-          <w:kern w:val="0"/>
-          <w:lang w:eastAsia="tr-TR"/>
-          <w14:ligatures w14:val="none"/>
-        </w:rPr>
-        <w:t>"Hayatın asıl amacı, topluma uyum sağlamak değil; kendi bütünlüğünü eksiksiz tamamlamaktır."</w:t>
-      </w:r>
-    </w:p>
-    <w:p>
-      <w:r>
-        <w:rPr>
-          <w:rFonts w:ascii="Arial" w:eastAsia="Times New Roman" w:hAnsi="Arial" w:cs="Arial"/>
-          <w:kern w:val="0"/>
-          <w:lang w:eastAsia="tr-TR"/>
-          <w14:ligatures w14:val="none"/>
-        </w:rPr>
-        <w:t>"Her şey zıddıyla var olur; ışığa ulaşmak için gölgenin varlığını cesurca kabul etmelisin."</w:t>
-      </w:r>
-    </w:p>
-    <w:p>
-      <w:r>
-        <w:t>"Zihnindeki karmaşayı dindirmek istiyorsan, dışarıdaki gürültünün sesini kısmayı öğrenmelisin."</w:t>
-      </w:r>
-    </w:p>
-    <w:p>
-      <w:r>
-        <w:t>"Kendine şefkat göstermeyen bir insan, başkalarına karşı asla gerçekten adil ve sabırlı olamaz."</w:t>
-      </w:r>
-    </w:p>
-    <w:p>
-      <w:r>
-        <w:t>"Ruhun derinliklerinden gelen o sessiz çığlığı duymadıkça, gerçek huzuru bulamazsın."</w:t>
-      </w:r>
-    </w:p>
-    <w:sectPr>
-      <w:pgSz w:w="11906" w:h="16838"/>
-      <w:pgMar w:top="1417" w:right="1417" w:bottom="1417" w:left="1417" w:header="708" w:footer="708" w:gutter="0"/>
-      <w:cols w:space="708"/>
-      <w:docGrid w:linePitch="360"/>
-    </w:sectPr>
+        <w:t xml:space="preserve">Dışa bakan rüya görür, içe bakan uyanır.</w:t>
+      </w:r>
+    </w:p>
+    <w:p>
+      <w:r>
+        <w:t xml:space="preserve">Bilinçaltını bilince dönüştürene kadar, o seni yönetir; sen buna kader dersin.</w:t>
+      </w:r>
+    </w:p>
+    <w:p>
+      <w:r>
+        <w:t xml:space="preserve">Kendin olmak, dünyadaki en cesur eylemdir.</w:t>
+      </w:r>
+    </w:p>
+    <w:p>
+      <w:r>
+        <w:t xml:space="preserve">Başıma gelenlerin toplamı değilim; ben olmayı seçtiğim kişiyim.</w:t>
+      </w:r>
+    </w:p>
+    <w:p>
+      <w:r>
+        <w:t xml:space="preserve">Kabul etmediğin şeyi değiştiremezsin; reddetmek özgürleştirmez, zincirler.</w:t>
+      </w:r>
+    </w:p>
+    <w:p>
+      <w:r>
+        <w:t xml:space="preserve">Aydınlanmak, ışığı hayal etmekle değil, karanlığı fark etmekle başlar.</w:t>
+      </w:r>
+    </w:p>
+    <w:p>
+      <w:r>
+        <w:t xml:space="preserve">En büyük trajedi, yaşanmamış bir hayatın ağırlığı altında ezilmektir.</w:t>
+      </w:r>
+    </w:p>
+    <w:p>
+      <w:r>
+        <w:t xml:space="preserve">Kendinle yüzleşmek en zorudur; ama tek gerçek özgürlük budur.</w:t>
+      </w:r>
+    </w:p>
+    <w:p>
+      <w:r>
+        <w:t xml:space="preserve">Kendin olmana izin vermeyen kalabalıkta dik durmak, en büyük zaferdir.</w:t>
+      </w:r>
+    </w:p>
+    <w:p>
+      <w:r>
+        <w:t xml:space="preserve">Görüşün, ancak kalbinin içine bakabildiğinde berraklaşır.</w:t>
+      </w:r>
+    </w:p>
+    <w:p>
+      <w:r>
+        <w:t xml:space="preserve">Kendine dürüst olmak, en sancılı ama en özgürleştirici adımdır.</w:t>
+      </w:r>
+    </w:p>
+    <w:p>
+      <w:r>
+        <w:t xml:space="preserve">Başkalarında seni rahatsız eden şey, kendini tanımanın kapısıdır.</w:t>
+      </w:r>
+    </w:p>
+    <w:p>
+      <w:r>
+        <w:t xml:space="preserve">İki insan, iki kimyasal madde gibidir: tepki varsa ikisi de dönüşür.</w:t>
+      </w:r>
+    </w:p>
+    <w:p>
+      <w:r>
+        <w:t xml:space="preserve">İçindeki çatışmayı çözmezsen, dünya onu sana bir savaş olarak sunar.</w:t>
+      </w:r>
+    </w:p>
+    <w:p>
+      <w:r>
+        <w:t xml:space="preserve">Hayatın her dönemi, kendi benzersiz bilgeliğini taşır.</w:t>
+      </w:r>
+    </w:p>
+    <w:p>
+      <w:r>
+        <w:t xml:space="preserve">Acı, çoğu zaman bilincin uyanması için ödenen bedeldir.</w:t>
+      </w:r>
+    </w:p>
+    <w:p>
+      <w:r>
+        <w:t xml:space="preserve">Zihnindeki fırtınayı durduramazsın; ama içinden geçecek cesareti bulabilirsin.</w:t>
+      </w:r>
+    </w:p>
+    <w:p>
+      <w:r>
+        <w:t xml:space="preserve">Direndiğin şey, varlığını sürdürmeye devam eder.</w:t>
+      </w:r>
+    </w:p>
+    <w:p>
+      <w:r>
+        <w:t xml:space="preserve">Karanlık duygularını kovma; içeri davet et ve ne söylediğini dinle.</w:t>
+      </w:r>
+    </w:p>
+    <w:p>
+      <w:r>
+        <w:t xml:space="preserve">Kendi karanlığını tanımak, başkalarınınkiyle baş etmenin en iyi yoludur.</w:t>
+      </w:r>
+    </w:p>
+    <w:p>
+      <w:r>
+        <w:t xml:space="preserve">Ellerin yaratıcılığı, zihnin çözemediği düğümleri çözer.</w:t>
+      </w:r>
+    </w:p>
+    <w:p>
+      <w:r>
+        <w:t xml:space="preserve">Anlamak yetmez; bir gerçeği ancak tüm varlığınla hissettiğinde yaşarsın.</w:t>
+      </w:r>
+    </w:p>
+    <w:p>
+      <w:r>
+        <w:t xml:space="preserve">Hayatın bir anlamı olmalı; yoksa yalnızca katlanılan bir yüke dönüşür.</w:t>
+      </w:r>
+    </w:p>
+    <w:p>
+      <w:r>
+        <w:t xml:space="preserve">Gerçek bilgi kelimeler değil, yaşanmış deneyimdir.</w:t>
+      </w:r>
+    </w:p>
+    <w:p>
+      <w:r>
+        <w:t xml:space="preserve">Kendi hikâyeni yazmazsan, başkalarının senaryosunda figüran olursun.</w:t>
+      </w:r>
+    </w:p>
+    <w:p>
+      <w:r>
+        <w:t xml:space="preserve">Asıl seçim doğruyla yanlış değil; anlamla anlamsızlık arasındadır.</w:t>
+      </w:r>
+    </w:p>
+    <w:p>
+      <w:r>
+        <w:t xml:space="preserve">Dünyayı değiştirmek istiyorsan, önce kendi algını değiştir.</w:t>
+      </w:r>
+    </w:p>
+    <w:p>
+      <w:r>
+        <w:t xml:space="preserve">Başkalarının senin hakkındaki düşünceleri, kendi iç dünyalarının yansımasıdır.</w:t>
+      </w:r>
+    </w:p>
+    <w:p>
+      <w:r>
+        <w:t xml:space="preserve">Hazır bir yol bulamadıysan, kendi yolunu inşa etme vaktidir.</w:t>
+      </w:r>
+    </w:p>
+    <w:p>
+      <w:r>
+        <w:t xml:space="preserve">Kendi yalnızlığını sevemeyen, kalabalıkta kaybolur.</w:t>
+      </w:r>
+    </w:p>
+    <w:p>
+      <w:r>
+        <w:t xml:space="preserve">Hayatın amacı topluma uymak değil; kendi bütünlüğünü tamamlamaktır.</w:t>
+      </w:r>
+    </w:p>
+    <w:p>
+      <w:r>
+        <w:t xml:space="preserve">Işığa ulaşmak için gölgeni de cesaretle kabul et.</w:t>
+      </w:r>
+    </w:p>
+    <w:p>
+      <w:r>
+        <w:t xml:space="preserve">İçindeki karmaşayı dindirmek istiyorsan, dışarıdaki gürültüyü kıs.</w:t>
+      </w:r>
+    </w:p>
+    <w:p>
+      <w:r>
+        <w:t xml:space="preserve">Kendine şefkat göstermeyen, başkalarına da gerçekten adil olamaz.</w:t>
+      </w:r>
+    </w:p>
+    <w:p>
+      <w:r>
+        <w:t xml:space="preserve">Ruhunun derinliğinden gelen sessiz sesi duymadıkça, gerçek huzuru bulamazsın.</w:t>
+      </w:r>
+    </w:p>
+    <w:p>
+      <w:r>
+        <w:t xml:space="preserve">Dikkatini dış dünyadan çektiğin an, enerjini geri çağırırsın.</w:t>
+      </w:r>
+    </w:p>
+    <w:p>
+      <w:r>
+        <w:t xml:space="preserve">Minnettarlık, almanın en yüksek hâlidir.</w:t>
+      </w:r>
+    </w:p>
+    <w:p>
+      <w:r>
+        <w:t xml:space="preserve">Deneyimsiz bilgi felsefedir; bilgisiz deneyim ise körlük.</w:t>
+      </w:r>
+    </w:p>
+    <w:p>
+      <w:r>
+        <w:t xml:space="preserve">Farkındalığın arttıkça, enerjini boşa harcamaktan vazgeçersin.</w:t>
+      </w:r>
+    </w:p>
+    <w:p>
+      <w:r>
+        <w:t xml:space="preserve">Tepkisel duygularını bıraktığında, eski benliğine dönmekten kurtulursun.</w:t>
+      </w:r>
+    </w:p>
+    <w:p>
+      <w:r>
+        <w:t xml:space="preserve">Anı ne kadar çok yaşarsan, o kadar derin odaklanırsın.</w:t>
+      </w:r>
+    </w:p>
+    <w:p>
+      <w:r>
+        <w:t xml:space="preserve">Hep hayatta kalma telaşındaysan, kendine inanma fırsatı bulamazsın.</w:t>
+      </w:r>
+    </w:p>
+    <w:p>
+      <w:r>
+        <w:t xml:space="preserve">Daha az öfkelenirsen; daha az incinir, daha az yargılar, daha çok huzur bulursun.</w:t>
+      </w:r>
+    </w:p>
+    <w:p>
+      <w:r>
+        <w:t xml:space="preserve">İçindeki bilgeliğe, seni seven biri gibi seslen; çünkü öyledir.</w:t>
+      </w:r>
+    </w:p>
+    <w:p>
+      <w:r>
+        <w:t xml:space="preserve">Gerçek teslimiyet, kontrolü bırakıp en iyi çözümün sana gelmesine izin vermektir.</w:t>
+      </w:r>
+    </w:p>
+    <w:p>
+      <w:r>
+        <w:t xml:space="preserve">Yeni bir sonuç istiyorsan, eski benlik olma alışkanlığını kır ve yeniden doğ.</w:t>
+      </w:r>
+    </w:p>
+    <w:p>
+      <w:r>
+        <w:t xml:space="preserve">Öyle güçlü bir minnet duy ki, yeni hayatın çoktan gerçekleşmiş gibi hisset.</w:t>
+      </w:r>
+    </w:p>
+    <w:p>
+      <w:r>
+        <w:t xml:space="preserve">Dua ettiğinde, daha gerçekleşmeden teşekkür etmeyi unutma.</w:t>
+      </w:r>
+    </w:p>
+    <w:p>
+      <w:r>
+        <w:t xml:space="preserve">Yüce bir güce teslim ol; engellerini onun çözmesine izin ver.</w:t>
+      </w:r>
+    </w:p>
+    <w:p>
+      <w:r>
+        <w:t xml:space="preserve">İnsanlar arası bağlar en güçlüsüdür, çünkü duygu en güçlü enerjiyi taşır.</w:t>
+      </w:r>
+    </w:p>
+    <w:p>
+      <w:r>
+        <w:t xml:space="preserve">Bir türlü düşünüp başka türlü hissederken, hayatının değişmesini bekleme.</w:t>
+      </w:r>
+    </w:p>
+    <w:p>
+      <w:r>
+        <w:t xml:space="preserve">Olmak istediğin hâli zihninde prova ettikçe, hayatını yeniden yaratırsın.</w:t>
+      </w:r>
+    </w:p>
+    <w:p>
+      <w:r>
+        <w:t xml:space="preserve">Beynini farklı çalıştırdığın her an, zihnini de değiştirirsin.</w:t>
+      </w:r>
+    </w:p>
+    <w:p>
+      <w:r>
+        <w:t xml:space="preserve">Dış dünyayı saplantı yaparsan, iç gerçekliğine odaklanamazsın.</w:t>
+      </w:r>
+    </w:p>
+    <w:p>
+      <w:r>
+        <w:t xml:space="preserve">Gerçek bir meditasyon, kalktığında seni değiştirmiş olandır.</w:t>
+      </w:r>
+    </w:p>
+    <w:p>
+      <w:r>
+        <w:t xml:space="preserve">Yeni bir benlik yaratmak için, önce eskisini bırakmalısın.</w:t>
+      </w:r>
+    </w:p>
+    <w:p>
+      <w:r>
+        <w:t xml:space="preserve">Kendine her gün pozitif bir gelecek sinyali gönder.</w:t>
+      </w:r>
+    </w:p>
+    <w:p>
+      <w:r>
+        <w:t xml:space="preserve">Henüz gerçekleşmemiş güzelliğe bile şimdiden minnet duyabilirsin.</w:t>
+      </w:r>
+    </w:p>
+    <w:p>
+      <w:r>
+        <w:t xml:space="preserve">Yeniliğe açılmak için, önce her şeyi bırakıp sıfırlanmayı göze al.</w:t>
+      </w:r>
+    </w:p>
+    <w:p>
+      <w:r>
+        <w:t xml:space="preserve">Başkalarına yaptığımızı, aslında kendimize yaparız.</w:t>
+      </w:r>
+    </w:p>
+    <w:p>
+      <w:r>
+        <w:t xml:space="preserve">Zihin bedene egemen olduğunda, gerçek değişim başlar.</w:t>
+      </w:r>
+    </w:p>
+    <w:p>
+      <w:r>
+        <w:t xml:space="preserve">Var olan her şey, özünde enerji ve bilgidir.</w:t>
+      </w:r>
+    </w:p>
+    <w:p>
+      <w:r>
+        <w:t xml:space="preserve">Algın gerçekliği şekillendirir; onu olduğu gibi görmek neredeyse imkânsızdır.</w:t>
+      </w:r>
+    </w:p>
+    <w:p>
+      <w:r>
+        <w:t xml:space="preserve">İç dünyanı değiştirdiğinde, dış gerçekliğin de değişir.</w:t>
+      </w:r>
+    </w:p>
+    <w:p>
+      <w:r>
+        <w:t xml:space="preserve">Bütün olasılıklar şu anda, bu anın içinde mevcuttur.</w:t>
+      </w:r>
+    </w:p>
+    <w:p>
+      <w:r>
+        <w:t xml:space="preserve">Zor zamanlar, cesur adımlar ister.</w:t>
+      </w:r>
+    </w:p>
+    <w:p>
+      <w:r>
+        <w:t xml:space="preserve">Bedenin, kendini iyileştirme gücüyle doğmuştur.</w:t>
+      </w:r>
+    </w:p>
+    <w:p>
+      <w:r>
+        <w:t xml:space="preserve">Birinden nefret edersen, o nefret seni ona bağlar.</w:t>
+      </w:r>
+    </w:p>
+    <w:p>
+      <w:r>
+        <w:t xml:space="preserve">Dünün rutinini sürdürürsen, yarının dününden farklı olmaz.</w:t>
+      </w:r>
+    </w:p>
+    <w:sectPr/>
   </w:body>
 </w:document>
 </file>
 
-<file path=word/numbering.xml><?xml version="1.0" encoding="utf-8"?>
+<file path=word\fontTable.xml><?xml version="1.0" encoding="utf-8"?>
+<w:fonts xmlns:mc="http://schemas.openxmlformats.org/markup-compatibility/2006" xmlns:r="http://schemas.openxmlformats.org/officeDocument/2006/relationships" xmlns:w="http://schemas.openxmlformats.org/wordprocessingml/2006/main" xmlns:w14="http://schemas.microsoft.com/office/word/2010/wordml" xmlns:w15="http://schemas.microsoft.com/office/word/2012/wordml" xmlns:w16cex="http://schemas.microsoft.com/office/word/2018/wordml/cex" xmlns:w16cid="http://schemas.microsoft.com/office/word/2016/wordml/cid" xmlns:w16="http://schemas.microsoft.com/office/word/2018/wordml" xmlns:w16du="http://schemas.microsoft.com/office/word/2023/wordml/word16du" xmlns:w16sdtdh="http://schemas.microsoft.com/office/word/2020/wordml/sdtdatahash" xmlns:w16sdtfl="http://schemas.microsoft.com/office/word/2024/wordml/sdtformatlock" xmlns:w16se="http://schemas.microsoft.com/office/word/2015/wordml/symex" mc:Ignorable="w14 w15 w16se w16cid w16 w16cex w16sdtdh w16sdtfl w16du">
+  <w:font w:name="Symbol">
+    <w:panose1 w:val="05050102010706020507"/>
+    <w:charset w:val="02"/>
+    <w:family w:val="roman"/>
+    <w:pitch w:val="variable"/>
+    <w:sig w:usb0="00000000" w:usb1="10000000" w:usb2="00000000" w:usb3="00000000" w:csb0="80000000" w:csb1="00000000"/>
+  </w:font>
+  <w:font w:name="Times New Roman">
+    <w:panose1 w:val="02020603050405020304"/>
+    <w:charset w:val="00"/>
+    <w:family w:val="roman"/>
+    <w:pitch w:val="variable"/>
+    <w:sig w:usb0="E0002EFF" w:usb1="C000785B" w:usb2="00000009" w:usb3="00000000" w:csb0="000001FF" w:csb1="00000000"/>
+  </w:font>
+  <w:font w:name="Courier New">
+    <w:panose1 w:val="02070309020205020404"/>
+    <w:charset w:val="00"/>
+    <w:family w:val="modern"/>
+    <w:pitch w:val="fixed"/>
+    <w:sig w:usb0="E0002EFF" w:usb1="C0007843" w:usb2="00000009" w:usb3="00000000" w:csb0="000001FF" w:csb1="00000000"/>
+  </w:font>
+  <w:font w:name="Wingdings">
+    <w:panose1 w:val="05000000000000000000"/>
+    <w:charset w:val="02"/>
+    <w:family w:val="auto"/>
+    <w:pitch w:val="variable"/>
+    <w:sig w:usb0="00000000" w:usb1="10000000" w:usb2="00000000" w:usb3="00000000" w:csb0="80000000" w:csb1="00000000"/>
+  </w:font>
+  <w:font w:name="Calibri">
+    <w:panose1 w:val="020F0502020204030204"/>
+    <w:charset w:val="A2"/>
+    <w:family w:val="swiss"/>
+    <w:pitch w:val="variable"/>
+    <w:sig w:usb0="E4002EFF" w:usb1="C200247B" w:usb2="00000009" w:usb3="00000000" w:csb0="000001FF" w:csb1="00000000"/>
+  </w:font>
+  <w:font w:name="Calibri Light">
+    <w:panose1 w:val="020F0302020204030204"/>
+    <w:charset w:val="A2"/>
+    <w:family w:val="swiss"/>
+    <w:pitch w:val="variable"/>
+    <w:sig w:usb0="E4002EFF" w:usb1="C200247B" w:usb2="00000009" w:usb3="00000000" w:csb0="000001FF" w:csb1="00000000"/>
+  </w:font>
+  <w:font w:name="Arial">
+    <w:panose1 w:val="020B0604020202020204"/>
+    <w:charset w:val="00"/>
+    <w:family w:val="swiss"/>
+    <w:pitch w:val="variable"/>
+    <w:sig w:usb0="E0002EFF" w:usb1="C000785B" w:usb2="00000009" w:usb3="00000000" w:csb0="000001FF" w:csb1="00000000"/>
+  </w:font>
+  <w:font w:name="Segoe UI Emoji">
+    <w:panose1 w:val="020B0502040204020203"/>
+    <w:charset w:val="00"/>
+    <w:family w:val="swiss"/>
+    <w:pitch w:val="variable"/>
+    <w:sig w:usb0="00000003" w:usb1="02000000" w:usb2="08000000" w:usb3="00000000" w:csb0="00000001" w:csb1="00000000"/>
+  </w:font>
+</w:fonts>
+</file>
+
+<file path=word\numbering.xml><?xml version="1.0" encoding="utf-8"?>
 <w:numbering xmlns:wpc="http://schemas.microsoft.com/office/word/2010/wordprocessingCanvas" xmlns:cx="http://schemas.microsoft.com/office/drawing/2014/chartex" xmlns:cx1="http://schemas.microsoft.com/office/drawing/2015/9/8/chartex" xmlns:cx2="http://schemas.microsoft.com/office/drawing/2015/10/21/chartex" xmlns:cx3="http://schemas.microsoft.com/office/drawing/2016/5/9/chartex" xmlns:cx4="http://schemas.microsoft.com/office/drawing/2016/5/10/chartex" xmlns:cx5="http://schemas.microsoft.com/office/drawing/2016/5/11/chartex" xmlns:cx6="http://schemas.microsoft.com/office/drawing/2016/5/12/chartex" xmlns:cx7="http://schemas.microsoft.com/office/drawing/2016/5/13/chartex" xmlns:cx8="http://schemas.microsoft.com/office/drawing/2016/5/14/chartex" xmlns:mc="http://schemas.openxmlformats.org/markup-compatibility/2006" xmlns:aink="http://schemas.microsoft.com/office/drawing/2016/ink" xmlns:am3d="http://schemas.microsoft.com/office/drawing/2017/model3d" xmlns:o="urn:schemas-microsoft-com:office:office" xmlns:oel="http://schemas.microsoft.com/office/2019/extlst" xmlns:r="http://schemas.openxmlformats.org/officeDocument/2006/relationships" xmlns:m="http://schemas.openxmlformats.org/officeDocument/2006/math" xmlns:v="urn:schemas-microsoft-com:vml" xmlns:wp14="http://schemas.microsoft.com/office/word/2010/wordprocessingDrawing" xmlns:wp="http://schemas.openxmlformats.org/drawingml/2006/wordprocessingDrawing" xmlns:w10="urn:schemas-microsoft-com:office:word" xmlns:w="http://schemas.openxmlformats.org/wordprocessingml/2006/main" xmlns:w14="http://schemas.microsoft.com/office/word/2010/wordml" xmlns:w15="http://schemas.microsoft.com/office/word/2012/wordml" xmlns:w16cex="http://schemas.microsoft.com/office/word/2018/wordml/cex" xmlns:w16cid="http://schemas.microsoft.com/office/word/2016/wordml/cid" xmlns:w16="http://schemas.microsoft.com/office/word/2018/wordml" xmlns:w16du="http://schemas.microsoft.com/office/word/2023/wordml/word16du" xmlns:w16sdtdh="http://schemas.microsoft.com/office/word/2020/wordml/sdtdatahash" xmlns:w16sdtfl="http://schemas.microsoft.com/office/word/2024/wordml/sdtformatlock" xmlns:w16se="http://schemas.microsoft.com/office/word/2015/wordml/symex" xmlns:wpg="http://schemas.microsoft.com/office/word/2010/wordprocessingGroup" xmlns:wpi="http://schemas.microsoft.com/office/word/2010/wordprocessingInk" xmlns:wne="http://schemas.microsoft.com/office/word/2006/wordml" xmlns:wps="http://schemas.microsoft.com/office/word/2010/wordprocessingShape" mc:Ignorable="w14 w15 w16se w16cid w16 w16cex w16sdtdh w16sdtfl w16du wp14">
   <w:abstractNum w:abstractNumId="0" w15:restartNumberingAfterBreak="0">
     <w:nsid w:val="00810E5F"/>
@@ -1276,6 +1360,119 @@
     </w:lvl>
   </w:abstractNum>
   <w:abstractNum w:abstractNumId="6" w15:restartNumberingAfterBreak="0">
+    <w:nsid w:val="51E17304"/>
+    <w:multiLevelType w:val="hybridMultilevel"/>
+    <w:tmpl w:val="0D0CF4F4"/>
+    <w:lvl w:ilvl="0" w:tplc="041F0001">
+      <w:start w:val="1"/>
+      <w:numFmt w:val="bullet"/>
+      <w:lvlText w:val=""/>
+      <w:lvlJc w:val="left"/>
+      <w:pPr>
+        <w:ind w:left="720" w:hanging="360"/>
+      </w:pPr>
+      <w:rPr>
+        <w:rFonts w:ascii="Symbol" w:hAnsi="Symbol" w:hint="default"/>
+      </w:rPr>
+    </w:lvl>
+    <w:lvl w:ilvl="1" w:tplc="041F0003" w:tentative="1">
+      <w:start w:val="1"/>
+      <w:numFmt w:val="bullet"/>
+      <w:lvlText w:val="o"/>
+      <w:lvlJc w:val="left"/>
+      <w:pPr>
+        <w:ind w:left="1440" w:hanging="360"/>
+      </w:pPr>
+      <w:rPr>
+        <w:rFonts w:ascii="Courier New" w:hAnsi="Courier New" w:cs="Courier New" w:hint="default"/>
+      </w:rPr>
+    </w:lvl>
+    <w:lvl w:ilvl="2" w:tplc="041F0005" w:tentative="1">
+      <w:start w:val="1"/>
+      <w:numFmt w:val="bullet"/>
+      <w:lvlText w:val=""/>
+      <w:lvlJc w:val="left"/>
+      <w:pPr>
+        <w:ind w:left="2160" w:hanging="360"/>
+      </w:pPr>
+      <w:rPr>
+        <w:rFonts w:ascii="Wingdings" w:hAnsi="Wingdings" w:hint="default"/>
+      </w:rPr>
+    </w:lvl>
+    <w:lvl w:ilvl="3" w:tplc="041F0001" w:tentative="1">
+      <w:start w:val="1"/>
+      <w:numFmt w:val="bullet"/>
+      <w:lvlText w:val=""/>
+      <w:lvlJc w:val="left"/>
+      <w:pPr>
+        <w:ind w:left="2880" w:hanging="360"/>
+      </w:pPr>
+      <w:rPr>
+        <w:rFonts w:ascii="Symbol" w:hAnsi="Symbol" w:hint="default"/>
+      </w:rPr>
+    </w:lvl>
+    <w:lvl w:ilvl="4" w:tplc="041F0003" w:tentative="1">
+      <w:start w:val="1"/>
+      <w:numFmt w:val="bullet"/>
+      <w:lvlText w:val="o"/>
+      <w:lvlJc w:val="left"/>
+      <w:pPr>
+        <w:ind w:left="3600" w:hanging="360"/>
+      </w:pPr>
+      <w:rPr>
+        <w:rFonts w:ascii="Courier New" w:hAnsi="Courier New" w:cs="Courier New" w:hint="default"/>
+      </w:rPr>
+    </w:lvl>
+    <w:lvl w:ilvl="5" w:tplc="041F0005" w:tentative="1">
+      <w:start w:val="1"/>
+      <w:numFmt w:val="bullet"/>
+      <w:lvlText w:val=""/>
+      <w:lvlJc w:val="left"/>
+      <w:pPr>
+        <w:ind w:left="4320" w:hanging="360"/>
+      </w:pPr>
+      <w:rPr>
+        <w:rFonts w:ascii="Wingdings" w:hAnsi="Wingdings" w:hint="default"/>
+      </w:rPr>
+    </w:lvl>
+    <w:lvl w:ilvl="6" w:tplc="041F0001" w:tentative="1">
+      <w:start w:val="1"/>
+      <w:numFmt w:val="bullet"/>
+      <w:lvlText w:val=""/>
+      <w:lvlJc w:val="left"/>
+      <w:pPr>
+        <w:ind w:left="5040" w:hanging="360"/>
+      </w:pPr>
+      <w:rPr>
+        <w:rFonts w:ascii="Symbol" w:hAnsi="Symbol" w:hint="default"/>
+      </w:rPr>
+    </w:lvl>
+    <w:lvl w:ilvl="7" w:tplc="041F0003" w:tentative="1">
+      <w:start w:val="1"/>
+      <w:numFmt w:val="bullet"/>
+      <w:lvlText w:val="o"/>
+      <w:lvlJc w:val="left"/>
+      <w:pPr>
+        <w:ind w:left="5760" w:hanging="360"/>
+      </w:pPr>
+      <w:rPr>
+        <w:rFonts w:ascii="Courier New" w:hAnsi="Courier New" w:cs="Courier New" w:hint="default"/>
+      </w:rPr>
+    </w:lvl>
+    <w:lvl w:ilvl="8" w:tplc="041F0005" w:tentative="1">
+      <w:start w:val="1"/>
+      <w:numFmt w:val="bullet"/>
+      <w:lvlText w:val=""/>
+      <w:lvlJc w:val="left"/>
+      <w:pPr>
+        <w:ind w:left="6480" w:hanging="360"/>
+      </w:pPr>
+      <w:rPr>
+        <w:rFonts w:ascii="Wingdings" w:hAnsi="Wingdings" w:hint="default"/>
+      </w:rPr>
+    </w:lvl>
+  </w:abstractNum>
+  <w:abstractNum w:abstractNumId="7" w15:restartNumberingAfterBreak="0">
     <w:nsid w:val="55DF1DD9"/>
     <w:multiLevelType w:val="multilevel"/>
     <w:tmpl w:val="9482B5BE"/>
@@ -1424,7 +1621,7 @@
       </w:rPr>
     </w:lvl>
   </w:abstractNum>
-  <w:abstractNum w:abstractNumId="7" w15:restartNumberingAfterBreak="0">
+  <w:abstractNum w:abstractNumId="8" w15:restartNumberingAfterBreak="0">
     <w:nsid w:val="7599526F"/>
     <w:multiLevelType w:val="multilevel"/>
     <w:tmpl w:val="684ED2C8"/>
@@ -1570,6 +1767,119 @@
       <w:rPr>
         <w:rFonts w:ascii="Wingdings" w:hAnsi="Wingdings" w:hint="default"/>
         <w:sz w:val="20"/>
+      </w:rPr>
+    </w:lvl>
+  </w:abstractNum>
+  <w:abstractNum w:abstractNumId="9" w15:restartNumberingAfterBreak="0">
+    <w:nsid w:val="7F8E37D4"/>
+    <w:multiLevelType w:val="hybridMultilevel"/>
+    <w:tmpl w:val="053889BE"/>
+    <w:lvl w:ilvl="0" w:tplc="041F0001">
+      <w:start w:val="1"/>
+      <w:numFmt w:val="bullet"/>
+      <w:lvlText w:val=""/>
+      <w:lvlJc w:val="left"/>
+      <w:pPr>
+        <w:ind w:left="720" w:hanging="360"/>
+      </w:pPr>
+      <w:rPr>
+        <w:rFonts w:ascii="Symbol" w:hAnsi="Symbol" w:hint="default"/>
+      </w:rPr>
+    </w:lvl>
+    <w:lvl w:ilvl="1" w:tplc="041F0003" w:tentative="1">
+      <w:start w:val="1"/>
+      <w:numFmt w:val="bullet"/>
+      <w:lvlText w:val="o"/>
+      <w:lvlJc w:val="left"/>
+      <w:pPr>
+        <w:ind w:left="1440" w:hanging="360"/>
+      </w:pPr>
+      <w:rPr>
+        <w:rFonts w:ascii="Courier New" w:hAnsi="Courier New" w:cs="Courier New" w:hint="default"/>
+      </w:rPr>
+    </w:lvl>
+    <w:lvl w:ilvl="2" w:tplc="041F0005" w:tentative="1">
+      <w:start w:val="1"/>
+      <w:numFmt w:val="bullet"/>
+      <w:lvlText w:val=""/>
+      <w:lvlJc w:val="left"/>
+      <w:pPr>
+        <w:ind w:left="2160" w:hanging="360"/>
+      </w:pPr>
+      <w:rPr>
+        <w:rFonts w:ascii="Wingdings" w:hAnsi="Wingdings" w:hint="default"/>
+      </w:rPr>
+    </w:lvl>
+    <w:lvl w:ilvl="3" w:tplc="041F0001" w:tentative="1">
+      <w:start w:val="1"/>
+      <w:numFmt w:val="bullet"/>
+      <w:lvlText w:val=""/>
+      <w:lvlJc w:val="left"/>
+      <w:pPr>
+        <w:ind w:left="2880" w:hanging="360"/>
+      </w:pPr>
+      <w:rPr>
+        <w:rFonts w:ascii="Symbol" w:hAnsi="Symbol" w:hint="default"/>
+      </w:rPr>
+    </w:lvl>
+    <w:lvl w:ilvl="4" w:tplc="041F0003" w:tentative="1">
+      <w:start w:val="1"/>
+      <w:numFmt w:val="bullet"/>
+      <w:lvlText w:val="o"/>
+      <w:lvlJc w:val="left"/>
+      <w:pPr>
+        <w:ind w:left="3600" w:hanging="360"/>
+      </w:pPr>
+      <w:rPr>
+        <w:rFonts w:ascii="Courier New" w:hAnsi="Courier New" w:cs="Courier New" w:hint="default"/>
+      </w:rPr>
+    </w:lvl>
+    <w:lvl w:ilvl="5" w:tplc="041F0005" w:tentative="1">
+      <w:start w:val="1"/>
+      <w:numFmt w:val="bullet"/>
+      <w:lvlText w:val=""/>
+      <w:lvlJc w:val="left"/>
+      <w:pPr>
+        <w:ind w:left="4320" w:hanging="360"/>
+      </w:pPr>
+      <w:rPr>
+        <w:rFonts w:ascii="Wingdings" w:hAnsi="Wingdings" w:hint="default"/>
+      </w:rPr>
+    </w:lvl>
+    <w:lvl w:ilvl="6" w:tplc="041F0001" w:tentative="1">
+      <w:start w:val="1"/>
+      <w:numFmt w:val="bullet"/>
+      <w:lvlText w:val=""/>
+      <w:lvlJc w:val="left"/>
+      <w:pPr>
+        <w:ind w:left="5040" w:hanging="360"/>
+      </w:pPr>
+      <w:rPr>
+        <w:rFonts w:ascii="Symbol" w:hAnsi="Symbol" w:hint="default"/>
+      </w:rPr>
+    </w:lvl>
+    <w:lvl w:ilvl="7" w:tplc="041F0003" w:tentative="1">
+      <w:start w:val="1"/>
+      <w:numFmt w:val="bullet"/>
+      <w:lvlText w:val="o"/>
+      <w:lvlJc w:val="left"/>
+      <w:pPr>
+        <w:ind w:left="5760" w:hanging="360"/>
+      </w:pPr>
+      <w:rPr>
+        <w:rFonts w:ascii="Courier New" w:hAnsi="Courier New" w:cs="Courier New" w:hint="default"/>
+      </w:rPr>
+    </w:lvl>
+    <w:lvl w:ilvl="8" w:tplc="041F0005" w:tentative="1">
+      <w:start w:val="1"/>
+      <w:numFmt w:val="bullet"/>
+      <w:lvlText w:val=""/>
+      <w:lvlJc w:val="left"/>
+      <w:pPr>
+        <w:ind w:left="6480" w:hanging="360"/>
+      </w:pPr>
+      <w:rPr>
+        <w:rFonts w:ascii="Wingdings" w:hAnsi="Wingdings" w:hint="default"/>
       </w:rPr>
     </w:lvl>
   </w:abstractNum>
@@ -1592,15 +1902,80 @@
     <w:abstractNumId w:val="3"/>
   </w:num>
   <w:num w:numId="7" w16cid:durableId="1977105847">
-    <w:abstractNumId w:val="6"/>
+    <w:abstractNumId w:val="7"/>
   </w:num>
   <w:num w:numId="8" w16cid:durableId="1953123623">
-    <w:abstractNumId w:val="7"/>
+    <w:abstractNumId w:val="8"/>
+  </w:num>
+  <w:num w:numId="9" w16cid:durableId="890766702">
+    <w:abstractNumId w:val="9"/>
+  </w:num>
+  <w:num w:numId="10" w16cid:durableId="1894658479">
+    <w:abstractNumId w:val="6"/>
   </w:num>
 </w:numbering>
 </file>
 
-<file path=word/styles.xml><?xml version="1.0" encoding="utf-8"?>
+<file path=word\settings.xml><?xml version="1.0" encoding="utf-8"?>
+<w:settings xmlns:mc="http://schemas.openxmlformats.org/markup-compatibility/2006" xmlns:o="urn:schemas-microsoft-com:office:office" xmlns:r="http://schemas.openxmlformats.org/officeDocument/2006/relationships" xmlns:m="http://schemas.openxmlformats.org/officeDocument/2006/math" xmlns:v="urn:schemas-microsoft-com:vml" xmlns:w10="urn:schemas-microsoft-com:office:word" xmlns:w="http://schemas.openxmlformats.org/wordprocessingml/2006/main" xmlns:w14="http://schemas.microsoft.com/office/word/2010/wordml" xmlns:w15="http://schemas.microsoft.com/office/word/2012/wordml" xmlns:w16cex="http://schemas.microsoft.com/office/word/2018/wordml/cex" xmlns:w16cid="http://schemas.microsoft.com/office/word/2016/wordml/cid" xmlns:w16="http://schemas.microsoft.com/office/word/2018/wordml" xmlns:w16du="http://schemas.microsoft.com/office/word/2023/wordml/word16du" xmlns:w16sdtdh="http://schemas.microsoft.com/office/word/2020/wordml/sdtdatahash" xmlns:w16sdtfl="http://schemas.microsoft.com/office/word/2024/wordml/sdtformatlock" xmlns:w16se="http://schemas.microsoft.com/office/word/2015/wordml/symex" xmlns:sl="http://schemas.openxmlformats.org/schemaLibrary/2006/main" mc:Ignorable="w14 w15 w16se w16cid w16 w16cex w16sdtdh w16sdtfl w16du">
+  <w:zoom w:percent="130"/>
+  <w:proofState w:spelling="clean"/>
+  <w:defaultTabStop w:val="708"/>
+  <w:hyphenationZone w:val="425"/>
+  <w:characterSpacingControl w:val="doNotCompress"/>
+  <w:compat>
+    <w:compatSetting w:name="compatibilityMode" w:uri="http://schemas.microsoft.com/office/word" w:val="15"/>
+    <w:compatSetting w:name="overrideTableStyleFontSizeAndJustification" w:uri="http://schemas.microsoft.com/office/word" w:val="1"/>
+    <w:compatSetting w:name="enableOpenTypeFeatures" w:uri="http://schemas.microsoft.com/office/word" w:val="1"/>
+    <w:compatSetting w:name="doNotFlipMirrorIndents" w:uri="http://schemas.microsoft.com/office/word" w:val="1"/>
+    <w:compatSetting w:name="differentiateMultirowTableHeaders" w:uri="http://schemas.microsoft.com/office/word" w:val="1"/>
+    <w:compatSetting w:name="useWord2013TrackBottomHyphenation" w:uri="http://schemas.microsoft.com/office/word" w:val="0"/>
+  </w:compat>
+  <w:rsids>
+    <w:rsidRoot w:val="0099124B"/>
+    <w:rsid w:val="00017230"/>
+    <w:rsid w:val="000E0F9D"/>
+    <w:rsid w:val="00263EB9"/>
+    <w:rsid w:val="0045422F"/>
+    <w:rsid w:val="0086645E"/>
+    <w:rsid w:val="008C1721"/>
+    <w:rsid w:val="0099124B"/>
+    <w:rsid w:val="00A02BA4"/>
+    <w:rsid w:val="00A270CD"/>
+    <w:rsid w:val="00C87377"/>
+    <w:rsid w:val="00EF009E"/>
+    <w:rsid w:val="00F53633"/>
+  </w:rsids>
+  <m:mathPr>
+    <m:mathFont m:val="Cambria Math"/>
+    <m:brkBin m:val="before"/>
+    <m:brkBinSub m:val="--"/>
+    <m:smallFrac m:val="0"/>
+    <m:dispDef/>
+    <m:lMargin m:val="0"/>
+    <m:rMargin m:val="0"/>
+    <m:defJc m:val="centerGroup"/>
+    <m:wrapIndent m:val="1440"/>
+    <m:intLim m:val="subSup"/>
+    <m:naryLim m:val="undOvr"/>
+  </m:mathPr>
+  <w:themeFontLang w:val="tr-TR"/>
+  <w:clrSchemeMapping w:bg1="light1" w:t1="dark1" w:bg2="light2" w:t2="dark2" w:accent1="accent1" w:accent2="accent2" w:accent3="accent3" w:accent4="accent4" w:accent5="accent5" w:accent6="accent6" w:hyperlink="hyperlink" w:followedHyperlink="followedHyperlink"/>
+  <w:shapeDefaults>
+    <o:shapedefaults v:ext="edit" spidmax="1026"/>
+    <o:shapelayout v:ext="edit">
+      <o:idmap v:ext="edit" data="1"/>
+    </o:shapelayout>
+  </w:shapeDefaults>
+  <w:decimalSymbol w:val=","/>
+  <w:listSeparator w:val=";"/>
+  <w14:docId w14:val="775845E7"/>
+  <w15:chartTrackingRefBased/>
+  <w15:docId w15:val="{CD503B78-E9A0-4E77-9425-6597806D5085}"/>
+</w:settings>
+</file>
+
+<file path=word\styles.xml><?xml version="1.0" encoding="utf-8"?>
 <w:styles xmlns:mc="http://schemas.openxmlformats.org/markup-compatibility/2006" xmlns:r="http://schemas.openxmlformats.org/officeDocument/2006/relationships" xmlns:w="http://schemas.openxmlformats.org/wordprocessingml/2006/main" xmlns:w14="http://schemas.microsoft.com/office/word/2010/wordml" xmlns:w15="http://schemas.microsoft.com/office/word/2012/wordml" xmlns:w16cex="http://schemas.microsoft.com/office/word/2018/wordml/cex" xmlns:w16cid="http://schemas.microsoft.com/office/word/2016/wordml/cid" xmlns:w16="http://schemas.microsoft.com/office/word/2018/wordml" xmlns:w16du="http://schemas.microsoft.com/office/word/2023/wordml/word16du" xmlns:w16sdtdh="http://schemas.microsoft.com/office/word/2020/wordml/sdtdatahash" xmlns:w16sdtfl="http://schemas.microsoft.com/office/word/2024/wordml/sdtformatlock" xmlns:w16se="http://schemas.microsoft.com/office/word/2015/wordml/symex" mc:Ignorable="w14 w15 w16se w16cid w16 w16cex w16sdtdh w16sdtfl w16du">
   <w:docDefaults>
     <w:rPrDefault>
@@ -2203,7 +2578,6 @@
   <w:style w:type="character" w:default="1" w:styleId="VarsaylanParagrafYazTipi">
     <w:name w:val="Default Paragraph Font"/>
     <w:uiPriority w:val="1"/>
-    <w:semiHidden/>
     <w:unhideWhenUsed/>
   </w:style>
   <w:style w:type="table" w:default="1" w:styleId="NormalTablo">
@@ -2550,7 +2924,7 @@
 </w:styles>
 </file>
 
-<file path=word/theme/theme1.xml><?xml version="1.0" encoding="utf-8"?>
+<file path=word\theme\theme1.xml><?xml version="1.0" encoding="utf-8"?>
 <a:theme xmlns:a="http://schemas.openxmlformats.org/drawingml/2006/main" name="Office Teması">
   <a:themeElements>
     <a:clrScheme name="Office">
@@ -2843,4 +3217,12 @@
     </a:ext>
   </a:extLst>
 </a:theme>
+</file>
+
+<file path=word\webSettings.xml><?xml version="1.0" encoding="utf-8"?>
+<w:webSettings xmlns:mc="http://schemas.openxmlformats.org/markup-compatibility/2006" xmlns:r="http://schemas.openxmlformats.org/officeDocument/2006/relationships" xmlns:w="http://schemas.openxmlformats.org/wordprocessingml/2006/main" xmlns:w14="http://schemas.microsoft.com/office/word/2010/wordml" xmlns:w15="http://schemas.microsoft.com/office/word/2012/wordml" xmlns:w16cex="http://schemas.microsoft.com/office/word/2018/wordml/cex" xmlns:w16cid="http://schemas.microsoft.com/office/word/2016/wordml/cid" xmlns:w16="http://schemas.microsoft.com/office/word/2018/wordml" xmlns:w16du="http://schemas.microsoft.com/office/word/2023/wordml/word16du" xmlns:w16sdtdh="http://schemas.microsoft.com/office/word/2020/wordml/sdtdatahash" xmlns:w16sdtfl="http://schemas.microsoft.com/office/word/2024/wordml/sdtformatlock" xmlns:w16se="http://schemas.microsoft.com/office/word/2015/wordml/symex" mc:Ignorable="w14 w15 w16se w16cid w16 w16cex w16sdtdh w16sdtfl w16du">
+  <w:optimizeForBrowser/>
+  <w:relyOnVML/>
+  <w:allowPNG/>
+</w:webSettings>
 </file>
</xml_diff>

<commit_message>
Acilis+Evren havuzu: 290 cumle temizlenip 186 benzersize indirildi; tam dongu rotasyon
Word'deki 290 cumle duzenlendi (yazim/noktalama/bosluk, anlam bozuklugu, uzun olanlar kisaltildi, benzer/ayni olanlar birlestirilip en akici versiyon birakildi) -> 186 benzersiz. Acilis ve Evren bildirimleri ayni havuzu kullanir. Rotasyon: tum havuz donmeden hicbir soz tekrar etmez (splash + evren), ayni gun ayni soz yok, 21 gun+ aralik. Edge Function artik havuzu canli acilis-cumleler.js'ten cekiyor -> Word'e ekleme yapinca bildirimler de otomatik algilar (yeniden dagitim gerekmez). v116.

Co-Authored-By: Claude Opus 4.8 <noreply@anthropic.com>
</commit_message>
<xml_diff>
--- a/Açılış cümlelerim/Açılış cümleleri.docx
+++ b/Açılış cümlelerim/Açılış cümleleri.docx
@@ -1,55 +1,5 @@
 
-<file path=docProps\app.xml><?xml version="1.0" encoding="utf-8"?>
-<Properties xmlns="http://schemas.openxmlformats.org/officeDocument/2006/extended-properties" xmlns:vt="http://schemas.openxmlformats.org/officeDocument/2006/docPropsVTypes">
-  <Template>Normal</Template>
-  <TotalTime>42</TotalTime>
-  <Pages>4</Pages>
-  <Words>1094</Words>
-  <Characters>6238</Characters>
-  <Application>Microsoft Office Word</Application>
-  <DocSecurity>0</DocSecurity>
-  <Lines>51</Lines>
-  <Paragraphs>14</Paragraphs>
-  <ScaleCrop>false</ScaleCrop>
-  <HeadingPairs>
-    <vt:vector size="2" baseType="variant">
-      <vt:variant>
-        <vt:lpstr>Konu Başlığı</vt:lpstr>
-      </vt:variant>
-      <vt:variant>
-        <vt:i4>1</vt:i4>
-      </vt:variant>
-    </vt:vector>
-  </HeadingPairs>
-  <TitlesOfParts>
-    <vt:vector size="1" baseType="lpstr">
-      <vt:lpstr/>
-    </vt:vector>
-  </TitlesOfParts>
-  <Company/>
-  <LinksUpToDate>false</LinksUpToDate>
-  <CharactersWithSpaces>7318</CharactersWithSpaces>
-  <SharedDoc>false</SharedDoc>
-  <HyperlinksChanged>false</HyperlinksChanged>
-  <AppVersion>16.0000</AppVersion>
-</Properties>
-</file>
-
-<file path=docProps\core.xml><?xml version="1.0" encoding="utf-8"?>
-<cp:coreProperties xmlns:cp="http://schemas.openxmlformats.org/package/2006/metadata/core-properties" xmlns:dc="http://purl.org/dc/elements/1.1/" xmlns:dcterms="http://purl.org/dc/terms/" xmlns:dcmitype="http://purl.org/dc/dcmitype/" xmlns:xsi="http://www.w3.org/2001/XMLSchema-instance">
-  <dc:title/>
-  <dc:subject/>
-  <dc:creator>Hulya Durgut</dc:creator>
-  <cp:keywords/>
-  <dc:description/>
-  <cp:lastModifiedBy>Hulya Durgut</cp:lastModifiedBy>
-  <cp:revision>7</cp:revision>
-  <dcterms:created xsi:type="dcterms:W3CDTF">2026-06-06T03:56:00Z</dcterms:created>
-  <dcterms:modified xsi:type="dcterms:W3CDTF">2026-06-12T08:48:00Z</dcterms:modified>
-</cp:coreProperties>
-</file>
-
-<file path=word\document.xml><?xml version="1.0" encoding="utf-8"?>
+<file path=word/document.xml><?xml version="1.0" encoding="utf-8"?>
 <w:document xmlns:w="http://schemas.openxmlformats.org/wordprocessingml/2006/main">
   <w:body>
     <w:p>
@@ -395,6 +345,591 @@
     <w:p>
       <w:r>
         <w:t xml:space="preserve">Dünün rutinini sürdürürsen, yarının dününden farklı olmaz.</w:t>
+      </w:r>
+    </w:p>
+    <w:p>
+      <w:r>
+        <w:t xml:space="preserve">Bugünün hazırlığı, yarının başarısını belirler.</w:t>
+      </w:r>
+    </w:p>
+    <w:p>
+      <w:r>
+        <w:t xml:space="preserve">Her şey yolunda; her şey benim için en hayırlı şekilde gelişiyor.</w:t>
+      </w:r>
+    </w:p>
+    <w:p>
+      <w:r>
+        <w:t xml:space="preserve">Bu durumdan yalnızca iyilik gelecek; ben güvendeyim.</w:t>
+      </w:r>
+    </w:p>
+    <w:p>
+      <w:r>
+        <w:t xml:space="preserve">Kendimi bağışlar, kabul eder ve kendime güvenirim.</w:t>
+      </w:r>
+    </w:p>
+    <w:p>
+      <w:r>
+        <w:t xml:space="preserve">Görmezden gelinen duygu kaybolmaz, yoğunlaşır.</w:t>
+      </w:r>
+    </w:p>
+    <w:p>
+      <w:r>
+        <w:t xml:space="preserve">Bazen ışığımız söner, sonra başka biri onu yeniden yakar; bu insanlara minnettarız.</w:t>
+      </w:r>
+    </w:p>
+    <w:p>
+      <w:r>
+        <w:t xml:space="preserve">Sana gelen herkes daha mutlu ayrılsın; bakışında ve gülüşünde nezaket olsun.</w:t>
+      </w:r>
+    </w:p>
+    <w:p>
+      <w:r>
+        <w:t xml:space="preserve">Mutlu etmek de mutlu olmak da şefkatle başlar.</w:t>
+      </w:r>
+    </w:p>
+    <w:p>
+      <w:r>
+        <w:t xml:space="preserve">Senin yapamadığını ben, benim yapamadığımı sen yaparsın; birlikte harikalar yaratırız.</w:t>
+      </w:r>
+    </w:p>
+    <w:p>
+      <w:r>
+        <w:t xml:space="preserve">Yaptığın, okyanusta bir damla olabilir; ama o damla olmasa okyanus eksik kalırdı.</w:t>
+      </w:r>
+    </w:p>
+    <w:p>
+      <w:r>
+        <w:t xml:space="preserve">Büyük işler yoktur; yalnızca büyük sevgiyle yapılmış küçük işler vardır.</w:t>
+      </w:r>
+    </w:p>
+    <w:p>
+      <w:r>
+        <w:t xml:space="preserve">Birbirimizi hep gülümseyerek selamlayalım; sevgi böyle başlar.</w:t>
+      </w:r>
+    </w:p>
+    <w:p>
+      <w:r>
+        <w:t xml:space="preserve">Sorgulanmamış bir hayat yaşanmaya değmez.</w:t>
+      </w:r>
+    </w:p>
+    <w:p>
+      <w:r>
+        <w:t xml:space="preserve">Uzun bir yolculuk, tek bir adımla başlar.</w:t>
+      </w:r>
+    </w:p>
+    <w:p>
+      <w:r>
+        <w:t xml:space="preserve">Herkes özgün doğar; çoğu kopya olarak ölür.</w:t>
+      </w:r>
+    </w:p>
+    <w:p>
+      <w:r>
+        <w:t xml:space="preserve">Yanılabilirsin, sorun değil; yeter ki daima kendin düşün.</w:t>
+      </w:r>
+    </w:p>
+    <w:p>
+      <w:r>
+        <w:t xml:space="preserve">Kalp kırıldıktan sonra gelen özür, doyduktan sonra gelen tuz gibidir.</w:t>
+      </w:r>
+    </w:p>
+    <w:p>
+      <w:r>
+        <w:t xml:space="preserve">Sonunda, düşmanlarımızın sözlerini değil dostlarımızın sessizliğini hatırlarız.</w:t>
+      </w:r>
+    </w:p>
+    <w:p>
+      <w:r>
+        <w:t xml:space="preserve">Hayal gücü bilgiden önemlidir; bilgi sınırlı, hayal gücü sonsuzdur.</w:t>
+      </w:r>
+    </w:p>
+    <w:p>
+      <w:r>
+        <w:t xml:space="preserve">Erdem; doğru olanı, doğru ölçüde, doğru zamanda ve doğru nedenle yapmaktır.</w:t>
+      </w:r>
+    </w:p>
+    <w:p>
+      <w:r>
+        <w:t xml:space="preserve">Büyük fikirlerin peşinde olanlar, büyük hatalar da yapar.</w:t>
+      </w:r>
+    </w:p>
+    <w:p>
+      <w:r>
+        <w:t xml:space="preserve">Kendine düşman olan, başkasına nasıl dost olabilir?</w:t>
+      </w:r>
+    </w:p>
+    <w:p>
+      <w:r>
+        <w:t xml:space="preserve">İçinde yaşadığın an, geleceği kemiren geçmiştir.</w:t>
+      </w:r>
+    </w:p>
+    <w:p>
+      <w:r>
+        <w:t xml:space="preserve">Düşünüyorum, öyleyse varım.</w:t>
+      </w:r>
+    </w:p>
+    <w:p>
+      <w:r>
+        <w:t xml:space="preserve">İnsan özgür doğar, ama her yerde zincire vurulur.</w:t>
+      </w:r>
+    </w:p>
+    <w:p>
+      <w:r>
+        <w:t xml:space="preserve">Kendi yolunda yanılmak, başkasının yolunda doğru gitmekten iyidir.</w:t>
+      </w:r>
+    </w:p>
+    <w:p>
+      <w:r>
+        <w:t xml:space="preserve">Ne yaparsan yap; bir gün ya yaptıklarına ya da yapmadıklarına yanarsın.</w:t>
+      </w:r>
+    </w:p>
+    <w:p>
+      <w:r>
+        <w:t xml:space="preserve">Sevmek, birinde aşkı aramak değil; beklenmedik bir anda kendini bulmaktır.</w:t>
+      </w:r>
+    </w:p>
+    <w:p>
+      <w:r>
+        <w:t xml:space="preserve">Ruhu yücelten bir acı, ucuz bir mutluluktan değerlidir.</w:t>
+      </w:r>
+    </w:p>
+    <w:p>
+      <w:r>
+        <w:t xml:space="preserve">İnsanı en çok, yaşanabilecekken yaşanmamış mutluluklar acıtır.</w:t>
+      </w:r>
+    </w:p>
+    <w:p>
+      <w:r>
+        <w:t xml:space="preserve">Bilgelik, ruhun en saf ışığıdır.</w:t>
+      </w:r>
+    </w:p>
+    <w:p>
+      <w:r>
+        <w:t xml:space="preserve">İçten ve güzel olan her şey, er geç kendini affettirir.</w:t>
+      </w:r>
+    </w:p>
+    <w:p>
+      <w:r>
+        <w:t xml:space="preserve">Öğretmek, iki kez öğrenmektir.</w:t>
+      </w:r>
+    </w:p>
+    <w:p>
+      <w:r>
+        <w:t xml:space="preserve">İyi insan, söylediğini yapan ve yapabileceğini söyleyendir.</w:t>
+      </w:r>
+    </w:p>
+    <w:p>
+      <w:r>
+        <w:t xml:space="preserve">Başarı, cesur adımların atıldığı yerde doğar.</w:t>
+      </w:r>
+    </w:p>
+    <w:p>
+      <w:r>
+        <w:t xml:space="preserve">Pozitif bir zihin, pozitif bir hayat yaratır.</w:t>
+      </w:r>
+    </w:p>
+    <w:p>
+      <w:r>
+        <w:t xml:space="preserve">Kendine inanmak, başarının yarısıdır.</w:t>
+      </w:r>
+    </w:p>
+    <w:p>
+      <w:r>
+        <w:t xml:space="preserve">Duvara çarptığında geri dönme; etrafından dolaşmanın ya da içinden geçmenin yolunu bul.</w:t>
+      </w:r>
+    </w:p>
+    <w:p>
+      <w:r>
+        <w:t xml:space="preserve">Hayatta en önemli şey, kendi şansını kendin yaratmaktır.</w:t>
+      </w:r>
+    </w:p>
+    <w:p>
+      <w:r>
+        <w:t xml:space="preserve">Bugün attığın küçük bir adım, yarının büyük değişimini başlatabilir.</w:t>
+      </w:r>
+    </w:p>
+    <w:p>
+      <w:r>
+        <w:t xml:space="preserve">Kendine inandığında, yol da seninle birlikte açılır.</w:t>
+      </w:r>
+    </w:p>
+    <w:p>
+      <w:r>
+        <w:t xml:space="preserve">Her yeni gün, yeniden başlamak için bir fırsattır.</w:t>
+      </w:r>
+    </w:p>
+    <w:p>
+      <w:r>
+        <w:t xml:space="preserve">Gücün, düşündüğünden çok daha büyük.</w:t>
+      </w:r>
+    </w:p>
+    <w:p>
+      <w:r>
+        <w:t xml:space="preserve">Vazgeçmediğin sürece ilerliyorsun.</w:t>
+      </w:r>
+    </w:p>
+    <w:p>
+      <w:r>
+        <w:t xml:space="preserve">Bazen en büyük gelişim, sessizce devam etmektir.</w:t>
+      </w:r>
+    </w:p>
+    <w:p>
+      <w:r>
+        <w:t xml:space="preserve">Kendine verdiğin emek asla boşa gitmez.</w:t>
+      </w:r>
+    </w:p>
+    <w:p>
+      <w:r>
+        <w:t xml:space="preserve">Bugün elinden gelenin en iyisini yapman yeterli.</w:t>
+      </w:r>
+    </w:p>
+    <w:p>
+      <w:r>
+        <w:t xml:space="preserve">Hayat acele etmez; sen de etmek zorunda değilsin.</w:t>
+      </w:r>
+    </w:p>
+    <w:p>
+      <w:r>
+        <w:t xml:space="preserve">Küçük alışkanlıklar, büyük dönüşümlerin temelidir.</w:t>
+      </w:r>
+    </w:p>
+    <w:p>
+      <w:r>
+        <w:t xml:space="preserve">İçindeki ışık, en karanlık günlerde bile sönmez.</w:t>
+      </w:r>
+    </w:p>
+    <w:p>
+      <w:r>
+        <w:t xml:space="preserve">Kendine nazik davranmak da bir güçtür.</w:t>
+      </w:r>
+    </w:p>
+    <w:p>
+      <w:r>
+        <w:t xml:space="preserve">Her deneyim, seni olduğun kişiye dönüştürür.</w:t>
+      </w:r>
+    </w:p>
+    <w:p>
+      <w:r>
+        <w:t xml:space="preserve">Bir adım daha at; gerisi zamanla gelir.</w:t>
+      </w:r>
+    </w:p>
+    <w:p>
+      <w:r>
+        <w:t xml:space="preserve">İlerlemenin sırrı mükemmel olmak değil, devam etmektir.</w:t>
+      </w:r>
+    </w:p>
+    <w:p>
+      <w:r>
+        <w:t xml:space="preserve">Kendini olduğun gibi kabul etmek, dönüşümün başlangıcıdır.</w:t>
+      </w:r>
+    </w:p>
+    <w:p>
+      <w:r>
+        <w:t xml:space="preserve">Kalbinin sesini duyduğunda, yolunu da bulursun.</w:t>
+      </w:r>
+    </w:p>
+    <w:p>
+      <w:r>
+        <w:t xml:space="preserve">Değişim, yeni bir seçim yaptığın anda başlar.</w:t>
+      </w:r>
+    </w:p>
+    <w:p>
+      <w:r>
+        <w:t xml:space="preserve">Güven, bazen tüm cevapları bilmeden ilerleyebilmektir.</w:t>
+      </w:r>
+    </w:p>
+    <w:p>
+      <w:r>
+        <w:t xml:space="preserve">Kendine verdiğin değer, hayatına yansır.</w:t>
+      </w:r>
+    </w:p>
+    <w:p>
+      <w:r>
+        <w:t xml:space="preserve">Cesaret, korkunun yokluğu değil, ona rağmen ilerlemektir.</w:t>
+      </w:r>
+    </w:p>
+    <w:p>
+      <w:r>
+        <w:t xml:space="preserve">Bugün kendin için yaptığın şey, gelecekteki sana bir hediyedir.</w:t>
+      </w:r>
+    </w:p>
+    <w:p>
+      <w:r>
+        <w:t xml:space="preserve">Kendini kıyaslamadan büyümeye izin ver.</w:t>
+      </w:r>
+    </w:p>
+    <w:p>
+      <w:r>
+        <w:t xml:space="preserve">İç huzura attığın her adım değerlidir.</w:t>
+      </w:r>
+    </w:p>
+    <w:p>
+      <w:r>
+        <w:t xml:space="preserve">Işığını aramayı bırakma; o zaten içinde.</w:t>
+      </w:r>
+    </w:p>
+    <w:p>
+      <w:r>
+        <w:t xml:space="preserve">Başarı, her gün gösterdiğin küçük çabaların toplamıdır.</w:t>
+      </w:r>
+    </w:p>
+    <w:p>
+      <w:r>
+        <w:t xml:space="preserve">Her zorluk, içinde yeni bir fırsat saklar.</w:t>
+      </w:r>
+    </w:p>
+    <w:p>
+      <w:r>
+        <w:t xml:space="preserve">Bugün attığın tohumlar, yarının meyvelerini verir.</w:t>
+      </w:r>
+    </w:p>
+    <w:p>
+      <w:r>
+        <w:t xml:space="preserve">Kendini geliştirmek için asla geç değildir.</w:t>
+      </w:r>
+    </w:p>
+    <w:p>
+      <w:r>
+        <w:t xml:space="preserve">Sabır, büyük hedeflerin sessiz ortağıdır.</w:t>
+      </w:r>
+    </w:p>
+    <w:p>
+      <w:r>
+        <w:t xml:space="preserve">Hatalar, öğrenmenin doğal bir parçasıdır.</w:t>
+      </w:r>
+    </w:p>
+    <w:p>
+      <w:r>
+        <w:t xml:space="preserve">Kendi hikâyenin kahramanı olmayı seç.</w:t>
+      </w:r>
+    </w:p>
+    <w:p>
+      <w:r>
+        <w:t xml:space="preserve">Umut, en karanlık anlarda bile yol gösterir.</w:t>
+      </w:r>
+    </w:p>
+    <w:p>
+      <w:r>
+        <w:t xml:space="preserve">Kendine yatırım yapmak, en değerli seçimlerden biridir.</w:t>
+      </w:r>
+    </w:p>
+    <w:p>
+      <w:r>
+        <w:t xml:space="preserve">Hayallerin, onları gerçekleştirecek gücü de içinde taşır.</w:t>
+      </w:r>
+    </w:p>
+    <w:p>
+      <w:r>
+        <w:t xml:space="preserve">Bugün gösterdiğin cesaret, yarınını şekillendirir.</w:t>
+      </w:r>
+    </w:p>
+    <w:p>
+      <w:r>
+        <w:t xml:space="preserve">Her yeni başlangıç, içinde sonsuz ihtimal barındırır.</w:t>
+      </w:r>
+    </w:p>
+    <w:p>
+      <w:r>
+        <w:t xml:space="preserve">Kendini sevmek, hayatını değiştiren bir karardır.</w:t>
+      </w:r>
+    </w:p>
+    <w:p>
+      <w:r>
+        <w:t xml:space="preserve">Yolun yavaş olması, yanlış yolda olduğun anlamına gelmez.</w:t>
+      </w:r>
+    </w:p>
+    <w:p>
+      <w:r>
+        <w:t xml:space="preserve">İçindeki potansiyel, keşfedilmeyi bekliyor.</w:t>
+      </w:r>
+    </w:p>
+    <w:p>
+      <w:r>
+        <w:t xml:space="preserve">Küçük ilerlemeler de ilerlemedir.</w:t>
+      </w:r>
+    </w:p>
+    <w:p>
+      <w:r>
+        <w:t xml:space="preserve">Kendine verdiğin sözleri tutmak, özgüvenini büyütür.</w:t>
+      </w:r>
+    </w:p>
+    <w:p>
+      <w:r>
+        <w:t xml:space="preserve">Güzel şeyler, zaman ve emek ister.</w:t>
+      </w:r>
+    </w:p>
+    <w:p>
+      <w:r>
+        <w:t xml:space="preserve">Kendini olduğundan eksik görme; çok daha fazlasısın.</w:t>
+      </w:r>
+    </w:p>
+    <w:p>
+      <w:r>
+        <w:t xml:space="preserve">Her nefes, yeni bir başlangıç için fırsattır.</w:t>
+      </w:r>
+    </w:p>
+    <w:p>
+      <w:r>
+        <w:t xml:space="preserve">Başkalarının hızına değil, kendi ritmine odaklan.</w:t>
+      </w:r>
+    </w:p>
+    <w:p>
+      <w:r>
+        <w:t xml:space="preserve">Sen değiştikçe, hayatın da seninle dönüşür.</w:t>
+      </w:r>
+    </w:p>
+    <w:p>
+      <w:r>
+        <w:t xml:space="preserve">Işığın bazen sessizce parlar, ama her zaman oradadır.</w:t>
+      </w:r>
+    </w:p>
+    <w:p>
+      <w:r>
+        <w:t xml:space="preserve">Büyümek, her gün biraz daha kendin olmaktır.</w:t>
+      </w:r>
+    </w:p>
+    <w:p>
+      <w:r>
+        <w:t xml:space="preserve">Hayat sana karşı değil, seninle birlikte akıyor.</w:t>
+      </w:r>
+    </w:p>
+    <w:p>
+      <w:r>
+        <w:t xml:space="preserve">Hayatındaki güzellikleri fark etmeye izin ver.</w:t>
+      </w:r>
+    </w:p>
+    <w:p>
+      <w:r>
+        <w:t xml:space="preserve">Yolunu kaybettiğini sandığın anlar bile sana bir şey öğretir.</w:t>
+      </w:r>
+    </w:p>
+    <w:p>
+      <w:r>
+        <w:t xml:space="preserve">Bugün, umut etmek için güzel bir gün.</w:t>
+      </w:r>
+    </w:p>
+    <w:p>
+      <w:r>
+        <w:t xml:space="preserve">Kendini olduğun gibi kabul etmek özgürlüktür.</w:t>
+      </w:r>
+    </w:p>
+    <w:p>
+      <w:r>
+        <w:t xml:space="preserve">Kendi hikâyeni sevgiyle yazıyorsun.</w:t>
+      </w:r>
+    </w:p>
+    <w:p>
+      <w:r>
+        <w:t xml:space="preserve">Gücünü hatırladığında, korkular küçülmeye başlar.</w:t>
+      </w:r>
+    </w:p>
+    <w:p>
+      <w:r>
+        <w:t xml:space="preserve">Sevgiyle atılan adımlar, her zaman doğru yöne gider.</w:t>
+      </w:r>
+    </w:p>
+    <w:p>
+      <w:r>
+        <w:t xml:space="preserve">Bugün olduğun kişiyle gurur duyabilirsin.</w:t>
+      </w:r>
+    </w:p>
+    <w:p>
+      <w:r>
+        <w:t xml:space="preserve">Hayallerin gerçekleşmeyi hak ediyor.</w:t>
+      </w:r>
+    </w:p>
+    <w:p>
+      <w:r>
+        <w:t xml:space="preserve">İç sesin, sana sandığından çok daha fazla rehberlik eder.</w:t>
+      </w:r>
+    </w:p>
+    <w:p>
+      <w:r>
+        <w:t xml:space="preserve">Zor zamanlar da geçicidir.</w:t>
+      </w:r>
+    </w:p>
+    <w:p>
+      <w:r>
+        <w:t xml:space="preserve">Her şey, tam olması gereken zamanda gerçekleşir.</w:t>
+      </w:r>
+    </w:p>
+    <w:p>
+      <w:r>
+        <w:t xml:space="preserve">Bugün, bir şeyleri farklı yapma şansın var.</w:t>
+      </w:r>
+    </w:p>
+    <w:p>
+      <w:r>
+        <w:t xml:space="preserve">Kendi değerini, başkalarının onayına bağlama.</w:t>
+      </w:r>
+    </w:p>
+    <w:p>
+      <w:r>
+        <w:t xml:space="preserve">Hayat, küçük güzelliklerle doludur.</w:t>
+      </w:r>
+    </w:p>
+    <w:p>
+      <w:r>
+        <w:t xml:space="preserve">Kendini seçmek bencillik değil, öz saygıdır.</w:t>
+      </w:r>
+    </w:p>
+    <w:p>
+      <w:r>
+        <w:t xml:space="preserve">Yolculuğunun her adımı bir anlam taşır.</w:t>
+      </w:r>
+    </w:p>
+    <w:p>
+      <w:r>
+        <w:t xml:space="preserve">Sevgi verdiğinde, sevgi çoğalır.</w:t>
+      </w:r>
+    </w:p>
+    <w:p>
+      <w:r>
+        <w:t xml:space="preserve">Her gün yeni bir farkındalık kazanıyorsun.</w:t>
+      </w:r>
+    </w:p>
+    <w:p>
+      <w:r>
+        <w:t xml:space="preserve">Hayatına güzellik katacak seçimler yapabilirsin.</w:t>
+      </w:r>
+    </w:p>
+    <w:p>
+      <w:r>
+        <w:t xml:space="preserve">Hayatın sunduğu fırsatlara açık ol.</w:t>
+      </w:r>
+    </w:p>
+    <w:p>
+      <w:r>
+        <w:t xml:space="preserve">Bugün kendin için güzel bir şey yap.</w:t>
+      </w:r>
+    </w:p>
+    <w:p>
+      <w:r>
+        <w:t xml:space="preserve">Hayat bazen yavaşlamanı ve nefes almanı ister.</w:t>
+      </w:r>
+    </w:p>
+    <w:p>
+      <w:r>
+        <w:t xml:space="preserve">Mutluluk bir varış noktası değil, bir yolculuktur.</w:t>
+      </w:r>
+    </w:p>
+    <w:p>
+      <w:r>
+        <w:t xml:space="preserve">İçindeki bilgelik, sana yol göstermeye devam ediyor.</w:t>
+      </w:r>
+    </w:p>
+    <w:p>
+      <w:r>
+        <w:t xml:space="preserve">Sabırlı ol; güzel şeyler filizleniyor.</w:t>
+      </w:r>
+    </w:p>
+    <w:p>
+      <w:r>
+        <w:t xml:space="preserve">Kalbini kapatma; hayat sürprizlerle dolu.</w:t>
+      </w:r>
+    </w:p>
+    <w:p>
+      <w:r>
+        <w:t xml:space="preserve">Senin varlığın bu dünyaya değer katıyor.</w:t>
       </w:r>
     </w:p>
     <w:sectPr/>
@@ -402,68 +937,7 @@
 </w:document>
 </file>
 
-<file path=word\fontTable.xml><?xml version="1.0" encoding="utf-8"?>
-<w:fonts xmlns:mc="http://schemas.openxmlformats.org/markup-compatibility/2006" xmlns:r="http://schemas.openxmlformats.org/officeDocument/2006/relationships" xmlns:w="http://schemas.openxmlformats.org/wordprocessingml/2006/main" xmlns:w14="http://schemas.microsoft.com/office/word/2010/wordml" xmlns:w15="http://schemas.microsoft.com/office/word/2012/wordml" xmlns:w16cex="http://schemas.microsoft.com/office/word/2018/wordml/cex" xmlns:w16cid="http://schemas.microsoft.com/office/word/2016/wordml/cid" xmlns:w16="http://schemas.microsoft.com/office/word/2018/wordml" xmlns:w16du="http://schemas.microsoft.com/office/word/2023/wordml/word16du" xmlns:w16sdtdh="http://schemas.microsoft.com/office/word/2020/wordml/sdtdatahash" xmlns:w16sdtfl="http://schemas.microsoft.com/office/word/2024/wordml/sdtformatlock" xmlns:w16se="http://schemas.microsoft.com/office/word/2015/wordml/symex" mc:Ignorable="w14 w15 w16se w16cid w16 w16cex w16sdtdh w16sdtfl w16du">
-  <w:font w:name="Symbol">
-    <w:panose1 w:val="05050102010706020507"/>
-    <w:charset w:val="02"/>
-    <w:family w:val="roman"/>
-    <w:pitch w:val="variable"/>
-    <w:sig w:usb0="00000000" w:usb1="10000000" w:usb2="00000000" w:usb3="00000000" w:csb0="80000000" w:csb1="00000000"/>
-  </w:font>
-  <w:font w:name="Times New Roman">
-    <w:panose1 w:val="02020603050405020304"/>
-    <w:charset w:val="00"/>
-    <w:family w:val="roman"/>
-    <w:pitch w:val="variable"/>
-    <w:sig w:usb0="E0002EFF" w:usb1="C000785B" w:usb2="00000009" w:usb3="00000000" w:csb0="000001FF" w:csb1="00000000"/>
-  </w:font>
-  <w:font w:name="Courier New">
-    <w:panose1 w:val="02070309020205020404"/>
-    <w:charset w:val="00"/>
-    <w:family w:val="modern"/>
-    <w:pitch w:val="fixed"/>
-    <w:sig w:usb0="E0002EFF" w:usb1="C0007843" w:usb2="00000009" w:usb3="00000000" w:csb0="000001FF" w:csb1="00000000"/>
-  </w:font>
-  <w:font w:name="Wingdings">
-    <w:panose1 w:val="05000000000000000000"/>
-    <w:charset w:val="02"/>
-    <w:family w:val="auto"/>
-    <w:pitch w:val="variable"/>
-    <w:sig w:usb0="00000000" w:usb1="10000000" w:usb2="00000000" w:usb3="00000000" w:csb0="80000000" w:csb1="00000000"/>
-  </w:font>
-  <w:font w:name="Calibri">
-    <w:panose1 w:val="020F0502020204030204"/>
-    <w:charset w:val="A2"/>
-    <w:family w:val="swiss"/>
-    <w:pitch w:val="variable"/>
-    <w:sig w:usb0="E4002EFF" w:usb1="C200247B" w:usb2="00000009" w:usb3="00000000" w:csb0="000001FF" w:csb1="00000000"/>
-  </w:font>
-  <w:font w:name="Calibri Light">
-    <w:panose1 w:val="020F0302020204030204"/>
-    <w:charset w:val="A2"/>
-    <w:family w:val="swiss"/>
-    <w:pitch w:val="variable"/>
-    <w:sig w:usb0="E4002EFF" w:usb1="C200247B" w:usb2="00000009" w:usb3="00000000" w:csb0="000001FF" w:csb1="00000000"/>
-  </w:font>
-  <w:font w:name="Arial">
-    <w:panose1 w:val="020B0604020202020204"/>
-    <w:charset w:val="00"/>
-    <w:family w:val="swiss"/>
-    <w:pitch w:val="variable"/>
-    <w:sig w:usb0="E0002EFF" w:usb1="C000785B" w:usb2="00000009" w:usb3="00000000" w:csb0="000001FF" w:csb1="00000000"/>
-  </w:font>
-  <w:font w:name="Segoe UI Emoji">
-    <w:panose1 w:val="020B0502040204020203"/>
-    <w:charset w:val="00"/>
-    <w:family w:val="swiss"/>
-    <w:pitch w:val="variable"/>
-    <w:sig w:usb0="00000003" w:usb1="02000000" w:usb2="08000000" w:usb3="00000000" w:csb0="00000001" w:csb1="00000000"/>
-  </w:font>
-</w:fonts>
-</file>
-
-<file path=word\numbering.xml><?xml version="1.0" encoding="utf-8"?>
+<file path=word/numbering.xml><?xml version="1.0" encoding="utf-8"?>
 <w:numbering xmlns:wpc="http://schemas.microsoft.com/office/word/2010/wordprocessingCanvas" xmlns:cx="http://schemas.microsoft.com/office/drawing/2014/chartex" xmlns:cx1="http://schemas.microsoft.com/office/drawing/2015/9/8/chartex" xmlns:cx2="http://schemas.microsoft.com/office/drawing/2015/10/21/chartex" xmlns:cx3="http://schemas.microsoft.com/office/drawing/2016/5/9/chartex" xmlns:cx4="http://schemas.microsoft.com/office/drawing/2016/5/10/chartex" xmlns:cx5="http://schemas.microsoft.com/office/drawing/2016/5/11/chartex" xmlns:cx6="http://schemas.microsoft.com/office/drawing/2016/5/12/chartex" xmlns:cx7="http://schemas.microsoft.com/office/drawing/2016/5/13/chartex" xmlns:cx8="http://schemas.microsoft.com/office/drawing/2016/5/14/chartex" xmlns:mc="http://schemas.openxmlformats.org/markup-compatibility/2006" xmlns:aink="http://schemas.microsoft.com/office/drawing/2016/ink" xmlns:am3d="http://schemas.microsoft.com/office/drawing/2017/model3d" xmlns:o="urn:schemas-microsoft-com:office:office" xmlns:oel="http://schemas.microsoft.com/office/2019/extlst" xmlns:r="http://schemas.openxmlformats.org/officeDocument/2006/relationships" xmlns:m="http://schemas.openxmlformats.org/officeDocument/2006/math" xmlns:v="urn:schemas-microsoft-com:vml" xmlns:wp14="http://schemas.microsoft.com/office/word/2010/wordprocessingDrawing" xmlns:wp="http://schemas.openxmlformats.org/drawingml/2006/wordprocessingDrawing" xmlns:w10="urn:schemas-microsoft-com:office:word" xmlns:w="http://schemas.openxmlformats.org/wordprocessingml/2006/main" xmlns:w14="http://schemas.microsoft.com/office/word/2010/wordml" xmlns:w15="http://schemas.microsoft.com/office/word/2012/wordml" xmlns:w16cex="http://schemas.microsoft.com/office/word/2018/wordml/cex" xmlns:w16cid="http://schemas.microsoft.com/office/word/2016/wordml/cid" xmlns:w16="http://schemas.microsoft.com/office/word/2018/wordml" xmlns:w16du="http://schemas.microsoft.com/office/word/2023/wordml/word16du" xmlns:w16sdtdh="http://schemas.microsoft.com/office/word/2020/wordml/sdtdatahash" xmlns:w16sdtfl="http://schemas.microsoft.com/office/word/2024/wordml/sdtformatlock" xmlns:w16se="http://schemas.microsoft.com/office/word/2015/wordml/symex" xmlns:wpg="http://schemas.microsoft.com/office/word/2010/wordprocessingGroup" xmlns:wpi="http://schemas.microsoft.com/office/word/2010/wordprocessingInk" xmlns:wne="http://schemas.microsoft.com/office/word/2006/wordml" xmlns:wps="http://schemas.microsoft.com/office/word/2010/wordprocessingShape" mc:Ignorable="w14 w15 w16se w16cid w16 w16cex w16sdtdh w16sdtfl w16du wp14">
   <w:abstractNum w:abstractNumId="0" w15:restartNumberingAfterBreak="0">
     <w:nsid w:val="00810E5F"/>
@@ -1211,6 +1685,119 @@
     </w:lvl>
   </w:abstractNum>
   <w:abstractNum w:abstractNumId="5" w15:restartNumberingAfterBreak="0">
+    <w:nsid w:val="0ECA0943"/>
+    <w:multiLevelType w:val="hybridMultilevel"/>
+    <w:tmpl w:val="FFB469FC"/>
+    <w:lvl w:ilvl="0" w:tplc="041F0001">
+      <w:start w:val="1"/>
+      <w:numFmt w:val="bullet"/>
+      <w:lvlText w:val=""/>
+      <w:lvlJc w:val="left"/>
+      <w:pPr>
+        <w:ind w:left="720" w:hanging="360"/>
+      </w:pPr>
+      <w:rPr>
+        <w:rFonts w:ascii="Symbol" w:hAnsi="Symbol" w:hint="default"/>
+      </w:rPr>
+    </w:lvl>
+    <w:lvl w:ilvl="1" w:tplc="041F0003" w:tentative="1">
+      <w:start w:val="1"/>
+      <w:numFmt w:val="bullet"/>
+      <w:lvlText w:val="o"/>
+      <w:lvlJc w:val="left"/>
+      <w:pPr>
+        <w:ind w:left="1440" w:hanging="360"/>
+      </w:pPr>
+      <w:rPr>
+        <w:rFonts w:ascii="Courier New" w:hAnsi="Courier New" w:cs="Courier New" w:hint="default"/>
+      </w:rPr>
+    </w:lvl>
+    <w:lvl w:ilvl="2" w:tplc="041F0005" w:tentative="1">
+      <w:start w:val="1"/>
+      <w:numFmt w:val="bullet"/>
+      <w:lvlText w:val=""/>
+      <w:lvlJc w:val="left"/>
+      <w:pPr>
+        <w:ind w:left="2160" w:hanging="360"/>
+      </w:pPr>
+      <w:rPr>
+        <w:rFonts w:ascii="Wingdings" w:hAnsi="Wingdings" w:hint="default"/>
+      </w:rPr>
+    </w:lvl>
+    <w:lvl w:ilvl="3" w:tplc="041F0001" w:tentative="1">
+      <w:start w:val="1"/>
+      <w:numFmt w:val="bullet"/>
+      <w:lvlText w:val=""/>
+      <w:lvlJc w:val="left"/>
+      <w:pPr>
+        <w:ind w:left="2880" w:hanging="360"/>
+      </w:pPr>
+      <w:rPr>
+        <w:rFonts w:ascii="Symbol" w:hAnsi="Symbol" w:hint="default"/>
+      </w:rPr>
+    </w:lvl>
+    <w:lvl w:ilvl="4" w:tplc="041F0003" w:tentative="1">
+      <w:start w:val="1"/>
+      <w:numFmt w:val="bullet"/>
+      <w:lvlText w:val="o"/>
+      <w:lvlJc w:val="left"/>
+      <w:pPr>
+        <w:ind w:left="3600" w:hanging="360"/>
+      </w:pPr>
+      <w:rPr>
+        <w:rFonts w:ascii="Courier New" w:hAnsi="Courier New" w:cs="Courier New" w:hint="default"/>
+      </w:rPr>
+    </w:lvl>
+    <w:lvl w:ilvl="5" w:tplc="041F0005" w:tentative="1">
+      <w:start w:val="1"/>
+      <w:numFmt w:val="bullet"/>
+      <w:lvlText w:val=""/>
+      <w:lvlJc w:val="left"/>
+      <w:pPr>
+        <w:ind w:left="4320" w:hanging="360"/>
+      </w:pPr>
+      <w:rPr>
+        <w:rFonts w:ascii="Wingdings" w:hAnsi="Wingdings" w:hint="default"/>
+      </w:rPr>
+    </w:lvl>
+    <w:lvl w:ilvl="6" w:tplc="041F0001" w:tentative="1">
+      <w:start w:val="1"/>
+      <w:numFmt w:val="bullet"/>
+      <w:lvlText w:val=""/>
+      <w:lvlJc w:val="left"/>
+      <w:pPr>
+        <w:ind w:left="5040" w:hanging="360"/>
+      </w:pPr>
+      <w:rPr>
+        <w:rFonts w:ascii="Symbol" w:hAnsi="Symbol" w:hint="default"/>
+      </w:rPr>
+    </w:lvl>
+    <w:lvl w:ilvl="7" w:tplc="041F0003" w:tentative="1">
+      <w:start w:val="1"/>
+      <w:numFmt w:val="bullet"/>
+      <w:lvlText w:val="o"/>
+      <w:lvlJc w:val="left"/>
+      <w:pPr>
+        <w:ind w:left="5760" w:hanging="360"/>
+      </w:pPr>
+      <w:rPr>
+        <w:rFonts w:ascii="Courier New" w:hAnsi="Courier New" w:cs="Courier New" w:hint="default"/>
+      </w:rPr>
+    </w:lvl>
+    <w:lvl w:ilvl="8" w:tplc="041F0005" w:tentative="1">
+      <w:start w:val="1"/>
+      <w:numFmt w:val="bullet"/>
+      <w:lvlText w:val=""/>
+      <w:lvlJc w:val="left"/>
+      <w:pPr>
+        <w:ind w:left="6480" w:hanging="360"/>
+      </w:pPr>
+      <w:rPr>
+        <w:rFonts w:ascii="Wingdings" w:hAnsi="Wingdings" w:hint="default"/>
+      </w:rPr>
+    </w:lvl>
+  </w:abstractNum>
+  <w:abstractNum w:abstractNumId="6" w15:restartNumberingAfterBreak="0">
     <w:nsid w:val="48117FD7"/>
     <w:multiLevelType w:val="multilevel"/>
     <w:tmpl w:val="524A6814"/>
@@ -1359,7 +1946,7 @@
       </w:rPr>
     </w:lvl>
   </w:abstractNum>
-  <w:abstractNum w:abstractNumId="6" w15:restartNumberingAfterBreak="0">
+  <w:abstractNum w:abstractNumId="7" w15:restartNumberingAfterBreak="0">
     <w:nsid w:val="51E17304"/>
     <w:multiLevelType w:val="hybridMultilevel"/>
     <w:tmpl w:val="0D0CF4F4"/>
@@ -1472,7 +2059,7 @@
       </w:rPr>
     </w:lvl>
   </w:abstractNum>
-  <w:abstractNum w:abstractNumId="7" w15:restartNumberingAfterBreak="0">
+  <w:abstractNum w:abstractNumId="8" w15:restartNumberingAfterBreak="0">
     <w:nsid w:val="55DF1DD9"/>
     <w:multiLevelType w:val="multilevel"/>
     <w:tmpl w:val="9482B5BE"/>
@@ -1621,7 +2208,7 @@
       </w:rPr>
     </w:lvl>
   </w:abstractNum>
-  <w:abstractNum w:abstractNumId="8" w15:restartNumberingAfterBreak="0">
+  <w:abstractNum w:abstractNumId="9" w15:restartNumberingAfterBreak="0">
     <w:nsid w:val="7599526F"/>
     <w:multiLevelType w:val="multilevel"/>
     <w:tmpl w:val="684ED2C8"/>
@@ -1770,7 +2357,7 @@
       </w:rPr>
     </w:lvl>
   </w:abstractNum>
-  <w:abstractNum w:abstractNumId="9" w15:restartNumberingAfterBreak="0">
+  <w:abstractNum w:abstractNumId="10" w15:restartNumberingAfterBreak="0">
     <w:nsid w:val="7F8E37D4"/>
     <w:multiLevelType w:val="hybridMultilevel"/>
     <w:tmpl w:val="053889BE"/>
@@ -1893,7 +2480,7 @@
     <w:abstractNumId w:val="1"/>
   </w:num>
   <w:num w:numId="4" w16cid:durableId="458424394">
-    <w:abstractNumId w:val="5"/>
+    <w:abstractNumId w:val="6"/>
   </w:num>
   <w:num w:numId="5" w16cid:durableId="1650136406">
     <w:abstractNumId w:val="4"/>
@@ -1902,80 +2489,24 @@
     <w:abstractNumId w:val="3"/>
   </w:num>
   <w:num w:numId="7" w16cid:durableId="1977105847">
+    <w:abstractNumId w:val="8"/>
+  </w:num>
+  <w:num w:numId="8" w16cid:durableId="1953123623">
+    <w:abstractNumId w:val="9"/>
+  </w:num>
+  <w:num w:numId="9" w16cid:durableId="890766702">
+    <w:abstractNumId w:val="10"/>
+  </w:num>
+  <w:num w:numId="10" w16cid:durableId="1894658479">
     <w:abstractNumId w:val="7"/>
   </w:num>
-  <w:num w:numId="8" w16cid:durableId="1953123623">
-    <w:abstractNumId w:val="8"/>
-  </w:num>
-  <w:num w:numId="9" w16cid:durableId="890766702">
-    <w:abstractNumId w:val="9"/>
-  </w:num>
-  <w:num w:numId="10" w16cid:durableId="1894658479">
-    <w:abstractNumId w:val="6"/>
+  <w:num w:numId="11" w16cid:durableId="1102921498">
+    <w:abstractNumId w:val="5"/>
   </w:num>
 </w:numbering>
 </file>
 
-<file path=word\settings.xml><?xml version="1.0" encoding="utf-8"?>
-<w:settings xmlns:mc="http://schemas.openxmlformats.org/markup-compatibility/2006" xmlns:o="urn:schemas-microsoft-com:office:office" xmlns:r="http://schemas.openxmlformats.org/officeDocument/2006/relationships" xmlns:m="http://schemas.openxmlformats.org/officeDocument/2006/math" xmlns:v="urn:schemas-microsoft-com:vml" xmlns:w10="urn:schemas-microsoft-com:office:word" xmlns:w="http://schemas.openxmlformats.org/wordprocessingml/2006/main" xmlns:w14="http://schemas.microsoft.com/office/word/2010/wordml" xmlns:w15="http://schemas.microsoft.com/office/word/2012/wordml" xmlns:w16cex="http://schemas.microsoft.com/office/word/2018/wordml/cex" xmlns:w16cid="http://schemas.microsoft.com/office/word/2016/wordml/cid" xmlns:w16="http://schemas.microsoft.com/office/word/2018/wordml" xmlns:w16du="http://schemas.microsoft.com/office/word/2023/wordml/word16du" xmlns:w16sdtdh="http://schemas.microsoft.com/office/word/2020/wordml/sdtdatahash" xmlns:w16sdtfl="http://schemas.microsoft.com/office/word/2024/wordml/sdtformatlock" xmlns:w16se="http://schemas.microsoft.com/office/word/2015/wordml/symex" xmlns:sl="http://schemas.openxmlformats.org/schemaLibrary/2006/main" mc:Ignorable="w14 w15 w16se w16cid w16 w16cex w16sdtdh w16sdtfl w16du">
-  <w:zoom w:percent="130"/>
-  <w:proofState w:spelling="clean"/>
-  <w:defaultTabStop w:val="708"/>
-  <w:hyphenationZone w:val="425"/>
-  <w:characterSpacingControl w:val="doNotCompress"/>
-  <w:compat>
-    <w:compatSetting w:name="compatibilityMode" w:uri="http://schemas.microsoft.com/office/word" w:val="15"/>
-    <w:compatSetting w:name="overrideTableStyleFontSizeAndJustification" w:uri="http://schemas.microsoft.com/office/word" w:val="1"/>
-    <w:compatSetting w:name="enableOpenTypeFeatures" w:uri="http://schemas.microsoft.com/office/word" w:val="1"/>
-    <w:compatSetting w:name="doNotFlipMirrorIndents" w:uri="http://schemas.microsoft.com/office/word" w:val="1"/>
-    <w:compatSetting w:name="differentiateMultirowTableHeaders" w:uri="http://schemas.microsoft.com/office/word" w:val="1"/>
-    <w:compatSetting w:name="useWord2013TrackBottomHyphenation" w:uri="http://schemas.microsoft.com/office/word" w:val="0"/>
-  </w:compat>
-  <w:rsids>
-    <w:rsidRoot w:val="0099124B"/>
-    <w:rsid w:val="00017230"/>
-    <w:rsid w:val="000E0F9D"/>
-    <w:rsid w:val="00263EB9"/>
-    <w:rsid w:val="0045422F"/>
-    <w:rsid w:val="0086645E"/>
-    <w:rsid w:val="008C1721"/>
-    <w:rsid w:val="0099124B"/>
-    <w:rsid w:val="00A02BA4"/>
-    <w:rsid w:val="00A270CD"/>
-    <w:rsid w:val="00C87377"/>
-    <w:rsid w:val="00EF009E"/>
-    <w:rsid w:val="00F53633"/>
-  </w:rsids>
-  <m:mathPr>
-    <m:mathFont m:val="Cambria Math"/>
-    <m:brkBin m:val="before"/>
-    <m:brkBinSub m:val="--"/>
-    <m:smallFrac m:val="0"/>
-    <m:dispDef/>
-    <m:lMargin m:val="0"/>
-    <m:rMargin m:val="0"/>
-    <m:defJc m:val="centerGroup"/>
-    <m:wrapIndent m:val="1440"/>
-    <m:intLim m:val="subSup"/>
-    <m:naryLim m:val="undOvr"/>
-  </m:mathPr>
-  <w:themeFontLang w:val="tr-TR"/>
-  <w:clrSchemeMapping w:bg1="light1" w:t1="dark1" w:bg2="light2" w:t2="dark2" w:accent1="accent1" w:accent2="accent2" w:accent3="accent3" w:accent4="accent4" w:accent5="accent5" w:accent6="accent6" w:hyperlink="hyperlink" w:followedHyperlink="followedHyperlink"/>
-  <w:shapeDefaults>
-    <o:shapedefaults v:ext="edit" spidmax="1026"/>
-    <o:shapelayout v:ext="edit">
-      <o:idmap v:ext="edit" data="1"/>
-    </o:shapelayout>
-  </w:shapeDefaults>
-  <w:decimalSymbol w:val=","/>
-  <w:listSeparator w:val=";"/>
-  <w14:docId w14:val="775845E7"/>
-  <w15:chartTrackingRefBased/>
-  <w15:docId w15:val="{CD503B78-E9A0-4E77-9425-6597806D5085}"/>
-</w:settings>
-</file>
-
-<file path=word\styles.xml><?xml version="1.0" encoding="utf-8"?>
+<file path=word/styles.xml><?xml version="1.0" encoding="utf-8"?>
 <w:styles xmlns:mc="http://schemas.openxmlformats.org/markup-compatibility/2006" xmlns:r="http://schemas.openxmlformats.org/officeDocument/2006/relationships" xmlns:w="http://schemas.openxmlformats.org/wordprocessingml/2006/main" xmlns:w14="http://schemas.microsoft.com/office/word/2010/wordml" xmlns:w15="http://schemas.microsoft.com/office/word/2012/wordml" xmlns:w16cex="http://schemas.microsoft.com/office/word/2018/wordml/cex" xmlns:w16cid="http://schemas.microsoft.com/office/word/2016/wordml/cid" xmlns:w16="http://schemas.microsoft.com/office/word/2018/wordml" xmlns:w16du="http://schemas.microsoft.com/office/word/2023/wordml/word16du" xmlns:w16sdtdh="http://schemas.microsoft.com/office/word/2020/wordml/sdtdatahash" xmlns:w16sdtfl="http://schemas.microsoft.com/office/word/2024/wordml/sdtformatlock" xmlns:w16se="http://schemas.microsoft.com/office/word/2015/wordml/symex" mc:Ignorable="w14 w15 w16se w16cid w16 w16cex w16sdtdh w16sdtfl w16du">
   <w:docDefaults>
     <w:rPrDefault>
@@ -2921,10 +3452,33 @@
       <w:bCs/>
     </w:rPr>
   </w:style>
+  <w:style w:type="character" w:styleId="Kpr">
+    <w:name w:val="Hyperlink"/>
+    <w:basedOn w:val="VarsaylanParagrafYazTipi"/>
+    <w:uiPriority w:val="99"/>
+    <w:unhideWhenUsed/>
+    <w:rsid w:val="0036220B"/>
+    <w:rPr>
+      <w:color w:val="0563C1" w:themeColor="hyperlink"/>
+      <w:u w:val="single"/>
+    </w:rPr>
+  </w:style>
+  <w:style w:type="character" w:styleId="zmlenmeyenBahsetme">
+    <w:name w:val="Unresolved Mention"/>
+    <w:basedOn w:val="VarsaylanParagrafYazTipi"/>
+    <w:uiPriority w:val="99"/>
+    <w:semiHidden/>
+    <w:unhideWhenUsed/>
+    <w:rsid w:val="0036220B"/>
+    <w:rPr>
+      <w:color w:val="605E5C"/>
+      <w:shd w:val="clear" w:color="auto" w:fill="E1DFDD"/>
+    </w:rPr>
+  </w:style>
 </w:styles>
 </file>
 
-<file path=word\theme\theme1.xml><?xml version="1.0" encoding="utf-8"?>
+<file path=word/theme/theme1.xml><?xml version="1.0" encoding="utf-8"?>
 <a:theme xmlns:a="http://schemas.openxmlformats.org/drawingml/2006/main" name="Office Teması">
   <a:themeElements>
     <a:clrScheme name="Office">
@@ -3217,12 +3771,4 @@
     </a:ext>
   </a:extLst>
 </a:theme>
-</file>
-
-<file path=word\webSettings.xml><?xml version="1.0" encoding="utf-8"?>
-<w:webSettings xmlns:mc="http://schemas.openxmlformats.org/markup-compatibility/2006" xmlns:r="http://schemas.openxmlformats.org/officeDocument/2006/relationships" xmlns:w="http://schemas.openxmlformats.org/wordprocessingml/2006/main" xmlns:w14="http://schemas.microsoft.com/office/word/2010/wordml" xmlns:w15="http://schemas.microsoft.com/office/word/2012/wordml" xmlns:w16cex="http://schemas.microsoft.com/office/word/2018/wordml/cex" xmlns:w16cid="http://schemas.microsoft.com/office/word/2016/wordml/cid" xmlns:w16="http://schemas.microsoft.com/office/word/2018/wordml" xmlns:w16du="http://schemas.microsoft.com/office/word/2023/wordml/word16du" xmlns:w16sdtdh="http://schemas.microsoft.com/office/word/2020/wordml/sdtdatahash" xmlns:w16sdtfl="http://schemas.microsoft.com/office/word/2024/wordml/sdtformatlock" xmlns:w16se="http://schemas.microsoft.com/office/word/2015/wordml/symex" mc:Ignorable="w14 w15 w16se w16cid w16 w16cex w16sdtdh w16sdtfl w16du">
-  <w:optimizeForBrowser/>
-  <w:relyOnVML/>
-  <w:allowPNG/>
-</w:webSettings>
 </file>
</xml_diff>

<commit_message>
Acilis+Evren havuzu: 29 yeni cumle eklendi (186 -> 215 benzersiz)
Kullanicinin verdigi 30 cumle Word'e ve ortak havuza eklendi; mevcutla tam ayni olan 1 cumle (zaten vardi) otomatik ayiklandi -> 215 benzersiz. Acilis + Evren ayni havuzu kullanmaya devam ediyor; tam dongu rotasyon korundu. v117.

Co-Authored-By: Claude Opus 4.8 <noreply@anthropic.com>
</commit_message>
<xml_diff>
--- a/Açılış cümlelerim/Açılış cümleleri.docx
+++ b/Açılış cümlelerim/Açılış cümleleri.docx
@@ -930,6 +930,151 @@
     <w:p>
       <w:r>
         <w:t xml:space="preserve">Senin varlığın bu dünyaya değer katıyor.</w:t>
+      </w:r>
+    </w:p>
+    <w:p>
+      <w:r>
+        <w:t xml:space="preserve">Bugün kendine verdiğin zaman, en değerli yatırımlardan biridir.</w:t>
+      </w:r>
+    </w:p>
+    <w:p>
+      <w:r>
+        <w:t xml:space="preserve">Kalbinde taşıdığın umut seni ileriye taşır.</w:t>
+      </w:r>
+    </w:p>
+    <w:p>
+      <w:r>
+        <w:t xml:space="preserve">Her gün, içinde yeni bir başlangıç saklar.</w:t>
+      </w:r>
+    </w:p>
+    <w:p>
+      <w:r>
+        <w:t xml:space="preserve">Kendine güvenerek attığın adımlar hayatını değiştirir.</w:t>
+      </w:r>
+    </w:p>
+    <w:p>
+      <w:r>
+        <w:t xml:space="preserve">İçindeki ışık her zaman sana yol göstermeye hazırdır.</w:t>
+      </w:r>
+    </w:p>
+    <w:p>
+      <w:r>
+        <w:t xml:space="preserve">Hayatın güzelliklerini fark ettikçe çoğaldıklarını görürsün.</w:t>
+      </w:r>
+    </w:p>
+    <w:p>
+      <w:r>
+        <w:t xml:space="preserve">Bugün huzuru seçebilirsin.</w:t>
+      </w:r>
+    </w:p>
+    <w:p>
+      <w:r>
+        <w:t xml:space="preserve">Kendi değerini hatırladığında her şey değişmeye başlar.</w:t>
+      </w:r>
+    </w:p>
+    <w:p>
+      <w:r>
+        <w:t xml:space="preserve">Bazen en doğru adım, durup nefes almaktır.</w:t>
+      </w:r>
+    </w:p>
+    <w:p>
+      <w:r>
+        <w:t xml:space="preserve">Sen büyüdükçe hayallerin de büyür.</w:t>
+      </w:r>
+    </w:p>
+    <w:p>
+      <w:r>
+        <w:t xml:space="preserve">Her yeni deneyim seni daha güçlü yapar.</w:t>
+      </w:r>
+    </w:p>
+    <w:p>
+      <w:r>
+        <w:t xml:space="preserve">Kendine inanmak, değişimin kapısını aralar.</w:t>
+      </w:r>
+    </w:p>
+    <w:p>
+      <w:r>
+        <w:t xml:space="preserve">Bugün kendine biraz daha şefkat göster.</w:t>
+      </w:r>
+    </w:p>
+    <w:p>
+      <w:r>
+        <w:t xml:space="preserve">Hayat seni düşündüğünden daha fazla destekliyor.</w:t>
+      </w:r>
+    </w:p>
+    <w:p>
+      <w:r>
+        <w:t xml:space="preserve">Ruhunu dinlendirdiğinde cevaplar daha net görünür.</w:t>
+      </w:r>
+    </w:p>
+    <w:p>
+      <w:r>
+        <w:t xml:space="preserve">İçindeki bilgelik sana doğru zamanı gösterecektir.</w:t>
+      </w:r>
+    </w:p>
+    <w:p>
+      <w:r>
+        <w:t xml:space="preserve">Küçük mutluluklar, büyük huzurların temelidir.</w:t>
+      </w:r>
+    </w:p>
+    <w:p>
+      <w:r>
+        <w:t xml:space="preserve">Hayatın ritmine güvenmeyi öğren.</w:t>
+      </w:r>
+    </w:p>
+    <w:p>
+      <w:r>
+        <w:t xml:space="preserve">Bugün sahip olduklarının kıymetini fark et.</w:t>
+      </w:r>
+    </w:p>
+    <w:p>
+      <w:r>
+        <w:t xml:space="preserve">Yolculuğunun her adımı seni kendine yaklaştırıyor.</w:t>
+      </w:r>
+    </w:p>
+    <w:p>
+      <w:r>
+        <w:t xml:space="preserve">Kalbin açık olduğunda güzellikler seni bulur.</w:t>
+      </w:r>
+    </w:p>
+    <w:p>
+      <w:r>
+        <w:t xml:space="preserve">Bugün içindeki gücü hatırla.</w:t>
+      </w:r>
+    </w:p>
+    <w:p>
+      <w:r>
+        <w:t xml:space="preserve">Kendine duyduğun sevgi hayatına yansır.</w:t>
+      </w:r>
+    </w:p>
+    <w:p>
+      <w:r>
+        <w:t xml:space="preserve">Her sabah yeni bir umutla uyanabilirsin.</w:t>
+      </w:r>
+    </w:p>
+    <w:p>
+      <w:r>
+        <w:t xml:space="preserve">İlerlemek için yalnızca bir adım yeterlidir.</w:t>
+      </w:r>
+    </w:p>
+    <w:p>
+      <w:r>
+        <w:t xml:space="preserve">Kendi ışığını kabul ettiğinde parlamaya başlarsın.</w:t>
+      </w:r>
+    </w:p>
+    <w:p>
+      <w:r>
+        <w:t xml:space="preserve">Bugün iyi şeylerin mümkün olduğuna inan.</w:t>
+      </w:r>
+    </w:p>
+    <w:p>
+      <w:r>
+        <w:t xml:space="preserve">Hayatındaki her mevsimin bir anlamı vardır.</w:t>
+      </w:r>
+    </w:p>
+    <w:p>
+      <w:r>
+        <w:t xml:space="preserve">Sen olduğun hâlinle değerlisin.</w:t>
       </w:r>
     </w:p>
     <w:sectPr/>

</xml_diff>

<commit_message>
Acilis+Evren havuzu: 30 yeni cumle eklendi (215 -> 245 benzersiz)
Kullanicinin verdigi 30 cumle Word'e ve ortak havuza eklendi (kucuk noktalama duzeni). Tum havuz tam dongu rotasyonla calisir. Edge Function havuzu canliden cektigi icin bildirimler de otomatik 245'i kullanacak (yeniden dagitim gerekmedi). v118.

Co-Authored-By: Claude Opus 4.8 <noreply@anthropic.com>
</commit_message>
<xml_diff>
--- a/Açılış cümlelerim/Açılış cümleleri.docx
+++ b/Açılış cümlelerim/Açılış cümleleri.docx
@@ -1075,6 +1075,156 @@
     <w:p>
       <w:r>
         <w:t xml:space="preserve">Sen olduğun hâlinle değerlisin.</w:t>
+      </w:r>
+    </w:p>
+    <w:p>
+      <w:r>
+        <w:t xml:space="preserve">Bugün kendin için yaptığın küçük bir iyilik, gününü değiştirebilir.</w:t>
+      </w:r>
+    </w:p>
+    <w:p>
+      <w:r>
+        <w:t xml:space="preserve">Kalbinin sesini duydukça yolun aydınlanır.</w:t>
+      </w:r>
+    </w:p>
+    <w:p>
+      <w:r>
+        <w:t xml:space="preserve">Her yeni gün, içinde keşfedilmeyi bekleyen güzellikler taşır.</w:t>
+      </w:r>
+    </w:p>
+    <w:p>
+      <w:r>
+        <w:t xml:space="preserve">Hayat bazen yavaş ilerler, ama yine de ilerler.</w:t>
+      </w:r>
+    </w:p>
+    <w:p>
+      <w:r>
+        <w:t xml:space="preserve">Kendine verdiğin değer, seçimlerine yansır.</w:t>
+      </w:r>
+    </w:p>
+    <w:p>
+      <w:r>
+        <w:t xml:space="preserve">İçindeki sakinlik, en güçlü rehberlerinden biridir.</w:t>
+      </w:r>
+    </w:p>
+    <w:p>
+      <w:r>
+        <w:t xml:space="preserve">Bugün sadece bir adım atman bile yeterlidir.</w:t>
+      </w:r>
+    </w:p>
+    <w:p>
+      <w:r>
+        <w:t xml:space="preserve">Hayatın sana sunduğu derslere açık ol.</w:t>
+      </w:r>
+    </w:p>
+    <w:p>
+      <w:r>
+        <w:t xml:space="preserve">Kendine güvenmek, özgürlüğün başlangıcıdır.</w:t>
+      </w:r>
+    </w:p>
+    <w:p>
+      <w:r>
+        <w:t xml:space="preserve">Her gün biraz daha kendin oluyorsun.</w:t>
+      </w:r>
+    </w:p>
+    <w:p>
+      <w:r>
+        <w:t xml:space="preserve">Zihnin dinlendiğinde, kalbin daha net konuşur.</w:t>
+      </w:r>
+    </w:p>
+    <w:p>
+      <w:r>
+        <w:t xml:space="preserve">Bugün umut etmeyi bırakma.</w:t>
+      </w:r>
+    </w:p>
+    <w:p>
+      <w:r>
+        <w:t xml:space="preserve">Kendine gösterdiğin anlayış, ruhunu güçlendirir.</w:t>
+      </w:r>
+    </w:p>
+    <w:p>
+      <w:r>
+        <w:t xml:space="preserve">Hayatın akışı, bazen seni beklediğinden daha güzel yerlere götürür.</w:t>
+      </w:r>
+    </w:p>
+    <w:p>
+      <w:r>
+        <w:t xml:space="preserve">İçindeki ışık, paylaşılmak için vardır.</w:t>
+      </w:r>
+    </w:p>
+    <w:p>
+      <w:r>
+        <w:t xml:space="preserve">Her nefes, sana yeniden başlama şansı verir.</w:t>
+      </w:r>
+    </w:p>
+    <w:p>
+      <w:r>
+        <w:t xml:space="preserve">Kendi yolculuğunu başkalarınınkiyle kıyaslama.</w:t>
+      </w:r>
+    </w:p>
+    <w:p>
+      <w:r>
+        <w:t xml:space="preserve">Bugün de öğrenmek ve büyümek için güzel bir gün.</w:t>
+      </w:r>
+    </w:p>
+    <w:p>
+      <w:r>
+        <w:t xml:space="preserve">Kalbinde taşıdığın sevgi, en büyük gücündür.</w:t>
+      </w:r>
+    </w:p>
+    <w:p>
+      <w:r>
+        <w:t xml:space="preserve">Bazen cevaplar, sessizliğin içinde saklıdır.</w:t>
+      </w:r>
+    </w:p>
+    <w:p>
+      <w:r>
+        <w:t xml:space="preserve">Hayatındaki küçük mucizeleri fark etmeyi seç.</w:t>
+      </w:r>
+    </w:p>
+    <w:p>
+      <w:r>
+        <w:t xml:space="preserve">Kendine inandığında sınırların değişir.</w:t>
+      </w:r>
+    </w:p>
+    <w:p>
+      <w:r>
+        <w:t xml:space="preserve">Bugün iç huzuruna öncelik ver.</w:t>
+      </w:r>
+    </w:p>
+    <w:p>
+      <w:r>
+        <w:t xml:space="preserve">Her son, yeni bir başlangıcın habercisidir.</w:t>
+      </w:r>
+    </w:p>
+    <w:p>
+      <w:r>
+        <w:t xml:space="preserve">Kendini geliştirmek bir yarış değil, bir yolculuktur.</w:t>
+      </w:r>
+    </w:p>
+    <w:p>
+      <w:r>
+        <w:t xml:space="preserve">Güzel şeyler, çoğu zaman sabrın ardından gelir.</w:t>
+      </w:r>
+    </w:p>
+    <w:p>
+      <w:r>
+        <w:t xml:space="preserve">Bugün sahip olduğun güç, dün hayalini kurduğun şey olabilir.</w:t>
+      </w:r>
+    </w:p>
+    <w:p>
+      <w:r>
+        <w:t xml:space="preserve">Ruhuna iyi gelen şeylere daha çok yer aç.</w:t>
+      </w:r>
+    </w:p>
+    <w:p>
+      <w:r>
+        <w:t xml:space="preserve">Her gün yeni bir umut taşır.</w:t>
+      </w:r>
+    </w:p>
+    <w:p>
+      <w:r>
+        <w:t xml:space="preserve">Sen, kendi ışığını taşıyan eşsiz bir insansın.</w:t>
       </w:r>
     </w:p>
     <w:sectPr/>

</xml_diff>

<commit_message>
Acilis+Evren havuzu: 30 yeni cumle eklendi (245 -> 275 benzersiz)
Co-Authored-By: Claude Opus 4.8 <noreply@anthropic.com>
</commit_message>
<xml_diff>
--- a/Açılış cümlelerim/Açılış cümleleri.docx
+++ b/Açılış cümlelerim/Açılış cümleleri.docx
@@ -1225,6 +1225,156 @@
     <w:p>
       <w:r>
         <w:t xml:space="preserve">Sen, kendi ışığını taşıyan eşsiz bir insansın.</w:t>
+      </w:r>
+    </w:p>
+    <w:p>
+      <w:r>
+        <w:t xml:space="preserve">Bugün, kendine biraz daha yakınlaşmak için güzel bir gün.</w:t>
+      </w:r>
+    </w:p>
+    <w:p>
+      <w:r>
+        <w:t xml:space="preserve">İçindeki huzur, dış dünyandan daha güçlüdür.</w:t>
+      </w:r>
+    </w:p>
+    <w:p>
+      <w:r>
+        <w:t xml:space="preserve">Her gün yeni bir bakış açısı kazanabilirsin.</w:t>
+      </w:r>
+    </w:p>
+    <w:p>
+      <w:r>
+        <w:t xml:space="preserve">Kendine verdiğin sözler hayatını şekillendirir.</w:t>
+      </w:r>
+    </w:p>
+    <w:p>
+      <w:r>
+        <w:t xml:space="preserve">Bugün sahip olduğun şeyler, bir zamanlar hayalindi.</w:t>
+      </w:r>
+    </w:p>
+    <w:p>
+      <w:r>
+        <w:t xml:space="preserve">Kalbinin rehberliğine güvenmekten korkma.</w:t>
+      </w:r>
+    </w:p>
+    <w:p>
+      <w:r>
+        <w:t xml:space="preserve">Her deneyim seni daha bilge bir insana dönüştürüyor.</w:t>
+      </w:r>
+    </w:p>
+    <w:p>
+      <w:r>
+        <w:t xml:space="preserve">Hayatın sana sunduğu güzellikleri görmeye niyet et.</w:t>
+      </w:r>
+    </w:p>
+    <w:p>
+      <w:r>
+        <w:t xml:space="preserve">Küçük bir farkındalık, büyük değişimlerin başlangıcı olabilir.</w:t>
+      </w:r>
+    </w:p>
+    <w:p>
+      <w:r>
+        <w:t xml:space="preserve">Bugün kendine iyi davranmayı seç.</w:t>
+      </w:r>
+    </w:p>
+    <w:p>
+      <w:r>
+        <w:t xml:space="preserve">İçindeki sessizlik, bazen en doğru cevapları taşır.</w:t>
+      </w:r>
+    </w:p>
+    <w:p>
+      <w:r>
+        <w:t xml:space="preserve">Her gün yeni bir umut filizlenir.</w:t>
+      </w:r>
+    </w:p>
+    <w:p>
+      <w:r>
+        <w:t xml:space="preserve">Ruhunu besleyen şeylere zaman ayır.</w:t>
+      </w:r>
+    </w:p>
+    <w:p>
+      <w:r>
+        <w:t xml:space="preserve">Kendi ışığını keşfetmek bir yolculuktur.</w:t>
+      </w:r>
+    </w:p>
+    <w:p>
+      <w:r>
+        <w:t xml:space="preserve">Hayatın akışına güvendikçe yüklerin hafifler.</w:t>
+      </w:r>
+    </w:p>
+    <w:p>
+      <w:r>
+        <w:t xml:space="preserve">Bugün olduğun kişi olmak için çok yol kat ettin.</w:t>
+      </w:r>
+    </w:p>
+    <w:p>
+      <w:r>
+        <w:t xml:space="preserve">Kendine duyduğun saygı hayatını dönüştürür.</w:t>
+      </w:r>
+    </w:p>
+    <w:p>
+      <w:r>
+        <w:t xml:space="preserve">Her sabah yeni ihtimallerle doğar.</w:t>
+      </w:r>
+    </w:p>
+    <w:p>
+      <w:r>
+        <w:t xml:space="preserve">İçindeki sevgi büyüdükçe dünyan da genişler.</w:t>
+      </w:r>
+    </w:p>
+    <w:p>
+      <w:r>
+        <w:t xml:space="preserve">Bugün bir şeyleri değiştirmek için doğru zaman olabilir.</w:t>
+      </w:r>
+    </w:p>
+    <w:p>
+      <w:r>
+        <w:t xml:space="preserve">Kendine inanmak, cesaretin en güzel hâlidir.</w:t>
+      </w:r>
+    </w:p>
+    <w:p>
+      <w:r>
+        <w:t xml:space="preserve">Hayat bazen en güzel sürprizlerini beklenmedik anlarda getirir.</w:t>
+      </w:r>
+    </w:p>
+    <w:p>
+      <w:r>
+        <w:t xml:space="preserve">Kendi değerini hatırladığında yolun netleşir.</w:t>
+      </w:r>
+    </w:p>
+    <w:p>
+      <w:r>
+        <w:t xml:space="preserve">Bugün kalbini güzelliklere aç.</w:t>
+      </w:r>
+    </w:p>
+    <w:p>
+      <w:r>
+        <w:t xml:space="preserve">Her adım seni olmak istediğin kişiye yaklaştırıyor.</w:t>
+      </w:r>
+    </w:p>
+    <w:p>
+      <w:r>
+        <w:t xml:space="preserve">Geçmişten öğrendiklerin geleceğini güçlendirir.</w:t>
+      </w:r>
+    </w:p>
+    <w:p>
+      <w:r>
+        <w:t xml:space="preserve">Ruhunun ihtiyaçlarını dinlemeyi unutma.</w:t>
+      </w:r>
+    </w:p>
+    <w:p>
+      <w:r>
+        <w:t xml:space="preserve">Hayatın içinde sana ayrılmış güzel bir yer var.</w:t>
+      </w:r>
+    </w:p>
+    <w:p>
+      <w:r>
+        <w:t xml:space="preserve">Bugün ışığını biraz daha büyütebilirsin.</w:t>
+      </w:r>
+    </w:p>
+    <w:p>
+      <w:r>
+        <w:t xml:space="preserve">Senin yolculuğun sana özeldir ve değerlidir.</w:t>
       </w:r>
     </w:p>
     <w:sectPr/>

</xml_diff>

<commit_message>
Acilis+Evren havuzu: 30 yeni cumle eklendi (275 -> 305 benzersiz)
Co-Authored-By: Claude Opus 4.8 <noreply@anthropic.com>
</commit_message>
<xml_diff>
--- a/Açılış cümlelerim/Açılış cümleleri.docx
+++ b/Açılış cümlelerim/Açılış cümleleri.docx
@@ -1375,6 +1375,156 @@
     <w:p>
       <w:r>
         <w:t xml:space="preserve">Senin yolculuğun sana özeldir ve değerlidir.</w:t>
+      </w:r>
+    </w:p>
+    <w:p>
+      <w:r>
+        <w:t xml:space="preserve">Bugün kendine vereceğin en güzel hediye, iç huzurundur.</w:t>
+      </w:r>
+    </w:p>
+    <w:p>
+      <w:r>
+        <w:t xml:space="preserve">Hayat bazen yavaşlamanı değil, fark etmeni ister.</w:t>
+      </w:r>
+    </w:p>
+    <w:p>
+      <w:r>
+        <w:t xml:space="preserve">Kendi yolunda ilerlemek, başlı başına bir başarıdır.</w:t>
+      </w:r>
+    </w:p>
+    <w:p>
+      <w:r>
+        <w:t xml:space="preserve">Her gün, içinde yeni bir umut taşır.</w:t>
+      </w:r>
+    </w:p>
+    <w:p>
+      <w:r>
+        <w:t xml:space="preserve">Kalbinin derinliklerinde aradığın güç zaten mevcut.</w:t>
+      </w:r>
+    </w:p>
+    <w:p>
+      <w:r>
+        <w:t xml:space="preserve">Bugün kendine biraz daha sevgi göstermeyi seç.</w:t>
+      </w:r>
+    </w:p>
+    <w:p>
+      <w:r>
+        <w:t xml:space="preserve">Ruhunun hem dinlenmeye hem büyümeye ihtiyacı vardır.</w:t>
+      </w:r>
+    </w:p>
+    <w:p>
+      <w:r>
+        <w:t xml:space="preserve">Hayatındaki güzellikler, fark edildikçe çoğalır.</w:t>
+      </w:r>
+    </w:p>
+    <w:p>
+      <w:r>
+        <w:t xml:space="preserve">Her sabah, yeni bir başlangıcın kapısını açar.</w:t>
+      </w:r>
+    </w:p>
+    <w:p>
+      <w:r>
+        <w:t xml:space="preserve">Kendini kabul etmek, özgürlüğe açılan bir kapıdır.</w:t>
+      </w:r>
+    </w:p>
+    <w:p>
+      <w:r>
+        <w:t xml:space="preserve">İçindeki ışık sana her zaman rehberlik eder.</w:t>
+      </w:r>
+    </w:p>
+    <w:p>
+      <w:r>
+        <w:t xml:space="preserve">Bugün küçük bir adım atmak bile yeterlidir.</w:t>
+      </w:r>
+    </w:p>
+    <w:p>
+      <w:r>
+        <w:t xml:space="preserve">Hayatın sana getirdiklerine güvenmeyi öğren.</w:t>
+      </w:r>
+    </w:p>
+    <w:p>
+      <w:r>
+        <w:t xml:space="preserve">Kendine duyduğun güven zamanla kök salar.</w:t>
+      </w:r>
+    </w:p>
+    <w:p>
+      <w:r>
+        <w:t xml:space="preserve">Her deneyim sana ait bir bilgelik bırakır.</w:t>
+      </w:r>
+    </w:p>
+    <w:p>
+      <w:r>
+        <w:t xml:space="preserve">Bugün sahip olduklarına sevgiyle bak.</w:t>
+      </w:r>
+    </w:p>
+    <w:p>
+      <w:r>
+        <w:t xml:space="preserve">Kalbin açık olduğunda, yeni güzellikler içeri girer.</w:t>
+      </w:r>
+    </w:p>
+    <w:p>
+      <w:r>
+        <w:t xml:space="preserve">Hayatın ritmiyle savaşmak yerine ona uyumlan.</w:t>
+      </w:r>
+    </w:p>
+    <w:p>
+      <w:r>
+        <w:t xml:space="preserve">Kendi değerini hatırladığında yüklerin hafifler.</w:t>
+      </w:r>
+    </w:p>
+    <w:p>
+      <w:r>
+        <w:t xml:space="preserve">Bugün yeni bir şey öğrenmek için harika bir gün.</w:t>
+      </w:r>
+    </w:p>
+    <w:p>
+      <w:r>
+        <w:t xml:space="preserve">Ruhunu besleyen seçimler yapmaya niyet et.</w:t>
+      </w:r>
+    </w:p>
+    <w:p>
+      <w:r>
+        <w:t xml:space="preserve">Her gün biraz daha güçleniyorsun.</w:t>
+      </w:r>
+    </w:p>
+    <w:p>
+      <w:r>
+        <w:t xml:space="preserve">İçindeki umut, en zor zamanlarda bile yolunu aydınlatır.</w:t>
+      </w:r>
+    </w:p>
+    <w:p>
+      <w:r>
+        <w:t xml:space="preserve">Kendine ayırdığın zaman asla boşa gitmez.</w:t>
+      </w:r>
+    </w:p>
+    <w:p>
+      <w:r>
+        <w:t xml:space="preserve">Hayat bazen sana durup manzarayı izlemeni söyler.</w:t>
+      </w:r>
+    </w:p>
+    <w:p>
+      <w:r>
+        <w:t xml:space="preserve">Bugün içindeki iyiliği büyütmeyi seç.</w:t>
+      </w:r>
+    </w:p>
+    <w:p>
+      <w:r>
+        <w:t xml:space="preserve">Kendi hikâyene sevgiyle sahip çık.</w:t>
+      </w:r>
+    </w:p>
+    <w:p>
+      <w:r>
+        <w:t xml:space="preserve">Her nefes, yeni bir başlangıcın davetidir.</w:t>
+      </w:r>
+    </w:p>
+    <w:p>
+      <w:r>
+        <w:t xml:space="preserve">Işığın başkalarına da ilham verebilir.</w:t>
+      </w:r>
+    </w:p>
+    <w:p>
+      <w:r>
+        <w:t xml:space="preserve">Sen bu yolculukta, tam da olman gereken yerdesin.</w:t>
       </w:r>
     </w:p>
     <w:sectPr/>

</xml_diff>

<commit_message>
Acilis+Evren havuzu: 29 yeni cumle eklendi (305 -> 334 benzersiz)
Co-Authored-By: Claude Opus 4.8 <noreply@anthropic.com>
</commit_message>
<xml_diff>
--- a/Açılış cümlelerim/Açılış cümleleri.docx
+++ b/Açılış cümlelerim/Açılış cümleleri.docx
@@ -1525,6 +1525,151 @@
     <w:p>
       <w:r>
         <w:t xml:space="preserve">Sen bu yolculukta, tam da olman gereken yerdesin.</w:t>
+      </w:r>
+    </w:p>
+    <w:p>
+      <w:r>
+        <w:t xml:space="preserve">Bugün kendine duyduğun güveni biraz daha büyüt.</w:t>
+      </w:r>
+    </w:p>
+    <w:p>
+      <w:r>
+        <w:t xml:space="preserve">Hayatın sana sunduğu her gün yeni bir armağandır.</w:t>
+      </w:r>
+    </w:p>
+    <w:p>
+      <w:r>
+        <w:t xml:space="preserve">İçindeki huzur, dış koşullardan daha güçlü olabilir.</w:t>
+      </w:r>
+    </w:p>
+    <w:p>
+      <w:r>
+        <w:t xml:space="preserve">Kendine karşı dürüst olmak, büyümenin başlangıcıdır.</w:t>
+      </w:r>
+    </w:p>
+    <w:p>
+      <w:r>
+        <w:t xml:space="preserve">Her gün yeniden seçim yapma hakkına sahipsin.</w:t>
+      </w:r>
+    </w:p>
+    <w:p>
+      <w:r>
+        <w:t xml:space="preserve">Kalbinin taşıdığı umut seni ileriye taşımaya devam ediyor.</w:t>
+      </w:r>
+    </w:p>
+    <w:p>
+      <w:r>
+        <w:t xml:space="preserve">Bugün kendin için güzel bir an yarat.</w:t>
+      </w:r>
+    </w:p>
+    <w:p>
+      <w:r>
+        <w:t xml:space="preserve">Hayatın güzellikleri, çoğu zaman sade anlarda saklıdır.</w:t>
+      </w:r>
+    </w:p>
+    <w:p>
+      <w:r>
+        <w:t xml:space="preserve">Ruhuna iyi gelen şeyleri erteleme.</w:t>
+      </w:r>
+    </w:p>
+    <w:p>
+      <w:r>
+        <w:t xml:space="preserve">Her deneyim seni biraz daha olgunlaştırır.</w:t>
+      </w:r>
+    </w:p>
+    <w:p>
+      <w:r>
+        <w:t xml:space="preserve">Kendini dinlediğinde, ihtiyaçlarını daha net duyarsın.</w:t>
+      </w:r>
+    </w:p>
+    <w:p>
+      <w:r>
+        <w:t xml:space="preserve">Bugün geçmişi değil, bugünü yaşamayı seç.</w:t>
+      </w:r>
+    </w:p>
+    <w:p>
+      <w:r>
+        <w:t xml:space="preserve">İçindeki cesaret, düşündüğünden daha büyüktür.</w:t>
+      </w:r>
+    </w:p>
+    <w:p>
+      <w:r>
+        <w:t xml:space="preserve">Hayatın sana getirdiği değişimlere açık ol.</w:t>
+      </w:r>
+    </w:p>
+    <w:p>
+      <w:r>
+        <w:t xml:space="preserve">Küçük bir tebessüm bile gününün yönünü değiştirebilir.</w:t>
+      </w:r>
+    </w:p>
+    <w:p>
+      <w:r>
+        <w:t xml:space="preserve">Bugün kendi tarafında ol.</w:t>
+      </w:r>
+    </w:p>
+    <w:p>
+      <w:r>
+        <w:t xml:space="preserve">Kendine gösterdiğin anlayış, içsel gücünü artırır.</w:t>
+      </w:r>
+    </w:p>
+    <w:p>
+      <w:r>
+        <w:t xml:space="preserve">Kalbini sevgiye açtığında, hayat da sana açılır.</w:t>
+      </w:r>
+    </w:p>
+    <w:p>
+      <w:r>
+        <w:t xml:space="preserve">Bugün sahip olduğun bilgilerle elinden gelenin en iyisini yapıyorsun.</w:t>
+      </w:r>
+    </w:p>
+    <w:p>
+      <w:r>
+        <w:t xml:space="preserve">İçindeki dengeyi buldukça hayatın da dengelenir.</w:t>
+      </w:r>
+    </w:p>
+    <w:p>
+      <w:r>
+        <w:t xml:space="preserve">Kendine verdiğin sözler değerlidir.</w:t>
+      </w:r>
+    </w:p>
+    <w:p>
+      <w:r>
+        <w:t xml:space="preserve">Her sabah yeni ihtimallerle gelir.</w:t>
+      </w:r>
+    </w:p>
+    <w:p>
+      <w:r>
+        <w:t xml:space="preserve">Bugün ruhuna biraz nefes aldır.</w:t>
+      </w:r>
+    </w:p>
+    <w:p>
+      <w:r>
+        <w:t xml:space="preserve">Hayatın akışı seni olması gereken yere taşıyor.</w:t>
+      </w:r>
+    </w:p>
+    <w:p>
+      <w:r>
+        <w:t xml:space="preserve">Kendi ilerlemeni takdir etmeyi unutma.</w:t>
+      </w:r>
+    </w:p>
+    <w:p>
+      <w:r>
+        <w:t xml:space="preserve">İçindeki ışık bazen sessizdir, ama asla kaybolmaz.</w:t>
+      </w:r>
+    </w:p>
+    <w:p>
+      <w:r>
+        <w:t xml:space="preserve">Bugün güzellikleri fark etmeye niyet et.</w:t>
+      </w:r>
+    </w:p>
+    <w:p>
+      <w:r>
+        <w:t xml:space="preserve">Kendine duyduğun sevgi en büyük gücündür.</w:t>
+      </w:r>
+    </w:p>
+    <w:p>
+      <w:r>
+        <w:t xml:space="preserve">Yolculuğun boyunca attığın her adım anlam taşır.</w:t>
       </w:r>
     </w:p>
     <w:sectPr/>

</xml_diff>

<commit_message>
Acilis+Evren havuzu: 29 yeni cumle eklendi (334 -> 363 benzersiz)
Co-Authored-By: Claude Opus 4.8 <noreply@anthropic.com>
</commit_message>
<xml_diff>
--- a/Açılış cümlelerim/Açılış cümleleri.docx
+++ b/Açılış cümlelerim/Açılış cümleleri.docx
@@ -1670,6 +1670,151 @@
     <w:p>
       <w:r>
         <w:t xml:space="preserve">Yolculuğun boyunca attığın her adım anlam taşır.</w:t>
+      </w:r>
+    </w:p>
+    <w:p>
+      <w:r>
+        <w:t xml:space="preserve">Kendine inanmak için mükemmel olmayı bekleme.</w:t>
+      </w:r>
+    </w:p>
+    <w:p>
+      <w:r>
+        <w:t xml:space="preserve">Bugün attığın adımlar, yarının temelini oluşturuyor.</w:t>
+      </w:r>
+    </w:p>
+    <w:p>
+      <w:r>
+        <w:t xml:space="preserve">Hayatın içinde sana ayrılmış güzellikler var.</w:t>
+      </w:r>
+    </w:p>
+    <w:p>
+      <w:r>
+        <w:t xml:space="preserve">Kalbinde taşıdığın sevgi seni dönüştürebilir.</w:t>
+      </w:r>
+    </w:p>
+    <w:p>
+      <w:r>
+        <w:t xml:space="preserve">Her gün yeni bir keşif fırsatı sunar.</w:t>
+      </w:r>
+    </w:p>
+    <w:p>
+      <w:r>
+        <w:t xml:space="preserve">İçindeki gücü hatırladığında, yollar açılmaya başlar.</w:t>
+      </w:r>
+    </w:p>
+    <w:p>
+      <w:r>
+        <w:t xml:space="preserve">Bugün kendine biraz daha sabır göster.</w:t>
+      </w:r>
+    </w:p>
+    <w:p>
+      <w:r>
+        <w:t xml:space="preserve">Hayat bazen en güzel cevapları zamana bırakır.</w:t>
+      </w:r>
+    </w:p>
+    <w:p>
+      <w:r>
+        <w:t xml:space="preserve">Ruhunun sesini duymak için biraz yavaşla.</w:t>
+      </w:r>
+    </w:p>
+    <w:p>
+      <w:r>
+        <w:t xml:space="preserve">Her yeni gün taze bir başlangıçtır.</w:t>
+      </w:r>
+    </w:p>
+    <w:p>
+      <w:r>
+        <w:t xml:space="preserve">Kendine verdiğin emek mutlaka karşılığını bulur.</w:t>
+      </w:r>
+    </w:p>
+    <w:p>
+      <w:r>
+        <w:t xml:space="preserve">İç huzurunu korumak, en değerli başarılarından biridir.</w:t>
+      </w:r>
+    </w:p>
+    <w:p>
+      <w:r>
+        <w:t xml:space="preserve">Hayatın akışına güvenmek yüklerini hafifletir.</w:t>
+      </w:r>
+    </w:p>
+    <w:p>
+      <w:r>
+        <w:t xml:space="preserve">Kendi değerini, başkalarının sözleri belirleyemez.</w:t>
+      </w:r>
+    </w:p>
+    <w:p>
+      <w:r>
+        <w:t xml:space="preserve">Bugün umut etmek için güzel bir sebep bul.</w:t>
+      </w:r>
+    </w:p>
+    <w:p>
+      <w:r>
+        <w:t xml:space="preserve">Her deneyim seni daha güçlü bir insana dönüştürüyor.</w:t>
+      </w:r>
+    </w:p>
+    <w:p>
+      <w:r>
+        <w:t xml:space="preserve">Kalbinin ışığı, en karanlık anlarda bile yol gösterebilir.</w:t>
+      </w:r>
+    </w:p>
+    <w:p>
+      <w:r>
+        <w:t xml:space="preserve">Kendini geliştirmek bir varış noktası değil, yaşam biçimidir.</w:t>
+      </w:r>
+    </w:p>
+    <w:p>
+      <w:r>
+        <w:t xml:space="preserve">Bugün kendine iyi gelecek bir seçim yap.</w:t>
+      </w:r>
+    </w:p>
+    <w:p>
+      <w:r>
+        <w:t xml:space="preserve">Hayatındaki küçük mutlulukları büyütmeyi seç.</w:t>
+      </w:r>
+    </w:p>
+    <w:p>
+      <w:r>
+        <w:t xml:space="preserve">İçindeki potansiyel her gün biraz daha ortaya çıkıyor.</w:t>
+      </w:r>
+    </w:p>
+    <w:p>
+      <w:r>
+        <w:t xml:space="preserve">Kendine karşı nazik olmak bir zayıflık değil, güçtür.</w:t>
+      </w:r>
+    </w:p>
+    <w:p>
+      <w:r>
+        <w:t xml:space="preserve">Her nefes, yaşamın sana verdiği yeni bir fırsattır.</w:t>
+      </w:r>
+    </w:p>
+    <w:p>
+      <w:r>
+        <w:t xml:space="preserve">Bugün içindeki huzuru beslemeyi seç.</w:t>
+      </w:r>
+    </w:p>
+    <w:p>
+      <w:r>
+        <w:t xml:space="preserve">Kendi yolculuğunun kıymetini bil.</w:t>
+      </w:r>
+    </w:p>
+    <w:p>
+      <w:r>
+        <w:t xml:space="preserve">Hayat bazen beklediğinden daha güzel sürprizler hazırlar.</w:t>
+      </w:r>
+    </w:p>
+    <w:p>
+      <w:r>
+        <w:t xml:space="preserve">Ruhuna iyi gelen şeyleri önceliklendir.</w:t>
+      </w:r>
+    </w:p>
+    <w:p>
+      <w:r>
+        <w:t xml:space="preserve">Bugün ışığını saklamak yerine paylaş.</w:t>
+      </w:r>
+    </w:p>
+    <w:p>
+      <w:r>
+        <w:t xml:space="preserve">Senin hikâyen, yazılmaya devam eden eşsiz bir eserdir.</w:t>
       </w:r>
     </w:p>
     <w:sectPr/>

</xml_diff>

<commit_message>
Acilis+Evren havuzu: 28 yeni cumle eklendi (363 -> 391 benzersiz)
Co-Authored-By: Claude Opus 4.8 <noreply@anthropic.com>
</commit_message>
<xml_diff>
--- a/Açılış cümlelerim/Açılış cümleleri.docx
+++ b/Açılış cümlelerim/Açılış cümleleri.docx
@@ -1815,6 +1815,146 @@
     <w:p>
       <w:r>
         <w:t xml:space="preserve">Senin hikâyen, yazılmaya devam eden eşsiz bir eserdir.</w:t>
+      </w:r>
+    </w:p>
+    <w:p>
+      <w:r>
+        <w:t xml:space="preserve">Bugün kalbine iyi gelen bir düşünceyi büyüt.</w:t>
+      </w:r>
+    </w:p>
+    <w:p>
+      <w:r>
+        <w:t xml:space="preserve">Hayat her zaman yeni bir ihtimal sunar.</w:t>
+      </w:r>
+    </w:p>
+    <w:p>
+      <w:r>
+        <w:t xml:space="preserve">Kendine verdiğin değer yaşamına yön verir.</w:t>
+      </w:r>
+    </w:p>
+    <w:p>
+      <w:r>
+        <w:t xml:space="preserve">İçindeki ışık sessizce büyümeye devam ediyor.</w:t>
+      </w:r>
+    </w:p>
+    <w:p>
+      <w:r>
+        <w:t xml:space="preserve">Bugün kendini olduğun gibi kabul etmeyi seç.</w:t>
+      </w:r>
+    </w:p>
+    <w:p>
+      <w:r>
+        <w:t xml:space="preserve">Kalbinin taşıdığı umut seni ileriye çağırıyor.</w:t>
+      </w:r>
+    </w:p>
+    <w:p>
+      <w:r>
+        <w:t xml:space="preserve">Kendine ayırdığın birkaç dakika bile çok değerlidir.</w:t>
+      </w:r>
+    </w:p>
+    <w:p>
+      <w:r>
+        <w:t xml:space="preserve">Bugün ruhunu besleyecek bir seçim yap.</w:t>
+      </w:r>
+    </w:p>
+    <w:p>
+      <w:r>
+        <w:t xml:space="preserve">Her deneyim sana yeni bir kapı açar.</w:t>
+      </w:r>
+    </w:p>
+    <w:p>
+      <w:r>
+        <w:t xml:space="preserve">İç huzurun, en güvenli limanındır.</w:t>
+      </w:r>
+    </w:p>
+    <w:p>
+      <w:r>
+        <w:t xml:space="preserve">Küçük adımların gücünü küçümseme.</w:t>
+      </w:r>
+    </w:p>
+    <w:p>
+      <w:r>
+        <w:t xml:space="preserve">Bugün sahip olduklarının kıymetini hatırla.</w:t>
+      </w:r>
+    </w:p>
+    <w:p>
+      <w:r>
+        <w:t xml:space="preserve">Kendi ışığını görmek için durup kendine bak.</w:t>
+      </w:r>
+    </w:p>
+    <w:p>
+      <w:r>
+        <w:t xml:space="preserve">Hayatın içindeki güzellikler seni bekliyor.</w:t>
+      </w:r>
+    </w:p>
+    <w:p>
+      <w:r>
+        <w:t xml:space="preserve">Kendine duyduğun güven zamanla büyür.</w:t>
+      </w:r>
+    </w:p>
+    <w:p>
+      <w:r>
+        <w:t xml:space="preserve">Bugün geçmişi değil, şu anı yaşamayı seç.</w:t>
+      </w:r>
+    </w:p>
+    <w:p>
+      <w:r>
+        <w:t xml:space="preserve">Ruhunun ihtiyaçlarını sevgiyle dinle.</w:t>
+      </w:r>
+    </w:p>
+    <w:p>
+      <w:r>
+        <w:t xml:space="preserve">Her yeni gün yeni bir sayfa açar.</w:t>
+      </w:r>
+    </w:p>
+    <w:p>
+      <w:r>
+        <w:t xml:space="preserve">Kalbini korkulara değil, ihtimallere aç.</w:t>
+      </w:r>
+    </w:p>
+    <w:p>
+      <w:r>
+        <w:t xml:space="preserve">Bugün içindeki gücü fark etmeye niyet et.</w:t>
+      </w:r>
+    </w:p>
+    <w:p>
+      <w:r>
+        <w:t xml:space="preserve">Hayat bazen sadece devam etmeni ister.</w:t>
+      </w:r>
+    </w:p>
+    <w:p>
+      <w:r>
+        <w:t xml:space="preserve">Kendine gösterdiğin sevgi yaşamını dönüştürür.</w:t>
+      </w:r>
+    </w:p>
+    <w:p>
+      <w:r>
+        <w:t xml:space="preserve">Her nefes sana yeni bir başlangıç sunar.</w:t>
+      </w:r>
+    </w:p>
+    <w:p>
+      <w:r>
+        <w:t xml:space="preserve">Bugün içindeki huzuru korumayı seç.</w:t>
+      </w:r>
+    </w:p>
+    <w:p>
+      <w:r>
+        <w:t xml:space="preserve">Kendi yolunda ilerlemek yeterince değerlidir.</w:t>
+      </w:r>
+    </w:p>
+    <w:p>
+      <w:r>
+        <w:t xml:space="preserve">Hayatın sana getirdiklerine güvenle yaklaş.</w:t>
+      </w:r>
+    </w:p>
+    <w:p>
+      <w:r>
+        <w:t xml:space="preserve">Işığın büyüdükçe çevrene de yansır.</w:t>
+      </w:r>
+    </w:p>
+    <w:p>
+      <w:r>
+        <w:t xml:space="preserve">Sen olduğun hâlinle bu dünyaya bir değer katıyorsun.</w:t>
       </w:r>
     </w:p>
     <w:sectPr/>

</xml_diff>

<commit_message>
Acilis+Evren havuzu: 30 yeni cumle eklendi (391 -> 421 benzersiz)
Co-Authored-By: Claude Opus 4.8 <noreply@anthropic.com>
</commit_message>
<xml_diff>
--- a/Açılış cümlelerim/Açılış cümleleri.docx
+++ b/Açılış cümlelerim/Açılış cümleleri.docx
@@ -1955,6 +1955,156 @@
     <w:p>
       <w:r>
         <w:t xml:space="preserve">Sen olduğun hâlinle bu dünyaya bir değer katıyorsun.</w:t>
+      </w:r>
+    </w:p>
+    <w:p>
+      <w:r>
+        <w:t xml:space="preserve">Bugün kendine verdiğin sakinlik, en büyük hediyelerden biridir.</w:t>
+      </w:r>
+    </w:p>
+    <w:p>
+      <w:r>
+        <w:t xml:space="preserve">Hayat bazen sadece nefes alıp devam etmeyi ister.</w:t>
+      </w:r>
+    </w:p>
+    <w:p>
+      <w:r>
+        <w:t xml:space="preserve">Kalbinin taşıdığı ışık her gün biraz daha büyüyor.</w:t>
+      </w:r>
+    </w:p>
+    <w:p>
+      <w:r>
+        <w:t xml:space="preserve">Kendine güvenmek için tüm cevapları bilmen gerekmez.</w:t>
+      </w:r>
+    </w:p>
+    <w:p>
+      <w:r>
+        <w:t xml:space="preserve">Bugün içindeki güzellikleri fark etmeye çalış.</w:t>
+      </w:r>
+    </w:p>
+    <w:p>
+      <w:r>
+        <w:t xml:space="preserve">Her gün yeni bir öğrenme fırsatıyla gelir.</w:t>
+      </w:r>
+    </w:p>
+    <w:p>
+      <w:r>
+        <w:t xml:space="preserve">Hayatın sana sunduğu küçük mucizeleri kaçırma.</w:t>
+      </w:r>
+    </w:p>
+    <w:p>
+      <w:r>
+        <w:t xml:space="preserve">Kendi yolculuğuna sevgiyle eşlik et.</w:t>
+      </w:r>
+    </w:p>
+    <w:p>
+      <w:r>
+        <w:t xml:space="preserve">Bugün kendini yargılamak yerine anlamayı seç.</w:t>
+      </w:r>
+    </w:p>
+    <w:p>
+      <w:r>
+        <w:t xml:space="preserve">İçindeki güç, sessiz zamanlarda ortaya çıkar.</w:t>
+      </w:r>
+    </w:p>
+    <w:p>
+      <w:r>
+        <w:t xml:space="preserve">Her yeni sabah umutla yeniden doğar.</w:t>
+      </w:r>
+    </w:p>
+    <w:p>
+      <w:r>
+        <w:t xml:space="preserve">Kendine gösterdiğin şefkat ruhunu iyileştirir.</w:t>
+      </w:r>
+    </w:p>
+    <w:p>
+      <w:r>
+        <w:t xml:space="preserve">Hayatın içinde sana ayrılmış nice güzellik var.</w:t>
+      </w:r>
+    </w:p>
+    <w:p>
+      <w:r>
+        <w:t xml:space="preserve">Bugün kalbinin sesini biraz daha dinle.</w:t>
+      </w:r>
+    </w:p>
+    <w:p>
+      <w:r>
+        <w:t xml:space="preserve">Kendi değerini hatırlamak, dönüşümün başlangıcıdır.</w:t>
+      </w:r>
+    </w:p>
+    <w:p>
+      <w:r>
+        <w:t xml:space="preserve">Her deneyim sana yeni bir bakış açısı kazandırır.</w:t>
+      </w:r>
+    </w:p>
+    <w:p>
+      <w:r>
+        <w:t xml:space="preserve">Ruhun huzur bulduğunda, hayat daha hafif gelir.</w:t>
+      </w:r>
+    </w:p>
+    <w:p>
+      <w:r>
+        <w:t xml:space="preserve">Bugün bir şeyleri aceleye getirmemeyi seç.</w:t>
+      </w:r>
+    </w:p>
+    <w:p>
+      <w:r>
+        <w:t xml:space="preserve">İçindeki sevgi büyüdükçe korkular küçülür.</w:t>
+      </w:r>
+    </w:p>
+    <w:p>
+      <w:r>
+        <w:t xml:space="preserve">Hayatın akışı, çoğu zaman sandığından daha bilgedir.</w:t>
+      </w:r>
+    </w:p>
+    <w:p>
+      <w:r>
+        <w:t xml:space="preserve">Bugün kendine minnet duymak için bir sebep bul.</w:t>
+      </w:r>
+    </w:p>
+    <w:p>
+      <w:r>
+        <w:t xml:space="preserve">Kendi ilerlemeni fark etmek de bir başarıdır.</w:t>
+      </w:r>
+    </w:p>
+    <w:p>
+      <w:r>
+        <w:t xml:space="preserve">Her gün biraz daha olgunlaşıyor ve gelişiyorsun.</w:t>
+      </w:r>
+    </w:p>
+    <w:p>
+      <w:r>
+        <w:t xml:space="preserve">Kalbin açık olduğunda yeni kapılar açılır.</w:t>
+      </w:r>
+    </w:p>
+    <w:p>
+      <w:r>
+        <w:t xml:space="preserve">Bugün içindeki ışığın yol göstermesine izin ver.</w:t>
+      </w:r>
+    </w:p>
+    <w:p>
+      <w:r>
+        <w:t xml:space="preserve">Hayatın her döneminin sana öğreteceği bir şey vardır.</w:t>
+      </w:r>
+    </w:p>
+    <w:p>
+      <w:r>
+        <w:t xml:space="preserve">Kendini olduğun gibi kabul etmek büyük bir güçtür.</w:t>
+      </w:r>
+    </w:p>
+    <w:p>
+      <w:r>
+        <w:t xml:space="preserve">Bugün huzuru seçmek senin elinde.</w:t>
+      </w:r>
+    </w:p>
+    <w:p>
+      <w:r>
+        <w:t xml:space="preserve">Ruhuna iyi gelen şeyleri önemse.</w:t>
+      </w:r>
+    </w:p>
+    <w:p>
+      <w:r>
+        <w:t xml:space="preserve">Sen, kendi hayatının en değerli yolcususun.</w:t>
       </w:r>
     </w:p>
     <w:sectPr/>

</xml_diff>

<commit_message>
Acilis+Evren havuzu: 30 yeni cumle eklendi (421 -> 451 benzersiz)
Co-Authored-By: Claude Opus 4.8 <noreply@anthropic.com>
</commit_message>
<xml_diff>
--- a/Açılış cümlelerim/Açılış cümleleri.docx
+++ b/Açılış cümlelerim/Açılış cümleleri.docx
@@ -2105,6 +2105,156 @@
     <w:p>
       <w:r>
         <w:t xml:space="preserve">Sen, kendi hayatının en değerli yolcususun.</w:t>
+      </w:r>
+    </w:p>
+    <w:p>
+      <w:r>
+        <w:t xml:space="preserve">Bazı kapılar yalnızca sabırla bekleyenlere açılır.</w:t>
+      </w:r>
+    </w:p>
+    <w:p>
+      <w:r>
+        <w:t xml:space="preserve">Bugün içindeki sessiz gücü keşfetmeye niyet et.</w:t>
+      </w:r>
+    </w:p>
+    <w:p>
+      <w:r>
+        <w:t xml:space="preserve">Hayatın sana anlattığı hikâyeyi dikkatle dinle.</w:t>
+      </w:r>
+    </w:p>
+    <w:p>
+      <w:r>
+        <w:t xml:space="preserve">Kendine alan tanıdığında dönüşüm başlar.</w:t>
+      </w:r>
+    </w:p>
+    <w:p>
+      <w:r>
+        <w:t xml:space="preserve">Büyümek bazen bırakabilme cesaretidir.</w:t>
+      </w:r>
+    </w:p>
+    <w:p>
+      <w:r>
+        <w:t xml:space="preserve">Bugün kendine daha yumuşak davran.</w:t>
+      </w:r>
+    </w:p>
+    <w:p>
+      <w:r>
+        <w:t xml:space="preserve">Her mevsimin ruhuna kattığı bir hediye vardır.</w:t>
+      </w:r>
+    </w:p>
+    <w:p>
+      <w:r>
+        <w:t xml:space="preserve">Kalbin yorulduğunda dinlenmek de ilerlemenin bir parçasıdır.</w:t>
+      </w:r>
+    </w:p>
+    <w:p>
+      <w:r>
+        <w:t xml:space="preserve">Hayat seni olduğun yerden alıp olabileceğin yere taşır.</w:t>
+      </w:r>
+    </w:p>
+    <w:p>
+      <w:r>
+        <w:t xml:space="preserve">Kendi iç dünyana yaptığın yolculuk, en değerli yolculuktur.</w:t>
+      </w:r>
+    </w:p>
+    <w:p>
+      <w:r>
+        <w:t xml:space="preserve">Bugün bir an dur ve ne kadar yol geldiğini hatırla.</w:t>
+      </w:r>
+    </w:p>
+    <w:p>
+      <w:r>
+        <w:t xml:space="preserve">Bazı cevaplar zamanla değil, farkındalıkla gelir.</w:t>
+      </w:r>
+    </w:p>
+    <w:p>
+      <w:r>
+        <w:t xml:space="preserve">Ruhunun fısıltılarını duymayı ihmal etme.</w:t>
+      </w:r>
+    </w:p>
+    <w:p>
+      <w:r>
+        <w:t xml:space="preserve">Kendini seçmek, bazen vereceğin en doğru karardır.</w:t>
+      </w:r>
+    </w:p>
+    <w:p>
+      <w:r>
+        <w:t xml:space="preserve">Bugün küçük bir iyilik yap ve etkisini izle.</w:t>
+      </w:r>
+    </w:p>
+    <w:p>
+      <w:r>
+        <w:t xml:space="preserve">Hayatın güzelliği kusursuz olmasında değil, gerçek olmasındadır.</w:t>
+      </w:r>
+    </w:p>
+    <w:p>
+      <w:r>
+        <w:t xml:space="preserve">Kendi ışığını kabul ettiğinde, gölgeler seni korkutmaz.</w:t>
+      </w:r>
+    </w:p>
+    <w:p>
+      <w:r>
+        <w:t xml:space="preserve">Her sonbahar, yeni bir baharın habercisidir.</w:t>
+      </w:r>
+    </w:p>
+    <w:p>
+      <w:r>
+        <w:t xml:space="preserve">Bugün içindeki merakı canlı tut.</w:t>
+      </w:r>
+    </w:p>
+    <w:p>
+      <w:r>
+        <w:t xml:space="preserve">Bazen yön değiştirmek de doğru yolda olmaktır.</w:t>
+      </w:r>
+    </w:p>
+    <w:p>
+      <w:r>
+        <w:t xml:space="preserve">Kalbinde taşıdığın sevgi sana her zaman geri döner.</w:t>
+      </w:r>
+    </w:p>
+    <w:p>
+      <w:r>
+        <w:t xml:space="preserve">Kendine güvenmek, bilinmeyene atılan sessiz bir adımdır.</w:t>
+      </w:r>
+    </w:p>
+    <w:p>
+      <w:r>
+        <w:t xml:space="preserve">Hayatın akışında sana ait bir yer her zaman vardır.</w:t>
+      </w:r>
+    </w:p>
+    <w:p>
+      <w:r>
+        <w:t xml:space="preserve">Bugün sahip olduğun huzuru korumaya odaklan.</w:t>
+      </w:r>
+    </w:p>
+    <w:p>
+      <w:r>
+        <w:t xml:space="preserve">Ruhun da bedenin gibi ilgi ve sevgi ister.</w:t>
+      </w:r>
+    </w:p>
+    <w:p>
+      <w:r>
+        <w:t xml:space="preserve">Her yeni deneyim seni kendine biraz daha yaklaştırır.</w:t>
+      </w:r>
+    </w:p>
+    <w:p>
+      <w:r>
+        <w:t xml:space="preserve">Bazı mucizeler sessizce gerçekleşir.</w:t>
+      </w:r>
+    </w:p>
+    <w:p>
+      <w:r>
+        <w:t xml:space="preserve">Bugün kalbini umutla doldur.</w:t>
+      </w:r>
+    </w:p>
+    <w:p>
+      <w:r>
+        <w:t xml:space="preserve">İçindeki dengeyi buldukça dış dünyan da değişir.</w:t>
+      </w:r>
+    </w:p>
+    <w:p>
+      <w:r>
+        <w:t xml:space="preserve">Senin ışığın, yalnızca sana ait olan eşsiz bir hediyedir.</w:t>
       </w:r>
     </w:p>
     <w:sectPr/>

</xml_diff>

<commit_message>
Acilis+Evren havuzu: 30 yeni cumle eklendi (451 -> 481 benzersiz)
Co-Authored-By: Claude Opus 4.8 <noreply@anthropic.com>
</commit_message>
<xml_diff>
--- a/Açılış cümlelerim/Açılış cümleleri.docx
+++ b/Açılış cümlelerim/Açılış cümleleri.docx
@@ -2255,6 +2255,156 @@
     <w:p>
       <w:r>
         <w:t xml:space="preserve">Senin ışığın, yalnızca sana ait olan eşsiz bir hediyedir.</w:t>
+      </w:r>
+    </w:p>
+    <w:p>
+      <w:r>
+        <w:t xml:space="preserve">Bugün kendine vereceğin en güzel cevap, kendin olmaktır.</w:t>
+      </w:r>
+    </w:p>
+    <w:p>
+      <w:r>
+        <w:t xml:space="preserve">Hayat bazen planladıklarından daha güzel yollar çizer.</w:t>
+      </w:r>
+    </w:p>
+    <w:p>
+      <w:r>
+        <w:t xml:space="preserve">Kalbinin yönünü kaybettiğinde nefesine dön.</w:t>
+      </w:r>
+    </w:p>
+    <w:p>
+      <w:r>
+        <w:t xml:space="preserve">Kendi içinde bulduğun huzur kalıcıdır.</w:t>
+      </w:r>
+    </w:p>
+    <w:p>
+      <w:r>
+        <w:t xml:space="preserve">Bugün beklentilerini değil, anı yaşamayı seç.</w:t>
+      </w:r>
+    </w:p>
+    <w:p>
+      <w:r>
+        <w:t xml:space="preserve">Her gün ruhuna yeni bir renk ekler.</w:t>
+      </w:r>
+    </w:p>
+    <w:p>
+      <w:r>
+        <w:t xml:space="preserve">Bazen ilerleme, yalnızca vazgeçmemektir.</w:t>
+      </w:r>
+    </w:p>
+    <w:p>
+      <w:r>
+        <w:t xml:space="preserve">İçindeki ışık, başkalarının fark etmesine ihtiyaç duymaz.</w:t>
+      </w:r>
+    </w:p>
+    <w:p>
+      <w:r>
+        <w:t xml:space="preserve">Hayatın sana sunduğu dersleri sevgiyle karşıla.</w:t>
+      </w:r>
+    </w:p>
+    <w:p>
+      <w:r>
+        <w:t xml:space="preserve">Bugün küçük bir mutluluğun peşinden git.</w:t>
+      </w:r>
+    </w:p>
+    <w:p>
+      <w:r>
+        <w:t xml:space="preserve">Kendine verdiğin izinler özgürlüğünü büyütür.</w:t>
+      </w:r>
+    </w:p>
+    <w:p>
+      <w:r>
+        <w:t xml:space="preserve">Her gün yeniden şekillenen bir hikâyesin.</w:t>
+      </w:r>
+    </w:p>
+    <w:p>
+      <w:r>
+        <w:t xml:space="preserve">Kalbin açık olduğunda hayat da sana açılır.</w:t>
+      </w:r>
+    </w:p>
+    <w:p>
+      <w:r>
+        <w:t xml:space="preserve">Bugün içindeki çocuğu gülümsetecek bir şey yap.</w:t>
+      </w:r>
+    </w:p>
+    <w:p>
+      <w:r>
+        <w:t xml:space="preserve">Bazı yollar yürüdükçe güzelleşir.</w:t>
+      </w:r>
+    </w:p>
+    <w:p>
+      <w:r>
+        <w:t xml:space="preserve">Ruhunun dinlenmeye ihtiyacı olduğunda bunu erteleme.</w:t>
+      </w:r>
+    </w:p>
+    <w:p>
+      <w:r>
+        <w:t xml:space="preserve">Hayatın en güzel anları, çoğu zaman plansız gelir.</w:t>
+      </w:r>
+    </w:p>
+    <w:p>
+      <w:r>
+        <w:t xml:space="preserve">Bugün kendine karşı daha anlayışlı ol.</w:t>
+      </w:r>
+    </w:p>
+    <w:p>
+      <w:r>
+        <w:t xml:space="preserve">Kendi gerçeğini yaşamak büyük bir cesarettir.</w:t>
+      </w:r>
+    </w:p>
+    <w:p>
+      <w:r>
+        <w:t xml:space="preserve">Her sabah yeni bir umut taşır; yeter ki görmeyi seç.</w:t>
+      </w:r>
+    </w:p>
+    <w:p>
+      <w:r>
+        <w:t xml:space="preserve">İçindeki sakinlik, en zor günlerde bile seninledir.</w:t>
+      </w:r>
+    </w:p>
+    <w:p>
+      <w:r>
+        <w:t xml:space="preserve">Bugün bir yükü omuzlarından bırakmayı dene.</w:t>
+      </w:r>
+    </w:p>
+    <w:p>
+      <w:r>
+        <w:t xml:space="preserve">Hayatın sana verdiği armağanları fark etmeye başla.</w:t>
+      </w:r>
+    </w:p>
+    <w:p>
+      <w:r>
+        <w:t xml:space="preserve">Kendine güvenmek, yolun tamamını görmek değil; ilk adımı atmaktır.</w:t>
+      </w:r>
+    </w:p>
+    <w:p>
+      <w:r>
+        <w:t xml:space="preserve">Ruhunun büyümesine izin ver.</w:t>
+      </w:r>
+    </w:p>
+    <w:p>
+      <w:r>
+        <w:t xml:space="preserve">Bugün bir anlığına gökyüzüne bak ve derin bir nefes al.</w:t>
+      </w:r>
+    </w:p>
+    <w:p>
+      <w:r>
+        <w:t xml:space="preserve">Kendi ışığını korumak da bir sorumluluktur.</w:t>
+      </w:r>
+    </w:p>
+    <w:p>
+      <w:r>
+        <w:t xml:space="preserve">Hayat bazen cevapları değil, deneyimleri getirir.</w:t>
+      </w:r>
+    </w:p>
+    <w:p>
+      <w:r>
+        <w:t xml:space="preserve">Bugün kalbinde taşıdığın güzellikleri hatırla.</w:t>
+      </w:r>
+    </w:p>
+    <w:p>
+      <w:r>
+        <w:t xml:space="preserve">Sen değiştikçe baktığın dünya da değişir.</w:t>
       </w:r>
     </w:p>
     <w:sectPr/>

</xml_diff>

<commit_message>
Acilis+Evren havuzu: 30 yeni cumle eklendi (481 -> 511 benzersiz)
Co-Authored-By: Claude Opus 4.8 <noreply@anthropic.com>
</commit_message>
<xml_diff>
--- a/Açılış cümlelerim/Açılış cümleleri.docx
+++ b/Açılış cümlelerim/Açılış cümleleri.docx
@@ -2405,6 +2405,156 @@
     <w:p>
       <w:r>
         <w:t xml:space="preserve">Sen değiştikçe baktığın dünya da değişir.</w:t>
+      </w:r>
+    </w:p>
+    <w:p>
+      <w:r>
+        <w:t xml:space="preserve">Bugün kendinle kurduğun bağa biraz daha özen göster.</w:t>
+      </w:r>
+    </w:p>
+    <w:p>
+      <w:r>
+        <w:t xml:space="preserve">Hayatın sunduğu her deneyim bir iz bırakır.</w:t>
+      </w:r>
+    </w:p>
+    <w:p>
+      <w:r>
+        <w:t xml:space="preserve">Kalbin yorulduğunda ona şefkatle yaklaş.</w:t>
+      </w:r>
+    </w:p>
+    <w:p>
+      <w:r>
+        <w:t xml:space="preserve">Her gün, içinde keşfedilmeyi bekleyen bir bilgelik taşır.</w:t>
+      </w:r>
+    </w:p>
+    <w:p>
+      <w:r>
+        <w:t xml:space="preserve">Bugün yalnızca olduğun kişi olman yeterlidir.</w:t>
+      </w:r>
+    </w:p>
+    <w:p>
+      <w:r>
+        <w:t xml:space="preserve">Ruhunu besleyen şeyler hayatını da besler.</w:t>
+      </w:r>
+    </w:p>
+    <w:p>
+      <w:r>
+        <w:t xml:space="preserve">Bazı değişimler sessizce gerçekleşir.</w:t>
+      </w:r>
+    </w:p>
+    <w:p>
+      <w:r>
+        <w:t xml:space="preserve">Kendine verdiğin değer seçimlerine yansır.</w:t>
+      </w:r>
+    </w:p>
+    <w:p>
+      <w:r>
+        <w:t xml:space="preserve">Bugün bir anlığına dur ve güzellikleri fark et.</w:t>
+      </w:r>
+    </w:p>
+    <w:p>
+      <w:r>
+        <w:t xml:space="preserve">Hayatın ritmi her zaman hızdan ibaret değildir.</w:t>
+      </w:r>
+    </w:p>
+    <w:p>
+      <w:r>
+        <w:t xml:space="preserve">İçindeki umut yeniden filizlenmeyi bilir.</w:t>
+      </w:r>
+    </w:p>
+    <w:p>
+      <w:r>
+        <w:t xml:space="preserve">Her gün, yeni bir farkındalık kazanma fırsatıdır.</w:t>
+      </w:r>
+    </w:p>
+    <w:p>
+      <w:r>
+        <w:t xml:space="preserve">Kalbinin hafiflemesine izin ver.</w:t>
+      </w:r>
+    </w:p>
+    <w:p>
+      <w:r>
+        <w:t xml:space="preserve">Bugün sahip olduğun güç, geçmişteki mücadelelerinin sonucudur.</w:t>
+      </w:r>
+    </w:p>
+    <w:p>
+      <w:r>
+        <w:t xml:space="preserve">Ruhun huzur bulduğunda düşüncelerin de berraklaşır.</w:t>
+      </w:r>
+    </w:p>
+    <w:p>
+      <w:r>
+        <w:t xml:space="preserve">Hayat bazen sadece güvenmeni ister.</w:t>
+      </w:r>
+    </w:p>
+    <w:p>
+      <w:r>
+        <w:t xml:space="preserve">Kendine karşı dürüst olmak, içsel özgürlüğün kapısını açar.</w:t>
+      </w:r>
+    </w:p>
+    <w:p>
+      <w:r>
+        <w:t xml:space="preserve">Bugün bir düşünceni sevgiyle değiştir.</w:t>
+      </w:r>
+    </w:p>
+    <w:p>
+      <w:r>
+        <w:t xml:space="preserve">İçindeki deniz bazen dalgalı, bazen sakindir; ikisi de doğaldır.</w:t>
+      </w:r>
+    </w:p>
+    <w:p>
+      <w:r>
+        <w:t xml:space="preserve">Her sabah yeni ihtimallerle birlikte gelir.</w:t>
+      </w:r>
+    </w:p>
+    <w:p>
+      <w:r>
+        <w:t xml:space="preserve">Kalbinin taşıdığı iyilik çevrene yayılır.</w:t>
+      </w:r>
+    </w:p>
+    <w:p>
+      <w:r>
+        <w:t xml:space="preserve">Bugün kendine biraz daha yakın ol.</w:t>
+      </w:r>
+    </w:p>
+    <w:p>
+      <w:r>
+        <w:t xml:space="preserve">Hayatın her döneminin kendine ait bir güzelliği vardır.</w:t>
+      </w:r>
+    </w:p>
+    <w:p>
+      <w:r>
+        <w:t xml:space="preserve">Ruhunu yoran şeyleri bırakmayı öğren.</w:t>
+      </w:r>
+    </w:p>
+    <w:p>
+      <w:r>
+        <w:t xml:space="preserve">Her adımın seni bir yere taşıyor.</w:t>
+      </w:r>
+    </w:p>
+    <w:p>
+      <w:r>
+        <w:t xml:space="preserve">Bugün içindeki sessizliği dinle.</w:t>
+      </w:r>
+    </w:p>
+    <w:p>
+      <w:r>
+        <w:t xml:space="preserve">Kendi yolunu çizmek için başkalarının izlerini takip etmek zorunda değilsin.</w:t>
+      </w:r>
+    </w:p>
+    <w:p>
+      <w:r>
+        <w:t xml:space="preserve">Hayat sana her gün yeni bir seçim hakkı sunar.</w:t>
+      </w:r>
+    </w:p>
+    <w:p>
+      <w:r>
+        <w:t xml:space="preserve">Kalbinde taşıdığın ışık yolunu bulmana yardımcı olur.</w:t>
+      </w:r>
+    </w:p>
+    <w:p>
+      <w:r>
+        <w:t xml:space="preserve">Senin hikâyen, her gün yeniden yazılan değerli bir eserdir.</w:t>
       </w:r>
     </w:p>
     <w:sectPr/>

</xml_diff>

<commit_message>
Acilis+Evren havuzu: 30 yeni cumle eklendi (511 -> 541 benzersiz)
Co-Authored-By: Claude Opus 4.8 <noreply@anthropic.com>
</commit_message>
<xml_diff>
--- a/Açılış cümlelerim/Açılış cümleleri.docx
+++ b/Açılış cümlelerim/Açılış cümleleri.docx
@@ -2555,6 +2555,156 @@
     <w:p>
       <w:r>
         <w:t xml:space="preserve">Senin hikâyen, her gün yeniden yazılan değerli bir eserdir.</w:t>
+      </w:r>
+    </w:p>
+    <w:p>
+      <w:r>
+        <w:t xml:space="preserve">Bugün içindeki sakin gücü fark etmeye niyet et.</w:t>
+      </w:r>
+    </w:p>
+    <w:p>
+      <w:r>
+        <w:t xml:space="preserve">Hayat bazen seni durdurmaz, sadece yönünü değiştirir.</w:t>
+      </w:r>
+    </w:p>
+    <w:p>
+      <w:r>
+        <w:t xml:space="preserve">Kalbinin taşıdığı umut her zaman yeni yollar bulur.</w:t>
+      </w:r>
+    </w:p>
+    <w:p>
+      <w:r>
+        <w:t xml:space="preserve">Kendine verdiğin emek görünmese bile büyümeye devam eder.</w:t>
+      </w:r>
+    </w:p>
+    <w:p>
+      <w:r>
+        <w:t xml:space="preserve">Bugün kendin için iyi bir şey yapmayı unutma.</w:t>
+      </w:r>
+    </w:p>
+    <w:p>
+      <w:r>
+        <w:t xml:space="preserve">Ruhunun ihtiyaç duyduğu şey çoğu zaman sadeliktir.</w:t>
+      </w:r>
+    </w:p>
+    <w:p>
+      <w:r>
+        <w:t xml:space="preserve">Her gün, içinde yeni bir olasılık barındırır.</w:t>
+      </w:r>
+    </w:p>
+    <w:p>
+      <w:r>
+        <w:t xml:space="preserve">Kendini keşfetmek, varacağın en güzel yolculuklardan biridir.</w:t>
+      </w:r>
+    </w:p>
+    <w:p>
+      <w:r>
+        <w:t xml:space="preserve">Bugün içindeki ışığın biraz daha parlamasına izin ver.</w:t>
+      </w:r>
+    </w:p>
+    <w:p>
+      <w:r>
+        <w:t xml:space="preserve">Hayatın tüm cevaplarını bugün bilmek zorunda değilsin.</w:t>
+      </w:r>
+    </w:p>
+    <w:p>
+      <w:r>
+        <w:t xml:space="preserve">Kalbinin huzur bulduğu yer, senin evindir.</w:t>
+      </w:r>
+    </w:p>
+    <w:p>
+      <w:r>
+        <w:t xml:space="preserve">Kendine gösterdiğin saygı geleceğini şekillendirir.</w:t>
+      </w:r>
+    </w:p>
+    <w:p>
+      <w:r>
+        <w:t xml:space="preserve">Bugün güzellikleri görmek için bakışını değiştir.</w:t>
+      </w:r>
+    </w:p>
+    <w:p>
+      <w:r>
+        <w:t xml:space="preserve">Her mevsim kendi hediyesiyle gelir.</w:t>
+      </w:r>
+    </w:p>
+    <w:p>
+      <w:r>
+        <w:t xml:space="preserve">İçindeki cesaret, düşündüğünden daha derin köklere sahiptir.</w:t>
+      </w:r>
+    </w:p>
+    <w:p>
+      <w:r>
+        <w:t xml:space="preserve">Hayat bazen sana beklemeyi değil, güvenmeyi öğretir.</w:t>
+      </w:r>
+    </w:p>
+    <w:p>
+      <w:r>
+        <w:t xml:space="preserve">Bugün yalnızca zihnini değil, kalbini de dinle.</w:t>
+      </w:r>
+    </w:p>
+    <w:p>
+      <w:r>
+        <w:t xml:space="preserve">Kendine verdiğin sözler karakterini oluşturur.</w:t>
+      </w:r>
+    </w:p>
+    <w:p>
+      <w:r>
+        <w:t xml:space="preserve">Her gün biraz daha olgunlaşıyor ve dönüşüyorsun.</w:t>
+      </w:r>
+    </w:p>
+    <w:p>
+      <w:r>
+        <w:t xml:space="preserve">Ruhunu hafifleten seçimler yapmaya cesaret et.</w:t>
+      </w:r>
+    </w:p>
+    <w:p>
+      <w:r>
+        <w:t xml:space="preserve">Bugün yeni bir bakış açısına kapı aç.</w:t>
+      </w:r>
+    </w:p>
+    <w:p>
+      <w:r>
+        <w:t xml:space="preserve">Kalbindeki sevgi, en güçlü dönüşüm aracıdır.</w:t>
+      </w:r>
+    </w:p>
+    <w:p>
+      <w:r>
+        <w:t xml:space="preserve">Hayatın akışı içinde sana ait bir düzen vardır.</w:t>
+      </w:r>
+    </w:p>
+    <w:p>
+      <w:r>
+        <w:t xml:space="preserve">Kendini sürekli kanıtlamak zorunda değilsin.</w:t>
+      </w:r>
+    </w:p>
+    <w:p>
+      <w:r>
+        <w:t xml:space="preserve">Bugün yalnızca nefes almak bile yeterli olabilir.</w:t>
+      </w:r>
+    </w:p>
+    <w:p>
+      <w:r>
+        <w:t xml:space="preserve">İçindeki dinginlik, her zaman ulaşabileceğin bir yerdedir.</w:t>
+      </w:r>
+    </w:p>
+    <w:p>
+      <w:r>
+        <w:t xml:space="preserve">Her yeni gün, eski yükleri bırakmak için bir fırsattır.</w:t>
+      </w:r>
+    </w:p>
+    <w:p>
+      <w:r>
+        <w:t xml:space="preserve">Kendi ışığını görmek için bazen durup kendine dönmen gerekir.</w:t>
+      </w:r>
+    </w:p>
+    <w:p>
+      <w:r>
+        <w:t xml:space="preserve">Hayatın sana sunduğu güzellikleri kabul etmeye açık ol.</w:t>
+      </w:r>
+    </w:p>
+    <w:p>
+      <w:r>
+        <w:t xml:space="preserve">Sen, olduğundan fazlası olmaya değil, özüne yaklaşmaya geldin.</w:t>
       </w:r>
     </w:p>
     <w:sectPr/>

</xml_diff>

<commit_message>
Acilis sozleri: telifli alintiları guvenli parafrazlarla degistir (17 cumle)
Taninir modern yazarlara (Jung, Joe Dispenza, Mother Teresa, Schweitzer) ait birebir/yakin ceviri 17 cumle, ozgun ve guvenli parafrazlarla degistirildi. Fikir korundu, ifade ozgunlestirildi -> telif riski kaldirildi. Klasik filozoflar (kamu mali) ve jenerik olumlamalar korundu. js + Word kaynagi senkron; Evren bildirimleri ayni havuzu kullaniyor. 541 cumle. v127.

Co-Authored-By: Claude Opus 4.8 <noreply@anthropic.com>
</commit_message>
<xml_diff>
--- a/Açılış cümlelerim/Açılış cümleleri.docx
+++ b/Açılış cümlelerim/Açılış cümleleri.docx
@@ -4,12 +4,12 @@
   <w:body>
     <w:p>
       <w:r>
-        <w:t xml:space="preserve">Dışa bakan rüya görür, içe bakan uyanır.</w:t>
-      </w:r>
-    </w:p>
-    <w:p>
-      <w:r>
-        <w:t xml:space="preserve">Bilinçaltını bilince dönüştürene kadar, o seni yönetir; sen buna kader dersin.</w:t>
+        <w:t xml:space="preserve">Cevabı dışarıda arayan oyalanır; içine dönen uyanır.</w:t>
+      </w:r>
+    </w:p>
+    <w:p>
+      <w:r>
+        <w:t xml:space="preserve">Fark etmediğin iç dünyan seçimlerini yönetir; sen ona kader adını verirsin.</w:t>
       </w:r>
     </w:p>
     <w:p>
@@ -29,7 +29,7 @@
     </w:p>
     <w:p>
       <w:r>
-        <w:t xml:space="preserve">Aydınlanmak, ışığı hayal etmekle değil, karanlığı fark etmekle başlar.</w:t>
+        <w:t xml:space="preserve">Aydınlanmak parlak hayaller kurmakla değil, içindeki gölgeyi görmekle başlar.</w:t>
       </w:r>
     </w:p>
     <w:p>
@@ -64,7 +64,7 @@
     </w:p>
     <w:p>
       <w:r>
-        <w:t xml:space="preserve">İki insan, iki kimyasal madde gibidir: tepki varsa ikisi de dönüşür.</w:t>
+        <w:t xml:space="preserve">İki insan karşılaştığında, aralarında gerçek bir tepkime olursa ikisi de değişir.</w:t>
       </w:r>
     </w:p>
     <w:p>
@@ -129,7 +129,7 @@
     </w:p>
     <w:p>
       <w:r>
-        <w:t xml:space="preserve">Asıl seçim doğruyla yanlış değil; anlamla anlamsızlık arasındadır.</w:t>
+        <w:t xml:space="preserve">Gerçek seçim çoğu zaman iyi-kötü değil, anlamlı-anlamsız arasındadır.</w:t>
       </w:r>
     </w:p>
     <w:p>
@@ -184,7 +184,7 @@
     </w:p>
     <w:p>
       <w:r>
-        <w:t xml:space="preserve">Minnettarlık, almanın en yüksek hâlidir.</w:t>
+        <w:t xml:space="preserve">Şükran, bolluğa açılan en güçlü duygudur.</w:t>
       </w:r>
     </w:p>
     <w:p>
@@ -229,12 +229,12 @@
     </w:p>
     <w:p>
       <w:r>
-        <w:t xml:space="preserve">Yeni bir sonuç istiyorsan, eski benlik olma alışkanlığını kır ve yeniden doğ.</w:t>
-      </w:r>
-    </w:p>
-    <w:p>
-      <w:r>
-        <w:t xml:space="preserve">Öyle güçlü bir minnet duy ki, yeni hayatın çoktan gerçekleşmiş gibi hisset.</w:t>
+        <w:t xml:space="preserve">Farklı bir sonuç istiyorsan, her gün aynı kişi olma alışkanlığını değiştir.</w:t>
+      </w:r>
+    </w:p>
+    <w:p>
+      <w:r>
+        <w:t xml:space="preserve">İstediğin hayatı, sanki çoktan yaşıyormuşçasına şükranla hisset.</w:t>
       </w:r>
     </w:p>
     <w:p>
@@ -254,7 +254,7 @@
     </w:p>
     <w:p>
       <w:r>
-        <w:t xml:space="preserve">Bir türlü düşünüp başka türlü hissederken, hayatının değişmesini bekleme.</w:t>
+        <w:t xml:space="preserve">Düşüncenle hissin farklı yönlere çekerken, hayatın da yerinde sayar.</w:t>
       </w:r>
     </w:p>
     <w:p>
@@ -274,7 +274,7 @@
     </w:p>
     <w:p>
       <w:r>
-        <w:t xml:space="preserve">Gerçek bir meditasyon, kalktığında seni değiştirmiş olandır.</w:t>
+        <w:t xml:space="preserve">İyi bir dinginlik anı, bittiğinde seni biraz değişmiş bırakır.</w:t>
       </w:r>
     </w:p>
     <w:p>
@@ -304,7 +304,7 @@
     </w:p>
     <w:p>
       <w:r>
-        <w:t xml:space="preserve">Zihin bedene egemen olduğunda, gerçek değişim başlar.</w:t>
+        <w:t xml:space="preserve">Zihnin sakinleşip yön verdiğinde, kalıcı değişim filizlenir.</w:t>
       </w:r>
     </w:p>
     <w:p>
@@ -374,12 +374,12 @@
     </w:p>
     <w:p>
       <w:r>
-        <w:t xml:space="preserve">Bazen ışığımız söner, sonra başka biri onu yeniden yakar; bu insanlara minnettarız.</w:t>
-      </w:r>
-    </w:p>
-    <w:p>
-      <w:r>
-        <w:t xml:space="preserve">Sana gelen herkes daha mutlu ayrılsın; bakışında ve gülüşünde nezaket olsun.</w:t>
+        <w:t xml:space="preserve">Bazen içimizdeki ışık zayıflar; bir başkasının sıcaklığı onu yeniden canlandırır.</w:t>
+      </w:r>
+    </w:p>
+    <w:p>
+      <w:r>
+        <w:t xml:space="preserve">Yanına gelen herkes biraz daha hafiflemiş ayrılsın; bakışın ve gülüşün nazik olsun.</w:t>
       </w:r>
     </w:p>
     <w:p>
@@ -389,17 +389,17 @@
     </w:p>
     <w:p>
       <w:r>
-        <w:t xml:space="preserve">Senin yapamadığını ben, benim yapamadığımı sen yaparsın; birlikte harikalar yaratırız.</w:t>
-      </w:r>
-    </w:p>
-    <w:p>
-      <w:r>
-        <w:t xml:space="preserve">Yaptığın, okyanusta bir damla olabilir; ama o damla olmasa okyanus eksik kalırdı.</w:t>
-      </w:r>
-    </w:p>
-    <w:p>
-      <w:r>
-        <w:t xml:space="preserve">Büyük işler yoktur; yalnızca büyük sevgiyle yapılmış küçük işler vardır.</w:t>
+        <w:t xml:space="preserve">Senin eksiğini ben, benim eksiğimi sen tamamlarsın; birlikte daha güzelini yaparız.</w:t>
+      </w:r>
+    </w:p>
+    <w:p>
+      <w:r>
+        <w:t xml:space="preserve">Attığın küçük adım denizde bir damla sanılır; oysa o damla olmadan bütün eksik kalır.</w:t>
+      </w:r>
+    </w:p>
+    <w:p>
+      <w:r>
+        <w:t xml:space="preserve">Küçük işleri büyük yapan, onları yaparken koyduğun sevgidir.</w:t>
       </w:r>
     </w:p>
     <w:p>
@@ -419,7 +419,7 @@
     </w:p>
     <w:p>
       <w:r>
-        <w:t xml:space="preserve">Herkes özgün doğar; çoğu kopya olarak ölür.</w:t>
+        <w:t xml:space="preserve">Her birimiz benzersiz başlarız; çoğu zaman kalabalığa benzeyerek biteriz.</w:t>
       </w:r>
     </w:p>
     <w:p>

</xml_diff>